<commit_message>
- fixed a mistake: I deleted code of cell 12 of notebook 4. - update the main doc (not access template) with: FULL comparative Analysis and Key Insights. FULL Ethical considerations. FULL discussion. And MOST of conclusion, "Contributions" is left out.
</commit_message>
<xml_diff>
--- a/Main Document Access Template.docx
+++ b/Main Document Access Template.docx
@@ -1,6 +1,6 @@
 
 <file path=word/document.xml><?xml version="1.0" encoding="utf-8"?>
-<w:document xmlns:wpc="http://schemas.microsoft.com/office/word/2010/wordprocessingCanvas" xmlns:cx="http://schemas.microsoft.com/office/drawing/2014/chartex" xmlns:cx1="http://schemas.microsoft.com/office/drawing/2015/9/8/chartex" xmlns:cx2="http://schemas.microsoft.com/office/drawing/2015/10/21/chartex" xmlns:cx3="http://schemas.microsoft.com/office/drawing/2016/5/9/chartex" xmlns:cx4="http://schemas.microsoft.com/office/drawing/2016/5/10/chartex" xmlns:cx5="http://schemas.microsoft.com/office/drawing/2016/5/11/chartex" xmlns:cx6="http://schemas.microsoft.com/office/drawing/2016/5/12/chartex" xmlns:cx7="http://schemas.microsoft.com/office/drawing/2016/5/13/chartex" xmlns:cx8="http://schemas.microsoft.com/office/drawing/2016/5/14/chartex" xmlns:mc="http://schemas.openxmlformats.org/markup-compatibility/2006" xmlns:aink="http://schemas.microsoft.com/office/drawing/2016/ink" xmlns:am3d="http://schemas.microsoft.com/office/drawing/2017/model3d" xmlns:o="urn:schemas-microsoft-com:office:office" xmlns:oel="http://schemas.microsoft.com/office/2019/extlst" xmlns:r="http://schemas.openxmlformats.org/officeDocument/2006/relationships" xmlns:m="http://schemas.openxmlformats.org/officeDocument/2006/math" xmlns:v="urn:schemas-microsoft-com:vml" xmlns:wp14="http://schemas.microsoft.com/office/word/2010/wordprocessingDrawing" xmlns:wp="http://schemas.openxmlformats.org/drawingml/2006/wordprocessingDrawing" xmlns:w10="urn:schemas-microsoft-com:office:word" xmlns:w="http://schemas.openxmlformats.org/wordprocessingml/2006/main" xmlns:w14="http://schemas.microsoft.com/office/word/2010/wordml" xmlns:w15="http://schemas.microsoft.com/office/word/2012/wordml" xmlns:w16cex="http://schemas.microsoft.com/office/word/2018/wordml/cex" xmlns:w16cid="http://schemas.microsoft.com/office/word/2016/wordml/cid" xmlns:w16="http://schemas.microsoft.com/office/word/2018/wordml" xmlns:w16sdtdh="http://schemas.microsoft.com/office/word/2020/wordml/sdtdatahash" xmlns:w16se="http://schemas.microsoft.com/office/word/2015/wordml/symex" xmlns:wpg="http://schemas.microsoft.com/office/word/2010/wordprocessingGroup" xmlns:wpi="http://schemas.microsoft.com/office/word/2010/wordprocessingInk" xmlns:wne="http://schemas.microsoft.com/office/word/2006/wordml" xmlns:wps="http://schemas.microsoft.com/office/word/2010/wordprocessingShape" mc:Ignorable="w14 w15 w16se w16cid w16 w16cex w16sdtdh wp14">
+<w:document xmlns:wpc="http://schemas.microsoft.com/office/word/2010/wordprocessingCanvas" xmlns:cx="http://schemas.microsoft.com/office/drawing/2014/chartex" xmlns:cx1="http://schemas.microsoft.com/office/drawing/2015/9/8/chartex" xmlns:cx2="http://schemas.microsoft.com/office/drawing/2015/10/21/chartex" xmlns:cx3="http://schemas.microsoft.com/office/drawing/2016/5/9/chartex" xmlns:cx4="http://schemas.microsoft.com/office/drawing/2016/5/10/chartex" xmlns:cx5="http://schemas.microsoft.com/office/drawing/2016/5/11/chartex" xmlns:cx6="http://schemas.microsoft.com/office/drawing/2016/5/12/chartex" xmlns:cx7="http://schemas.microsoft.com/office/drawing/2016/5/13/chartex" xmlns:cx8="http://schemas.microsoft.com/office/drawing/2016/5/14/chartex" xmlns:mc="http://schemas.openxmlformats.org/markup-compatibility/2006" xmlns:aink="http://schemas.microsoft.com/office/drawing/2016/ink" xmlns:am3d="http://schemas.microsoft.com/office/drawing/2017/model3d" xmlns:o="urn:schemas-microsoft-com:office:office" xmlns:oel="http://schemas.microsoft.com/office/2019/extlst" xmlns:r="http://schemas.openxmlformats.org/officeDocument/2006/relationships" xmlns:m="http://schemas.openxmlformats.org/officeDocument/2006/math" xmlns:v="urn:schemas-microsoft-com:vml" xmlns:wp14="http://schemas.microsoft.com/office/word/2010/wordprocessingDrawing" xmlns:wp="http://schemas.openxmlformats.org/drawingml/2006/wordprocessingDrawing" xmlns:w10="urn:schemas-microsoft-com:office:word" xmlns:w="http://schemas.openxmlformats.org/wordprocessingml/2006/main" xmlns:w14="http://schemas.microsoft.com/office/word/2010/wordml" xmlns:w15="http://schemas.microsoft.com/office/word/2012/wordml" xmlns:w16cex="http://schemas.microsoft.com/office/word/2018/wordml/cex" xmlns:w16cid="http://schemas.microsoft.com/office/word/2016/wordml/cid" xmlns:w16="http://schemas.microsoft.com/office/word/2018/wordml" xmlns:w16du="http://schemas.microsoft.com/office/word/2023/wordml/word16du" xmlns:w16sdtdh="http://schemas.microsoft.com/office/word/2020/wordml/sdtdatahash" xmlns:w16sdtfl="http://schemas.microsoft.com/office/word/2024/wordml/sdtformatlock" xmlns:w16se="http://schemas.microsoft.com/office/word/2015/wordml/symex" xmlns:wpg="http://schemas.microsoft.com/office/word/2010/wordprocessingGroup" xmlns:wpi="http://schemas.microsoft.com/office/word/2010/wordprocessingInk" xmlns:wne="http://schemas.microsoft.com/office/word/2006/wordml" xmlns:wps="http://schemas.microsoft.com/office/word/2010/wordprocessingShape" mc:Ignorable="w14 w15 w16se w16cid w16 w16cex w16sdtdh w16sdtfl w16du wp14">
   <w:body>
     <w:p>
       <w:pPr>
@@ -216,23 +216,7 @@
           <w:i/>
           <w:iCs/>
         </w:rPr>
-        <w:t>‘2_exploratory_</w:t>
-      </w:r>
-      <w:proofErr w:type="gramStart"/>
-      <w:r>
-        <w:rPr>
-          <w:i/>
-          <w:iCs/>
-        </w:rPr>
-        <w:t>analysis.ipynb</w:t>
-      </w:r>
-      <w:proofErr w:type="gramEnd"/>
-      <w:r>
-        <w:rPr>
-          <w:i/>
-          <w:iCs/>
-        </w:rPr>
-        <w:t>’</w:t>
+        <w:t>‘2_exploratory_analysis.ipynb’</w:t>
       </w:r>
       <w:r>
         <w:t xml:space="preserve"> and subsequently the EDA was conducted using three types of analysis on the </w:t>
@@ -1089,7 +1073,7 @@
           <w:noProof/>
         </w:rPr>
         <w:drawing>
-          <wp:anchor distT="0" distB="0" distL="114300" distR="114300" simplePos="0" relativeHeight="251661312" behindDoc="0" locked="0" layoutInCell="1" allowOverlap="1" wp14:anchorId="399D1E42" wp14:editId="4AC5F388">
+          <wp:anchor distT="0" distB="0" distL="114300" distR="114300" simplePos="0" relativeHeight="251661312" behindDoc="0" locked="0" layoutInCell="1" allowOverlap="1" wp14:anchorId="399D1E42" wp14:editId="543D4AB6">
             <wp:simplePos x="0" y="0"/>
             <wp:positionH relativeFrom="column">
               <wp:posOffset>3317096</wp:posOffset>
@@ -1320,7 +1304,7 @@
           <w:szCs w:val="20"/>
         </w:rPr>
         <w:drawing>
-          <wp:inline distT="0" distB="0" distL="0" distR="0" wp14:anchorId="0E4913B0" wp14:editId="56EFDB89">
+          <wp:inline distT="0" distB="0" distL="0" distR="0" wp14:anchorId="0E4913B0" wp14:editId="43209693">
             <wp:extent cx="3060700" cy="1913255"/>
             <wp:effectExtent l="0" t="0" r="6350" b="0"/>
             <wp:docPr id="15" name="Picture 15" descr="A graph of blue bars&#10;&#10;AI-generated content may be incorrect."/>
@@ -1711,23 +1695,7 @@
                 <w:sz w:val="16"/>
                 <w:szCs w:val="16"/>
               </w:rPr>
-              <w:t>“</w:t>
-            </w:r>
-            <w:proofErr w:type="gramStart"/>
-            <w:r>
-              <w:rPr>
-                <w:sz w:val="16"/>
-                <w:szCs w:val="16"/>
-              </w:rPr>
-              <w:t>is</w:t>
-            </w:r>
-            <w:proofErr w:type="gramEnd"/>
-            <w:r>
-              <w:rPr>
-                <w:sz w:val="16"/>
-                <w:szCs w:val="16"/>
-              </w:rPr>
-              <w:t>_holdiay”</w:t>
+              <w:t>“is_holdiay”</w:t>
             </w:r>
           </w:p>
         </w:tc>
@@ -1808,23 +1776,7 @@
                 <w:sz w:val="16"/>
                 <w:szCs w:val="16"/>
               </w:rPr>
-              <w:t>“</w:t>
-            </w:r>
-            <w:proofErr w:type="gramStart"/>
-            <w:r>
-              <w:rPr>
-                <w:sz w:val="16"/>
-                <w:szCs w:val="16"/>
-              </w:rPr>
-              <w:t>tag</w:t>
-            </w:r>
-            <w:proofErr w:type="gramEnd"/>
-            <w:r>
-              <w:rPr>
-                <w:sz w:val="16"/>
-                <w:szCs w:val="16"/>
-              </w:rPr>
-              <w:t>_National”</w:t>
+              <w:t>“tag_National”</w:t>
             </w:r>
           </w:p>
         </w:tc>
@@ -1905,23 +1857,7 @@
                 <w:sz w:val="16"/>
                 <w:szCs w:val="16"/>
               </w:rPr>
-              <w:t>“</w:t>
-            </w:r>
-            <w:proofErr w:type="gramStart"/>
-            <w:r>
-              <w:rPr>
-                <w:sz w:val="16"/>
-                <w:szCs w:val="16"/>
-              </w:rPr>
-              <w:t>tag</w:t>
-            </w:r>
-            <w:proofErr w:type="gramEnd"/>
-            <w:r>
-              <w:rPr>
-                <w:sz w:val="16"/>
-                <w:szCs w:val="16"/>
-              </w:rPr>
-              <w:t>_Traffic”</w:t>
+              <w:t>“tag_Traffic”</w:t>
             </w:r>
           </w:p>
         </w:tc>
@@ -2002,23 +1938,7 @@
                 <w:sz w:val="16"/>
                 <w:szCs w:val="16"/>
               </w:rPr>
-              <w:t>“</w:t>
-            </w:r>
-            <w:proofErr w:type="gramStart"/>
-            <w:r>
-              <w:rPr>
-                <w:sz w:val="16"/>
-                <w:szCs w:val="16"/>
-              </w:rPr>
-              <w:t>tag</w:t>
-            </w:r>
-            <w:proofErr w:type="gramEnd"/>
-            <w:r>
-              <w:rPr>
-                <w:sz w:val="16"/>
-                <w:szCs w:val="16"/>
-              </w:rPr>
-              <w:t>_Accident”</w:t>
+              <w:t>“tag_Accident”</w:t>
             </w:r>
           </w:p>
         </w:tc>
@@ -2099,23 +2019,7 @@
                 <w:sz w:val="16"/>
                 <w:szCs w:val="16"/>
               </w:rPr>
-              <w:t>“</w:t>
-            </w:r>
-            <w:proofErr w:type="gramStart"/>
-            <w:r>
-              <w:rPr>
-                <w:sz w:val="16"/>
-                <w:szCs w:val="16"/>
-              </w:rPr>
-              <w:t>tag</w:t>
-            </w:r>
-            <w:proofErr w:type="gramEnd"/>
-            <w:r>
-              <w:rPr>
-                <w:sz w:val="16"/>
-                <w:szCs w:val="16"/>
-              </w:rPr>
-              <w:t>_Police”</w:t>
+              <w:t>“tag_Police”</w:t>
             </w:r>
           </w:p>
         </w:tc>
@@ -2196,23 +2100,7 @@
                 <w:sz w:val="16"/>
                 <w:szCs w:val="16"/>
               </w:rPr>
-              <w:t>“</w:t>
-            </w:r>
-            <w:proofErr w:type="gramStart"/>
-            <w:r>
-              <w:rPr>
-                <w:sz w:val="16"/>
-                <w:szCs w:val="16"/>
-              </w:rPr>
-              <w:t>tag</w:t>
-            </w:r>
-            <w:proofErr w:type="gramEnd"/>
-            <w:r>
-              <w:rPr>
-                <w:sz w:val="16"/>
-                <w:szCs w:val="16"/>
-              </w:rPr>
-              <w:t>_Transport”</w:t>
+              <w:t>“tag_Transport”</w:t>
             </w:r>
           </w:p>
         </w:tc>
@@ -2984,10 +2872,7 @@
       </w:pPr>
       <w:r>
         <w:lastRenderedPageBreak/>
-        <w:t>Binary Features</w:t>
-      </w:r>
-      <w:r>
-        <w:t xml:space="preserve"> vs Content</w:t>
+        <w:t>Binary Features vs Content</w:t>
       </w:r>
     </w:p>
     <w:p>
@@ -3223,10 +3108,7 @@
         </w:numPr>
       </w:pPr>
       <w:r>
-        <w:t>Continuous Features</w:t>
-      </w:r>
-      <w:r>
-        <w:t xml:space="preserve"> vs Content</w:t>
+        <w:t>Continuous Features vs Content</w:t>
       </w:r>
     </w:p>
     <w:p>
@@ -3384,35 +3266,7 @@
           <w:sz w:val="20"/>
           <w:szCs w:val="20"/>
         </w:rPr>
-        <w:t>3. “</w:t>
-      </w:r>
-      <w:proofErr w:type="spellStart"/>
-      <w:r>
-        <w:rPr>
-          <w:rFonts w:ascii="Times New Roman" w:hAnsi="Times New Roman" w:cs="Times New Roman"/>
-          <w:b w:val="0"/>
-          <w:bCs/>
-          <w:i w:val="0"/>
-          <w:iCs/>
-          <w:color w:val="000000" w:themeColor="text1"/>
-          <w:sz w:val="20"/>
-          <w:szCs w:val="20"/>
-        </w:rPr>
-        <w:t>wind_speed_max</w:t>
-      </w:r>
-      <w:proofErr w:type="spellEnd"/>
-      <w:r>
-        <w:rPr>
-          <w:rFonts w:ascii="Times New Roman" w:hAnsi="Times New Roman" w:cs="Times New Roman"/>
-          <w:b w:val="0"/>
-          <w:bCs/>
-          <w:i w:val="0"/>
-          <w:iCs/>
-          <w:color w:val="000000" w:themeColor="text1"/>
-          <w:sz w:val="20"/>
-          <w:szCs w:val="20"/>
-        </w:rPr>
-        <w:t>” did not result in any strong correlations with any relevant keywords that could be used to determine the target variable.</w:t>
+        <w:t>3. “wind_speed_max” did not result in any strong correlations with any relevant keywords that could be used to determine the target variable.</w:t>
       </w:r>
     </w:p>
     <w:p>
@@ -3524,6 +3378,7 @@
           <w:bCs/>
           <w:i w:val="0"/>
           <w:iCs/>
+          <w:noProof/>
           <w:color w:val="000000" w:themeColor="text1"/>
           <w:sz w:val="20"/>
           <w:szCs w:val="20"/>
@@ -3587,6 +3442,9 @@
         </w:numPr>
       </w:pPr>
       <w:r>
+        <w:rPr>
+          <w:noProof/>
+        </w:rPr>
         <w:drawing>
           <wp:inline distT="0" distB="0" distL="0" distR="0" wp14:anchorId="07B74A00" wp14:editId="10F2B200">
             <wp:extent cx="3060700" cy="2355215"/>
@@ -3634,10 +3492,7 @@
         <w:ind w:left="0"/>
       </w:pPr>
       <w:r>
-        <w:t xml:space="preserve">Correlation matrix </w:t>
-      </w:r>
-      <w:r>
-        <w:t>that highlights the day of week and month each article was published.</w:t>
+        <w:t>Correlation matrix that highlights the day of week and month each article was published.</w:t>
       </w:r>
     </w:p>
     <w:p>
@@ -3649,10 +3504,7 @@
         </w:numPr>
       </w:pPr>
       <w:r>
-        <w:t>Multivariate</w:t>
-      </w:r>
-      <w:r>
-        <w:t xml:space="preserve"> Analysis</w:t>
+        <w:t>Multivariate Analysis</w:t>
       </w:r>
     </w:p>
     <w:p>
@@ -3690,7 +3542,6 @@
           <w:sz w:val="20"/>
           <w:szCs w:val="20"/>
         </w:rPr>
-        <w:lastRenderedPageBreak/>
         <w:t>Multivariate analysis was achieved by conducting a Principal Component Analysis (PCA) as can be seen in (Fig 9). PCA will take the word-level correlation features and compress them into a 2D figure. It simplifies the complex</w:t>
       </w:r>
       <w:r>
@@ -4160,29 +4011,7 @@
           <w:sz w:val="20"/>
           <w:szCs w:val="20"/>
         </w:rPr>
-        <w:t xml:space="preserve">, indicating a subset of articles that emphasize contributing factors related to substance use or legal consequences. On the left-hand side, the projection contains words associated with routine descriptive details, including vehicle brands (for example, Toyota and Yamaha), locations (such as regional road and Attard), and demographic references (for example, 25 year), which are commonly present across many reports. In contrast, the dense concentration of points near the </w:t>
-      </w:r>
-      <w:r>
-        <w:rPr>
-          <w:rFonts w:ascii="Times New Roman" w:hAnsi="Times New Roman" w:cs="Times New Roman"/>
-          <w:b w:val="0"/>
-          <w:bCs w:val="0"/>
-          <w:color w:val="000000" w:themeColor="text1"/>
-          <w:sz w:val="20"/>
-          <w:szCs w:val="20"/>
-        </w:rPr>
-        <w:t>centre</w:t>
-      </w:r>
-      <w:r>
-        <w:rPr>
-          <w:rFonts w:ascii="Times New Roman" w:hAnsi="Times New Roman" w:cs="Times New Roman"/>
-          <w:b w:val="0"/>
-          <w:bCs w:val="0"/>
-          <w:color w:val="000000" w:themeColor="text1"/>
-          <w:sz w:val="20"/>
-          <w:szCs w:val="20"/>
-        </w:rPr>
-        <w:t xml:space="preserve"> represents generic reporting vocabulary that appears frequently across articles but does not strongly characterize any specific thematic category.</w:t>
+        <w:t>, indicating a subset of articles that emphasize contributing factors related to substance use or legal consequences. On the left-hand side, the projection contains words associated with routine descriptive details, including vehicle brands (for example, Toyota and Yamaha), locations (such as regional road and Attard), and demographic references (for example, 25 year), which are commonly present across many reports. In contrast, the dense concentration of points near the centre represents generic reporting vocabulary that appears frequently across articles but does not strongly characterize any specific thematic category.</w:t>
       </w:r>
     </w:p>
     <w:p>
@@ -4194,6 +4023,9 @@
         </w:numPr>
       </w:pPr>
       <w:r>
+        <w:rPr>
+          <w:noProof/>
+        </w:rPr>
         <w:drawing>
           <wp:inline distT="0" distB="0" distL="0" distR="0" wp14:anchorId="47D1D3DE" wp14:editId="22F49191">
             <wp:extent cx="3060700" cy="2408555"/>
@@ -4323,7 +4155,7 @@
           <w:sz w:val="20"/>
           <w:szCs w:val="20"/>
         </w:rPr>
-        <w:t xml:space="preserve"> is derived directly from the textual accident descriptions contained within the dataset and serves as the dependent variable for subsequent </w:t>
+        <w:t xml:space="preserve"> is derived directly from the textual accident descriptions contained within the dataset and serves as the dependent variable for subsequent modelling tasks. </w:t>
       </w:r>
       <w:r>
         <w:rPr>
@@ -4336,33 +4168,7 @@
           <w:sz w:val="20"/>
           <w:szCs w:val="20"/>
         </w:rPr>
-        <w:t>modelling</w:t>
-      </w:r>
-      <w:r>
-        <w:rPr>
-          <w:rFonts w:ascii="Times New Roman" w:hAnsi="Times New Roman" w:cs="Times New Roman"/>
-          <w:b w:val="0"/>
-          <w:bCs/>
-          <w:i w:val="0"/>
-          <w:iCs/>
-          <w:color w:val="000000" w:themeColor="text1"/>
-          <w:sz w:val="20"/>
-          <w:szCs w:val="20"/>
-        </w:rPr>
-        <w:t xml:space="preserve"> tasks. The motivation behind this approach is to transform </w:t>
-      </w:r>
-      <w:r>
-        <w:rPr>
-          <w:rFonts w:ascii="Times New Roman" w:hAnsi="Times New Roman" w:cs="Times New Roman"/>
-          <w:b w:val="0"/>
-          <w:bCs/>
-          <w:i w:val="0"/>
-          <w:iCs/>
-          <w:color w:val="000000" w:themeColor="text1"/>
-          <w:sz w:val="20"/>
-          <w:szCs w:val="20"/>
-        </w:rPr>
-        <w:t>unstructured textual data into a structured, ordinal representation of accident severity.</w:t>
+        <w:t>The motivation behind this approach is to transform unstructured textual data into a structured, ordinal representation of accident severity.</w:t>
       </w:r>
     </w:p>
     <w:p>
@@ -4421,33 +4227,7 @@
           <w:sz w:val="20"/>
           <w:szCs w:val="20"/>
         </w:rPr>
-        <w:t xml:space="preserve">Once the lemmatized word roots were obtained, accident severity was quantified using a rule-based </w:t>
-      </w:r>
-      <w:r>
-        <w:rPr>
-          <w:rFonts w:ascii="Times New Roman" w:hAnsi="Times New Roman" w:cs="Times New Roman"/>
-          <w:b w:val="0"/>
-          <w:bCs/>
-          <w:i w:val="0"/>
-          <w:iCs/>
-          <w:color w:val="000000" w:themeColor="text1"/>
-          <w:sz w:val="20"/>
-          <w:szCs w:val="20"/>
-        </w:rPr>
-        <w:t>labelling</w:t>
-      </w:r>
-      <w:r>
-        <w:rPr>
-          <w:rFonts w:ascii="Times New Roman" w:hAnsi="Times New Roman" w:cs="Times New Roman"/>
-          <w:b w:val="0"/>
-          <w:bCs/>
-          <w:i w:val="0"/>
-          <w:iCs/>
-          <w:color w:val="000000" w:themeColor="text1"/>
-          <w:sz w:val="20"/>
-          <w:szCs w:val="20"/>
-        </w:rPr>
-        <w:t xml:space="preserve"> function. This function assigns an ordinal severity score based on the presence of specific keywords associated with increasing levels of harm. The severity scale ranges from 0 (no relevant accident-related terms detected) to 4 (fatal accidents).</w:t>
+        <w:t>Once the lemmatized word roots were obtained, accident severity was quantified using a rule-based labelling function. This function assigns an ordinal severity score based on the presence of specific keywords associated with increasing levels of harm. The severity scale ranges from 0 (no relevant accident-related terms detected) to 4 (fatal accidents).</w:t>
       </w:r>
       <w:r>
         <w:rPr>
@@ -4489,18 +4269,7 @@
           <w:sz w:val="20"/>
           <w:szCs w:val="20"/>
         </w:rPr>
-        <w:t xml:space="preserve">Assign </w:t>
-      </w:r>
-      <w:r>
-        <w:rPr>
-          <w:rFonts w:ascii="Times New Roman" w:hAnsi="Times New Roman" w:cs="Times New Roman"/>
-          <w:b w:val="0"/>
-          <w:i w:val="0"/>
-          <w:color w:val="000000" w:themeColor="text1"/>
-          <w:sz w:val="20"/>
-          <w:szCs w:val="20"/>
-        </w:rPr>
-        <w:t>4 (Fatal)</w:t>
+        <w:t>Assign 4 (Fatal)</w:t>
       </w:r>
       <w:r>
         <w:rPr>
@@ -4868,6 +4637,7 @@
           <w:rFonts w:ascii="Times New Roman" w:hAnsi="Times New Roman" w:cs="Times New Roman"/>
           <w:b w:val="0"/>
           <w:i w:val="0"/>
+          <w:noProof/>
           <w:color w:val="000000" w:themeColor="text1"/>
           <w:sz w:val="20"/>
           <w:szCs w:val="20"/>
@@ -4931,6 +4701,7 @@
         </w:numPr>
       </w:pPr>
       <w:r>
+        <w:lastRenderedPageBreak/>
         <w:t>Linear Regression</w:t>
       </w:r>
     </w:p>
@@ -4964,7 +4735,6 @@
           <w:sz w:val="20"/>
           <w:szCs w:val="20"/>
         </w:rPr>
-        <w:lastRenderedPageBreak/>
         <w:t>L</w:t>
       </w:r>
       <w:r>
@@ -5105,6 +4875,9 @@
       </w:r>
       <m:oMath>
         <m:r>
+          <m:rPr>
+            <m:sty m:val="bi"/>
+          </m:rPr>
           <w:rPr>
             <w:rFonts w:ascii="Cambria Math" w:hAnsi="Cambria Math" w:cs="Times New Roman"/>
             <w:color w:val="000000" w:themeColor="text1"/>
@@ -5129,6 +4902,9 @@
           </m:dPr>
           <m:e>
             <m:r>
+              <m:rPr>
+                <m:sty m:val="bi"/>
+              </m:rPr>
               <w:rPr>
                 <w:rFonts w:ascii="Cambria Math" w:hAnsi="Cambria Math" w:cs="Times New Roman"/>
                 <w:color w:val="000000" w:themeColor="text1"/>
@@ -5140,6 +4916,9 @@
           </m:e>
         </m:d>
         <m:r>
+          <m:rPr>
+            <m:sty m:val="bi"/>
+          </m:rPr>
           <w:rPr>
             <w:rFonts w:ascii="Cambria Math" w:hAnsi="Cambria Math" w:cs="Times New Roman"/>
             <w:color w:val="000000" w:themeColor="text1"/>
@@ -5164,6 +4943,9 @@
           </m:sSupPr>
           <m:e>
             <m:r>
+              <m:rPr>
+                <m:sty m:val="bi"/>
+              </m:rPr>
               <w:rPr>
                 <w:rFonts w:ascii="Cambria Math" w:hAnsi="Cambria Math" w:cs="Times New Roman"/>
                 <w:color w:val="000000" w:themeColor="text1"/>
@@ -5175,6 +4957,9 @@
           </m:e>
           <m:sup>
             <m:r>
+              <m:rPr>
+                <m:sty m:val="bi"/>
+              </m:rPr>
               <w:rPr>
                 <w:rFonts w:ascii="Cambria Math" w:hAnsi="Cambria Math" w:cs="Times New Roman"/>
                 <w:color w:val="000000" w:themeColor="text1"/>
@@ -5186,6 +4971,9 @@
           </m:sup>
         </m:sSup>
         <m:r>
+          <m:rPr>
+            <m:sty m:val="bi"/>
+          </m:rPr>
           <w:rPr>
             <w:rFonts w:ascii="Cambria Math" w:hAnsi="Cambria Math" w:cs="Times New Roman"/>
             <w:color w:val="000000" w:themeColor="text1"/>
@@ -5315,6 +5103,9 @@
       </w:pPr>
       <m:oMath>
         <m:r>
+          <m:rPr>
+            <m:sty m:val="bi"/>
+          </m:rPr>
           <w:rPr>
             <w:rFonts w:ascii="Cambria Math" w:hAnsi="Cambria Math" w:cs="Times New Roman"/>
             <w:color w:val="000000" w:themeColor="text1"/>
@@ -5378,6 +5169,9 @@
       </w:r>
       <m:oMath>
         <m:r>
+          <m:rPr>
+            <m:sty m:val="bi"/>
+          </m:rPr>
           <w:rPr>
             <w:rFonts w:ascii="Cambria Math" w:hAnsi="Cambria Math" w:cs="Times New Roman"/>
             <w:color w:val="000000" w:themeColor="text1"/>
@@ -5415,6 +5209,9 @@
       </w:r>
       <m:oMath>
         <m:r>
+          <m:rPr>
+            <m:sty m:val="bi"/>
+          </m:rPr>
           <w:rPr>
             <w:rFonts w:ascii="Cambria Math" w:hAnsi="Cambria Math" w:cs="Times New Roman"/>
             <w:color w:val="000000" w:themeColor="text1"/>
@@ -5754,29 +5551,7 @@
           <w:sz w:val="20"/>
           <w:szCs w:val="20"/>
         </w:rPr>
-        <w:t xml:space="preserve"> where removed due to the left-skew nature of the </w:t>
-      </w:r>
-      <w:r>
-        <w:rPr>
-          <w:rFonts w:ascii="Times New Roman" w:hAnsi="Times New Roman" w:cs="Times New Roman"/>
-          <w:b w:val="0"/>
-          <w:i w:val="0"/>
-          <w:color w:val="000000" w:themeColor="text1"/>
-          <w:sz w:val="20"/>
-          <w:szCs w:val="20"/>
-        </w:rPr>
-        <w:t>features</w:t>
-      </w:r>
-      <w:r>
-        <w:rPr>
-          <w:rFonts w:ascii="Times New Roman" w:hAnsi="Times New Roman" w:cs="Times New Roman"/>
-          <w:b w:val="0"/>
-          <w:i w:val="0"/>
-          <w:color w:val="000000" w:themeColor="text1"/>
-          <w:sz w:val="20"/>
-          <w:szCs w:val="20"/>
-        </w:rPr>
-        <w:t>,</w:t>
+        <w:t xml:space="preserve"> where removed due to the left-skew nature of the features,</w:t>
       </w:r>
       <w:r>
         <w:rPr>
@@ -5843,7 +5618,7 @@
           <w:sz w:val="20"/>
           <w:szCs w:val="20"/>
         </w:rPr>
-        <w:t xml:space="preserve">Multiple Linear Regression (MLR) is a statistical </w:t>
+        <w:t xml:space="preserve">Multiple Linear Regression (MLR) is a statistical modelling technique that quantifies the linear relationship between a single continuous dependent variable and two or more independent (predictor) variables. It extends the simple </w:t>
       </w:r>
       <w:r>
         <w:rPr>
@@ -5856,20 +5631,7 @@
           <w:sz w:val="20"/>
           <w:szCs w:val="20"/>
         </w:rPr>
-        <w:t>modelling</w:t>
-      </w:r>
-      <w:r>
-        <w:rPr>
-          <w:rFonts w:ascii="Times New Roman" w:hAnsi="Times New Roman" w:cs="Times New Roman"/>
-          <w:b w:val="0"/>
-          <w:bCs/>
-          <w:i w:val="0"/>
-          <w:iCs/>
-          <w:color w:val="000000" w:themeColor="text1"/>
-          <w:sz w:val="20"/>
-          <w:szCs w:val="20"/>
-        </w:rPr>
-        <w:t xml:space="preserve"> technique that quantifies the linear relationship between a single continuous dependent variable and two or more independent (predictor) variables. It extends the simple linear regression framework to accommodate multiple predictors by estimating a linear function of the form</w:t>
+        <w:t>linear regression framework to accommodate multiple predictors by estimating a linear function of the form</w:t>
       </w:r>
       <w:r>
         <w:rPr>
@@ -5968,6 +5730,9 @@
       </w:pPr>
       <m:oMath>
         <m:r>
+          <m:rPr>
+            <m:sty m:val="bi"/>
+          </m:rPr>
           <w:rPr>
             <w:rFonts w:ascii="Cambria Math" w:hAnsi="Cambria Math" w:cs="Times New Roman"/>
             <w:color w:val="000000" w:themeColor="text1"/>
@@ -5992,6 +5757,9 @@
           </m:sSubPr>
           <m:e>
             <m:r>
+              <m:rPr>
+                <m:sty m:val="bi"/>
+              </m:rPr>
               <w:rPr>
                 <w:rFonts w:ascii="Cambria Math" w:hAnsi="Cambria Math" w:cs="Times New Roman"/>
                 <w:color w:val="000000" w:themeColor="text1"/>
@@ -6003,6 +5771,9 @@
           </m:e>
           <m:sub>
             <m:r>
+              <m:rPr>
+                <m:sty m:val="bi"/>
+              </m:rPr>
               <w:rPr>
                 <w:rFonts w:ascii="Cambria Math" w:hAnsi="Cambria Math" w:cs="Times New Roman"/>
                 <w:color w:val="000000" w:themeColor="text1"/>
@@ -6014,6 +5785,9 @@
           </m:sub>
         </m:sSub>
         <m:r>
+          <m:rPr>
+            <m:sty m:val="bi"/>
+          </m:rPr>
           <w:rPr>
             <w:rFonts w:ascii="Cambria Math" w:hAnsi="Cambria Math" w:cs="Times New Roman"/>
             <w:color w:val="000000" w:themeColor="text1"/>
@@ -6038,6 +5812,9 @@
           </m:sSubPr>
           <m:e>
             <m:r>
+              <m:rPr>
+                <m:sty m:val="bi"/>
+              </m:rPr>
               <w:rPr>
                 <w:rFonts w:ascii="Cambria Math" w:hAnsi="Cambria Math" w:cs="Times New Roman"/>
                 <w:color w:val="000000" w:themeColor="text1"/>
@@ -6049,6 +5826,9 @@
           </m:e>
           <m:sub>
             <m:r>
+              <m:rPr>
+                <m:sty m:val="bi"/>
+              </m:rPr>
               <w:rPr>
                 <w:rFonts w:ascii="Cambria Math" w:hAnsi="Cambria Math" w:cs="Times New Roman"/>
                 <w:color w:val="000000" w:themeColor="text1"/>
@@ -6073,6 +5853,9 @@
               </m:sSubPr>
               <m:e>
                 <m:r>
+                  <m:rPr>
+                    <m:sty m:val="bi"/>
+                  </m:rPr>
                   <w:rPr>
                     <w:rFonts w:ascii="Cambria Math" w:hAnsi="Cambria Math" w:cs="Times New Roman"/>
                     <w:color w:val="000000" w:themeColor="text1"/>
@@ -6084,6 +5867,9 @@
               </m:e>
               <m:sub>
                 <m:r>
+                  <m:rPr>
+                    <m:sty m:val="bi"/>
+                  </m:rPr>
                   <w:rPr>
                     <w:rFonts w:ascii="Cambria Math" w:hAnsi="Cambria Math" w:cs="Times New Roman"/>
                     <w:color w:val="000000" w:themeColor="text1"/>
@@ -6097,6 +5883,9 @@
           </m:sub>
         </m:sSub>
         <m:r>
+          <m:rPr>
+            <m:sty m:val="bi"/>
+          </m:rPr>
           <w:rPr>
             <w:rFonts w:ascii="Cambria Math" w:hAnsi="Cambria Math" w:cs="Times New Roman"/>
             <w:color w:val="000000" w:themeColor="text1"/>
@@ -6121,6 +5910,9 @@
           </m:sSubPr>
           <m:e>
             <m:r>
+              <m:rPr>
+                <m:sty m:val="bi"/>
+              </m:rPr>
               <w:rPr>
                 <w:rFonts w:ascii="Cambria Math" w:hAnsi="Cambria Math" w:cs="Times New Roman"/>
                 <w:color w:val="000000" w:themeColor="text1"/>
@@ -6132,6 +5924,9 @@
           </m:e>
           <m:sub>
             <m:r>
+              <m:rPr>
+                <m:sty m:val="bi"/>
+              </m:rPr>
               <w:rPr>
                 <w:rFonts w:ascii="Cambria Math" w:hAnsi="Cambria Math" w:cs="Times New Roman"/>
                 <w:color w:val="000000" w:themeColor="text1"/>
@@ -6158,6 +5953,9 @@
           </m:sSubPr>
           <m:e>
             <m:r>
+              <m:rPr>
+                <m:sty m:val="bi"/>
+              </m:rPr>
               <w:rPr>
                 <w:rFonts w:ascii="Cambria Math" w:hAnsi="Cambria Math" w:cs="Times New Roman"/>
                 <w:color w:val="000000" w:themeColor="text1"/>
@@ -6169,6 +5967,9 @@
           </m:e>
           <m:sub>
             <m:r>
+              <m:rPr>
+                <m:sty m:val="bi"/>
+              </m:rPr>
               <w:rPr>
                 <w:rFonts w:ascii="Cambria Math" w:hAnsi="Cambria Math" w:cs="Times New Roman"/>
                 <w:color w:val="000000" w:themeColor="text1"/>
@@ -6180,6 +5981,9 @@
           </m:sub>
         </m:sSub>
         <m:r>
+          <m:rPr>
+            <m:sty m:val="bi"/>
+          </m:rPr>
           <w:rPr>
             <w:rFonts w:ascii="Cambria Math" w:hAnsi="Cambria Math" w:cs="Times New Roman"/>
             <w:color w:val="000000" w:themeColor="text1"/>
@@ -6189,6 +5993,9 @@
           <m:t>+</m:t>
         </m:r>
         <m:r>
+          <m:rPr>
+            <m:sty m:val="bi"/>
+          </m:rPr>
           <w:rPr>
             <w:rFonts w:ascii="Cambria Math" w:hAnsi="Cambria Math" w:cs="Cambria Math"/>
             <w:color w:val="000000" w:themeColor="text1"/>
@@ -6198,6 +6005,9 @@
           <m:t>⋯</m:t>
         </m:r>
         <m:r>
+          <m:rPr>
+            <m:sty m:val="bi"/>
+          </m:rPr>
           <w:rPr>
             <w:rFonts w:ascii="Cambria Math" w:hAnsi="Cambria Math" w:cs="Times New Roman"/>
             <w:color w:val="000000" w:themeColor="text1"/>
@@ -6222,6 +6032,9 @@
           </m:sSubPr>
           <m:e>
             <m:r>
+              <m:rPr>
+                <m:sty m:val="bi"/>
+              </m:rPr>
               <w:rPr>
                 <w:rFonts w:ascii="Cambria Math" w:hAnsi="Cambria Math" w:cs="Times New Roman"/>
                 <w:color w:val="000000" w:themeColor="text1"/>
@@ -6242,6 +6055,9 @@
           </m:e>
           <m:sub>
             <m:r>
+              <m:rPr>
+                <m:sty m:val="bi"/>
+              </m:rPr>
               <w:rPr>
                 <w:rFonts w:ascii="Cambria Math" w:hAnsi="Cambria Math" w:cs="Times New Roman"/>
                 <w:color w:val="000000" w:themeColor="text1"/>
@@ -6268,6 +6084,9 @@
           </m:sSubPr>
           <m:e>
             <m:r>
+              <m:rPr>
+                <m:sty m:val="bi"/>
+              </m:rPr>
               <w:rPr>
                 <w:rFonts w:ascii="Cambria Math" w:hAnsi="Cambria Math" w:cs="Times New Roman"/>
                 <w:color w:val="000000" w:themeColor="text1"/>
@@ -6279,6 +6098,9 @@
           </m:e>
           <m:sub>
             <m:r>
+              <m:rPr>
+                <m:sty m:val="bi"/>
+              </m:rPr>
               <w:rPr>
                 <w:rFonts w:ascii="Cambria Math" w:hAnsi="Cambria Math" w:cs="Times New Roman"/>
                 <w:color w:val="000000" w:themeColor="text1"/>
@@ -6290,6 +6112,9 @@
           </m:sub>
         </m:sSub>
         <m:r>
+          <m:rPr>
+            <m:sty m:val="bi"/>
+          </m:rPr>
           <w:rPr>
             <w:rFonts w:ascii="Cambria Math" w:hAnsi="Cambria Math" w:cs="Times New Roman"/>
             <w:color w:val="000000" w:themeColor="text1"/>
@@ -6346,6 +6171,9 @@
       </w:r>
       <m:oMath>
         <m:r>
+          <m:rPr>
+            <m:sty m:val="bi"/>
+          </m:rPr>
           <w:rPr>
             <w:rFonts w:ascii="Cambria Math" w:hAnsi="Cambria Math" w:cs="Times New Roman"/>
             <w:color w:val="000000" w:themeColor="text1"/>
@@ -6409,6 +6237,9 @@
       </w:r>
       <m:oMath>
         <m:r>
+          <m:rPr>
+            <m:sty m:val="bi"/>
+          </m:rPr>
           <w:rPr>
             <w:rFonts w:ascii="Cambria Math" w:hAnsi="Cambria Math" w:cs="Times New Roman"/>
             <w:color w:val="000000" w:themeColor="text1"/>
@@ -6433,6 +6264,9 @@
           </m:sSubPr>
           <m:e>
             <m:r>
+              <m:rPr>
+                <m:sty m:val="bi"/>
+              </m:rPr>
               <w:rPr>
                 <w:rFonts w:ascii="Cambria Math" w:hAnsi="Cambria Math" w:cs="Times New Roman"/>
                 <w:color w:val="000000" w:themeColor="text1"/>
@@ -6444,6 +6278,9 @@
           </m:e>
           <m:sub>
             <m:r>
+              <m:rPr>
+                <m:sty m:val="bi"/>
+              </m:rPr>
               <w:rPr>
                 <w:rFonts w:ascii="Cambria Math" w:hAnsi="Cambria Math" w:cs="Times New Roman"/>
                 <w:color w:val="000000" w:themeColor="text1"/>
@@ -6470,6 +6307,9 @@
       </w:r>
       <m:oMath>
         <m:r>
+          <m:rPr>
+            <m:sty m:val="bi"/>
+          </m:rPr>
           <w:rPr>
             <w:rFonts w:ascii="Cambria Math" w:hAnsi="Cambria Math" w:cs="Times New Roman"/>
             <w:color w:val="000000" w:themeColor="text1"/>
@@ -6507,6 +6347,9 @@
       </w:r>
       <m:oMath>
         <m:r>
+          <m:rPr>
+            <m:sty m:val="bi"/>
+          </m:rPr>
           <w:rPr>
             <w:rFonts w:ascii="Cambria Math" w:hAnsi="Cambria Math" w:cs="Times New Roman"/>
             <w:color w:val="000000" w:themeColor="text1"/>
@@ -6700,6 +6543,9 @@
       </w:r>
       <m:oMath>
         <m:r>
+          <m:rPr>
+            <m:sty m:val="bi"/>
+          </m:rPr>
           <w:rPr>
             <w:rFonts w:ascii="Cambria Math" w:hAnsi="Cambria Math" w:cs="Times New Roman"/>
             <w:color w:val="000000" w:themeColor="text1"/>
@@ -6822,6 +6668,9 @@
       <m:oMathPara>
         <m:oMath>
           <m:r>
+            <m:rPr>
+              <m:sty m:val="bi"/>
+            </m:rPr>
             <w:rPr>
               <w:rFonts w:ascii="Cambria Math" w:hAnsi="Cambria Math" w:cs="Times New Roman"/>
               <w:color w:val="000000" w:themeColor="text1"/>
@@ -6845,6 +6694,9 @@
             </m:sSubPr>
             <m:e>
               <m:r>
+                <m:rPr>
+                  <m:sty m:val="bi"/>
+                </m:rPr>
                 <w:rPr>
                   <w:rFonts w:ascii="Cambria Math" w:hAnsi="Cambria Math" w:cs="Times New Roman"/>
                   <w:color w:val="000000" w:themeColor="text1"/>
@@ -6856,6 +6708,9 @@
             </m:e>
             <m:sub>
               <m:r>
+                <m:rPr>
+                  <m:sty m:val="bi"/>
+                </m:rPr>
                 <w:rPr>
                   <w:rFonts w:ascii="Cambria Math" w:hAnsi="Cambria Math" w:cs="Times New Roman"/>
                   <w:color w:val="000000" w:themeColor="text1"/>
@@ -6897,6 +6752,9 @@
                 </m:naryPr>
                 <m:sub>
                   <m:r>
+                    <m:rPr>
+                      <m:sty m:val="bi"/>
+                    </m:rPr>
                     <w:rPr>
                       <w:rFonts w:ascii="Cambria Math" w:hAnsi="Cambria Math" w:cs="Times New Roman"/>
                       <w:color w:val="000000" w:themeColor="text1"/>
@@ -6908,6 +6766,9 @@
                 </m:sub>
                 <m:sup>
                   <m:r>
+                    <m:rPr>
+                      <m:sty m:val="bi"/>
+                    </m:rPr>
                     <w:rPr>
                       <w:rFonts w:ascii="Cambria Math" w:hAnsi="Cambria Math" w:cs="Times New Roman"/>
                       <w:color w:val="000000" w:themeColor="text1"/>
@@ -6961,6 +6822,9 @@
                             </m:sSubPr>
                             <m:e>
                               <m:r>
+                                <m:rPr>
+                                  <m:sty m:val="bi"/>
+                                </m:rPr>
                                 <w:rPr>
                                   <w:rFonts w:ascii="Cambria Math" w:hAnsi="Cambria Math" w:cs="Times New Roman"/>
                                   <w:color w:val="000000" w:themeColor="text1"/>
@@ -6972,6 +6836,9 @@
                             </m:e>
                             <m:sub>
                               <m:r>
+                                <m:rPr>
+                                  <m:sty m:val="bi"/>
+                                </m:rPr>
                                 <w:rPr>
                                   <w:rFonts w:ascii="Cambria Math" w:hAnsi="Cambria Math" w:cs="Times New Roman"/>
                                   <w:color w:val="000000" w:themeColor="text1"/>
@@ -6983,6 +6850,9 @@
                             </m:sub>
                           </m:sSub>
                           <m:r>
+                            <m:rPr>
+                              <m:sty m:val="bi"/>
+                            </m:rPr>
                             <w:rPr>
                               <w:rFonts w:ascii="Cambria Math" w:hAnsi="Cambria Math" w:cs="Times New Roman"/>
                               <w:color w:val="000000" w:themeColor="text1"/>
@@ -7006,6 +6876,9 @@
                             </m:sSubSupPr>
                             <m:e>
                               <m:r>
+                                <m:rPr>
+                                  <m:sty m:val="bi"/>
+                                </m:rPr>
                                 <w:rPr>
                                   <w:rFonts w:ascii="Cambria Math" w:hAnsi="Cambria Math" w:cs="Times New Roman"/>
                                   <w:color w:val="000000" w:themeColor="text1"/>
@@ -7017,6 +6890,9 @@
                             </m:e>
                             <m:sub>
                               <m:r>
+                                <m:rPr>
+                                  <m:sty m:val="bi"/>
+                                </m:rPr>
                                 <w:rPr>
                                   <w:rFonts w:ascii="Cambria Math" w:hAnsi="Cambria Math" w:cs="Times New Roman"/>
                                   <w:color w:val="000000" w:themeColor="text1"/>
@@ -7028,6 +6904,9 @@
                             </m:sub>
                             <m:sup>
                               <m:r>
+                                <m:rPr>
+                                  <m:sty m:val="bi"/>
+                                </m:rPr>
                                 <w:rPr>
                                   <w:rFonts w:ascii="Cambria Math" w:hAnsi="Cambria Math" w:cs="Times New Roman"/>
                                   <w:color w:val="000000" w:themeColor="text1"/>
@@ -7039,6 +6918,9 @@
                             </m:sup>
                           </m:sSubSup>
                           <m:r>
+                            <m:rPr>
+                              <m:sty m:val="bi"/>
+                            </m:rPr>
                             <w:rPr>
                               <w:rFonts w:ascii="Cambria Math" w:hAnsi="Cambria Math" w:cs="Times New Roman"/>
                               <w:color w:val="000000" w:themeColor="text1"/>
@@ -7052,6 +6934,9 @@
                     </m:e>
                     <m:sup>
                       <m:r>
+                        <m:rPr>
+                          <m:sty m:val="bi"/>
+                        </m:rPr>
                         <w:rPr>
                           <w:rFonts w:ascii="Cambria Math" w:hAnsi="Cambria Math" w:cs="Times New Roman"/>
                           <w:color w:val="000000" w:themeColor="text1"/>
@@ -7063,22 +6948,16 @@
                     </m:sup>
                   </m:sSup>
                   <m:r>
+                    <m:rPr>
+                      <m:sty m:val="bi"/>
+                    </m:rPr>
                     <w:rPr>
                       <w:rFonts w:ascii="Cambria Math" w:hAnsi="Cambria Math" w:cs="Times New Roman"/>
                       <w:color w:val="000000" w:themeColor="text1"/>
                       <w:sz w:val="20"/>
                       <w:szCs w:val="20"/>
                     </w:rPr>
-                    <m:t>+</m:t>
-                  </m:r>
-                  <m:r>
-                    <w:rPr>
-                      <w:rFonts w:ascii="Cambria Math" w:hAnsi="Cambria Math" w:cs="Times New Roman"/>
-                      <w:color w:val="000000" w:themeColor="text1"/>
-                      <w:sz w:val="20"/>
-                      <w:szCs w:val="20"/>
-                    </w:rPr>
-                    <m:t>λ</m:t>
+                    <m:t>+λ</m:t>
                   </m:r>
                   <m:nary>
                     <m:naryPr>
@@ -7097,6 +6976,9 @@
                     </m:naryPr>
                     <m:sub>
                       <m:r>
+                        <m:rPr>
+                          <m:sty m:val="bi"/>
+                        </m:rPr>
                         <w:rPr>
                           <w:rFonts w:ascii="Cambria Math" w:hAnsi="Cambria Math" w:cs="Times New Roman"/>
                           <w:color w:val="000000" w:themeColor="text1"/>
@@ -7108,6 +6990,9 @@
                     </m:sub>
                     <m:sup>
                       <m:r>
+                        <m:rPr>
+                          <m:sty m:val="bi"/>
+                        </m:rPr>
                         <w:rPr>
                           <w:rFonts w:ascii="Cambria Math" w:hAnsi="Cambria Math" w:cs="Times New Roman"/>
                           <w:color w:val="000000" w:themeColor="text1"/>
@@ -7134,6 +7019,9 @@
                         </m:sSubSupPr>
                         <m:e>
                           <m:r>
+                            <m:rPr>
+                              <m:sty m:val="bi"/>
+                            </m:rPr>
                             <w:rPr>
                               <w:rFonts w:ascii="Cambria Math" w:hAnsi="Cambria Math" w:cs="Times New Roman"/>
                               <w:color w:val="000000" w:themeColor="text1"/>
@@ -7145,6 +7033,9 @@
                         </m:e>
                         <m:sub>
                           <m:r>
+                            <m:rPr>
+                              <m:sty m:val="bi"/>
+                            </m:rPr>
                             <w:rPr>
                               <w:rFonts w:ascii="Cambria Math" w:hAnsi="Cambria Math" w:cs="Times New Roman"/>
                               <w:color w:val="000000" w:themeColor="text1"/>
@@ -7156,6 +7047,9 @@
                         </m:sub>
                         <m:sup>
                           <m:r>
+                            <m:rPr>
+                              <m:sty m:val="bi"/>
+                            </m:rPr>
                             <w:rPr>
                               <w:rFonts w:ascii="Cambria Math" w:hAnsi="Cambria Math" w:cs="Times New Roman"/>
                               <w:color w:val="000000" w:themeColor="text1"/>
@@ -7221,6 +7115,9 @@
           </m:sSubPr>
           <m:e>
             <m:r>
+              <m:rPr>
+                <m:sty m:val="bi"/>
+              </m:rPr>
               <w:rPr>
                 <w:rFonts w:ascii="Cambria Math" w:hAnsi="Cambria Math" w:cs="Times New Roman"/>
                 <w:color w:val="000000" w:themeColor="text1"/>
@@ -7232,6 +7129,9 @@
           </m:e>
           <m:sub>
             <m:r>
+              <m:rPr>
+                <m:sty m:val="bi"/>
+              </m:rPr>
               <w:rPr>
                 <w:rFonts w:ascii="Cambria Math" w:hAnsi="Cambria Math" w:cs="Times New Roman"/>
                 <w:color w:val="000000" w:themeColor="text1"/>
@@ -7271,6 +7171,9 @@
           </m:sSubPr>
           <m:e>
             <m:r>
+              <m:rPr>
+                <m:sty m:val="bi"/>
+              </m:rPr>
               <w:rPr>
                 <w:rFonts w:ascii="Cambria Math" w:hAnsi="Cambria Math" w:cs="Times New Roman"/>
                 <w:color w:val="000000" w:themeColor="text1"/>
@@ -7282,6 +7185,9 @@
           </m:e>
           <m:sub>
             <m:r>
+              <m:rPr>
+                <m:sty m:val="bi"/>
+              </m:rPr>
               <w:rPr>
                 <w:rFonts w:ascii="Cambria Math" w:hAnsi="Cambria Math" w:cs="Times New Roman"/>
                 <w:color w:val="000000" w:themeColor="text1"/>
@@ -7322,6 +7228,9 @@
           </m:sSubPr>
           <m:e>
             <m:r>
+              <m:rPr>
+                <m:sty m:val="bi"/>
+              </m:rPr>
               <w:rPr>
                 <w:rFonts w:ascii="Cambria Math" w:hAnsi="Cambria Math" w:cs="Times New Roman"/>
                 <w:color w:val="000000" w:themeColor="text1"/>
@@ -7333,6 +7242,9 @@
           </m:e>
           <m:sub>
             <m:r>
+              <m:rPr>
+                <m:sty m:val="bi"/>
+              </m:rPr>
               <w:rPr>
                 <w:rFonts w:ascii="Cambria Math" w:hAnsi="Cambria Math" w:cs="Times New Roman"/>
                 <w:color w:val="000000" w:themeColor="text1"/>
@@ -7359,6 +7271,9 @@
       </w:r>
       <m:oMath>
         <m:r>
+          <m:rPr>
+            <m:sty m:val="bi"/>
+          </m:rPr>
           <w:rPr>
             <w:rFonts w:ascii="Cambria Math" w:hAnsi="Cambria Math" w:cs="Times New Roman"/>
             <w:color w:val="000000" w:themeColor="text1"/>
@@ -7383,6 +7298,9 @@
       </w:r>
       <m:oMath>
         <m:r>
+          <m:rPr>
+            <m:sty m:val="bi"/>
+          </m:rPr>
           <w:rPr>
             <w:rFonts w:ascii="Cambria Math" w:hAnsi="Cambria Math" w:cs="Times New Roman"/>
             <w:color w:val="000000" w:themeColor="text1"/>
@@ -7408,6 +7326,9 @@
           </m:naryPr>
           <m:sub>
             <m:r>
+              <m:rPr>
+                <m:sty m:val="bi"/>
+              </m:rPr>
               <w:rPr>
                 <w:rFonts w:ascii="Cambria Math" w:hAnsi="Cambria Math" w:cs="Times New Roman"/>
                 <w:color w:val="000000" w:themeColor="text1"/>
@@ -7419,6 +7340,9 @@
           </m:sub>
           <m:sup>
             <m:r>
+              <m:rPr>
+                <m:sty m:val="bi"/>
+              </m:rPr>
               <w:rPr>
                 <w:rFonts w:ascii="Cambria Math" w:hAnsi="Cambria Math" w:cs="Times New Roman"/>
                 <w:color w:val="000000" w:themeColor="text1"/>
@@ -7445,6 +7369,9 @@
               </m:sSubSupPr>
               <m:e>
                 <m:r>
+                  <m:rPr>
+                    <m:sty m:val="bi"/>
+                  </m:rPr>
                   <w:rPr>
                     <w:rFonts w:ascii="Cambria Math" w:hAnsi="Cambria Math" w:cs="Times New Roman"/>
                     <w:color w:val="000000" w:themeColor="text1"/>
@@ -7456,6 +7383,9 @@
               </m:e>
               <m:sub>
                 <m:r>
+                  <m:rPr>
+                    <m:sty m:val="bi"/>
+                  </m:rPr>
                   <w:rPr>
                     <w:rFonts w:ascii="Cambria Math" w:hAnsi="Cambria Math" w:cs="Times New Roman"/>
                     <w:color w:val="000000" w:themeColor="text1"/>
@@ -7467,6 +7397,9 @@
               </m:sub>
               <m:sup>
                 <m:r>
+                  <m:rPr>
+                    <m:sty m:val="bi"/>
+                  </m:rPr>
                   <w:rPr>
                     <w:rFonts w:ascii="Cambria Math" w:hAnsi="Cambria Math" w:cs="Times New Roman"/>
                     <w:color w:val="000000" w:themeColor="text1"/>
@@ -7535,20 +7468,7 @@
           <w:sz w:val="20"/>
           <w:szCs w:val="20"/>
         </w:rPr>
-        <w:t>RR</w:t>
-      </w:r>
-      <w:r>
-        <w:rPr>
-          <w:rFonts w:ascii="Times New Roman" w:hAnsi="Times New Roman" w:cs="Times New Roman"/>
-          <w:b w:val="0"/>
-          <w:bCs/>
-          <w:i w:val="0"/>
-          <w:iCs/>
-          <w:color w:val="000000" w:themeColor="text1"/>
-          <w:sz w:val="20"/>
-          <w:szCs w:val="20"/>
-        </w:rPr>
-        <w:t xml:space="preserve"> addresses this issue by introducing an L2 penalty on the size of the coefficients, shrinking them toward zero but not exactly to zero. This penalty is controlled by a non-negative tuning parameter </w:t>
+        <w:t xml:space="preserve">RR addresses this issue by introducing an L2 penalty on the size of the coefficients, shrinking them toward zero but not exactly to zero. This penalty is controlled by a non-negative tuning parameter </w:t>
       </w:r>
       <m:oMath>
         <m:d>
@@ -7567,6 +7487,9 @@
           </m:dPr>
           <m:e>
             <m:r>
+              <m:rPr>
+                <m:sty m:val="bi"/>
+              </m:rPr>
               <w:rPr>
                 <w:rFonts w:ascii="Cambria Math" w:hAnsi="Cambria Math" w:cs="Times New Roman"/>
                 <w:color w:val="000000" w:themeColor="text1"/>
@@ -7593,6 +7516,9 @@
       </w:r>
       <m:oMath>
         <m:r>
+          <m:rPr>
+            <m:sty m:val="bi"/>
+          </m:rPr>
           <w:rPr>
             <w:rFonts w:ascii="Cambria Math" w:hAnsi="Cambria Math" w:cs="Times New Roman"/>
             <w:color w:val="000000" w:themeColor="text1"/>
@@ -7613,20 +7539,7 @@
           <w:sz w:val="20"/>
           <w:szCs w:val="20"/>
         </w:rPr>
-        <w:t xml:space="preserve"> yield greater shrinkage of the coefficients. The ridge estimator thus solves a modified optimization problem that balances fitting the data well and keeping coefficient magnitudes small. As a result, </w:t>
-      </w:r>
-      <w:r>
-        <w:rPr>
-          <w:rFonts w:ascii="Times New Roman" w:hAnsi="Times New Roman" w:cs="Times New Roman"/>
-          <w:b w:val="0"/>
-          <w:bCs/>
-          <w:i w:val="0"/>
-          <w:iCs/>
-          <w:color w:val="000000" w:themeColor="text1"/>
-          <w:sz w:val="20"/>
-          <w:szCs w:val="20"/>
-        </w:rPr>
-        <w:t xml:space="preserve">RR is able to handles more complexity and prevent overfitting [L2].  </w:t>
+        <w:t xml:space="preserve"> yield greater shrinkage of the coefficients. The ridge estimator thus solves a modified optimization problem that balances fitting the data well and keeping coefficient magnitudes small. As a result, RR is able to handles more complexity and prevent overfitting [L2].  </w:t>
       </w:r>
     </w:p>
     <w:p>
@@ -7650,6 +7563,7 @@
         </w:numPr>
       </w:pPr>
       <w:r>
+        <w:lastRenderedPageBreak/>
         <w:t>Random Forest Tree</w:t>
       </w:r>
     </w:p>
@@ -7670,7 +7584,6 @@
         </w:numPr>
       </w:pPr>
       <w:r>
-        <w:lastRenderedPageBreak/>
         <w:t>Linear Regression</w:t>
       </w:r>
       <w:r>
@@ -7745,7 +7658,7 @@
           <w:sz w:val="20"/>
           <w:szCs w:val="20"/>
         </w:rPr>
-        <w:t xml:space="preserve"> across both quantitative metrics and class-level prediction </w:t>
+        <w:t xml:space="preserve"> across both quantitative metrics and class-level prediction behaviour, as evidenced by the reported results</w:t>
       </w:r>
       <w:r>
         <w:rPr>
@@ -7758,7 +7671,7 @@
           <w:sz w:val="20"/>
           <w:szCs w:val="20"/>
         </w:rPr>
-        <w:t>behaviour</w:t>
+        <w:t xml:space="preserve"> below:</w:t>
       </w:r>
       <w:r>
         <w:rPr>
@@ -7771,32 +7684,6 @@
           <w:sz w:val="20"/>
           <w:szCs w:val="20"/>
         </w:rPr>
-        <w:t>, as evidenced by the reported results</w:t>
-      </w:r>
-      <w:r>
-        <w:rPr>
-          <w:rFonts w:ascii="Times New Roman" w:hAnsi="Times New Roman" w:cs="Times New Roman"/>
-          <w:b w:val="0"/>
-          <w:bCs/>
-          <w:i w:val="0"/>
-          <w:iCs/>
-          <w:color w:val="000000" w:themeColor="text1"/>
-          <w:sz w:val="20"/>
-          <w:szCs w:val="20"/>
-        </w:rPr>
-        <w:t xml:space="preserve"> below:</w:t>
-      </w:r>
-      <w:r>
-        <w:rPr>
-          <w:rFonts w:ascii="Times New Roman" w:hAnsi="Times New Roman" w:cs="Times New Roman"/>
-          <w:b w:val="0"/>
-          <w:bCs/>
-          <w:i w:val="0"/>
-          <w:iCs/>
-          <w:color w:val="000000" w:themeColor="text1"/>
-          <w:sz w:val="20"/>
-          <w:szCs w:val="20"/>
-        </w:rPr>
         <w:br/>
       </w:r>
     </w:p>
@@ -7805,10 +7692,7 @@
         <w:pStyle w:val="TableTitle"/>
       </w:pPr>
       <w:r>
-        <w:t>TABLE I</w:t>
-      </w:r>
-      <w:r>
-        <w:t>I</w:t>
+        <w:t>TABLE II</w:t>
       </w:r>
     </w:p>
     <w:p>
@@ -8183,6 +8067,9 @@
           </m:sSupPr>
           <m:e>
             <m:r>
+              <m:rPr>
+                <m:sty m:val="bi"/>
+              </m:rPr>
               <w:rPr>
                 <w:rFonts w:ascii="Cambria Math" w:hAnsi="Cambria Math" w:cs="Times New Roman"/>
                 <w:color w:val="000000" w:themeColor="text1"/>
@@ -8194,6 +8081,9 @@
           </m:e>
           <m:sup>
             <m:r>
+              <m:rPr>
+                <m:sty m:val="bi"/>
+              </m:rPr>
               <w:rPr>
                 <w:rFonts w:ascii="Cambria Math" w:hAnsi="Cambria Math" w:cs="Times New Roman"/>
                 <w:color w:val="000000" w:themeColor="text1"/>
@@ -8378,33 +8268,7 @@
           <w:sz w:val="20"/>
           <w:szCs w:val="20"/>
         </w:rPr>
-        <w:t xml:space="preserve"> exhibits greater dispersion, with more predictions spilling into </w:t>
-      </w:r>
-      <w:r>
-        <w:rPr>
-          <w:rFonts w:ascii="Times New Roman" w:hAnsi="Times New Roman" w:cs="Times New Roman"/>
-          <w:b w:val="0"/>
-          <w:bCs/>
-          <w:i w:val="0"/>
-          <w:iCs/>
-          <w:color w:val="000000" w:themeColor="text1"/>
-          <w:sz w:val="20"/>
-          <w:szCs w:val="20"/>
-        </w:rPr>
-        <w:t>neighbouring</w:t>
-      </w:r>
-      <w:r>
-        <w:rPr>
-          <w:rFonts w:ascii="Times New Roman" w:hAnsi="Times New Roman" w:cs="Times New Roman"/>
-          <w:b w:val="0"/>
-          <w:bCs/>
-          <w:i w:val="0"/>
-          <w:iCs/>
-          <w:color w:val="000000" w:themeColor="text1"/>
-          <w:sz w:val="20"/>
-          <w:szCs w:val="20"/>
-        </w:rPr>
-        <w:t xml:space="preserve"> severity classes, especially underestimating or overestimating mid-range severities. </w:t>
+        <w:t xml:space="preserve"> exhibits greater dispersion, with more predictions spilling into neighbouring severity classes, especially underestimating or overestimating mid-range severities. </w:t>
       </w:r>
     </w:p>
     <w:p>
@@ -8574,6 +8438,7 @@
           <w:bCs/>
           <w:i w:val="0"/>
           <w:iCs/>
+          <w:noProof/>
           <w:color w:val="000000" w:themeColor="text1"/>
           <w:sz w:val="20"/>
           <w:szCs w:val="20"/>
@@ -8625,10 +8490,7 @@
         <w:ind w:left="0"/>
       </w:pPr>
       <w:r>
-        <w:t>Confusion Matrix: True vs Predicted Labels for MLR</w:t>
-      </w:r>
-      <w:r>
-        <w:t>.</w:t>
+        <w:t>Confusion Matrix: True vs Predicted Labels for MLR.</w:t>
       </w:r>
     </w:p>
     <w:p>
@@ -8640,6 +8502,9 @@
         </w:numPr>
       </w:pPr>
       <w:r>
+        <w:rPr>
+          <w:noProof/>
+        </w:rPr>
         <w:drawing>
           <wp:inline distT="0" distB="0" distL="0" distR="0" wp14:anchorId="467E0413" wp14:editId="43D0EF7C">
             <wp:extent cx="3060700" cy="2654935"/>
@@ -8687,13 +8552,7 @@
         <w:ind w:left="0"/>
       </w:pPr>
       <w:r>
-        <w:t xml:space="preserve">Confusion Matrix: True vs Predicted Labels for </w:t>
-      </w:r>
-      <w:r>
-        <w:t>R</w:t>
-      </w:r>
-      <w:r>
-        <w:t>R.</w:t>
+        <w:t>Confusion Matrix: True vs Predicted Labels for RR.</w:t>
       </w:r>
     </w:p>
     <w:p>
@@ -8734,6 +8593,18 @@
     </w:p>
     <w:p>
       <w:pPr>
+        <w:pStyle w:val="H2First"/>
+        <w:numPr>
+          <w:ilvl w:val="0"/>
+          <w:numId w:val="55"/>
+        </w:numPr>
+      </w:pPr>
+      <w:r>
+        <w:t>Key Insights</w:t>
+      </w:r>
+    </w:p>
+    <w:p>
+      <w:pPr>
         <w:pStyle w:val="H1ListSpace"/>
       </w:pPr>
       <w:r>
@@ -8835,21 +8706,7 @@
         <w:rPr>
           <w:spacing w:val="0"/>
         </w:rPr>
-        <w:t xml:space="preserve">).” An exception is when English units are used as identifiers in trade, such as “3½-in disk drive.” Avoid combining SI and CGS units, such as current in amperes and magnetic field in </w:t>
-      </w:r>
-      <w:proofErr w:type="spellStart"/>
-      <w:r>
-        <w:rPr>
-          <w:spacing w:val="0"/>
-        </w:rPr>
-        <w:t>oersteds</w:t>
-      </w:r>
-      <w:proofErr w:type="spellEnd"/>
-      <w:r>
-        <w:rPr>
-          <w:spacing w:val="0"/>
-        </w:rPr>
-        <w:t>. This often leads to confusion because equations do not balance dimensionally. If you must use mixed units, clearly state the units for each quantity in an equation.</w:t>
+        <w:t>).” An exception is when English units are used as identifiers in trade, such as “3½-in disk drive.” Avoid combining SI and CGS units, such as current in amperes and magnetic field in oersteds. This often leads to confusion because equations do not balance dimensionally. If you must use mixed units, clearly state the units for each quantity in an equation.</w:t>
       </w:r>
     </w:p>
     <w:p>
@@ -8890,15 +8747,7 @@
         <w:t>H</w:t>
       </w:r>
       <w:r>
-        <w:t xml:space="preserve">. Use the </w:t>
-      </w:r>
-      <w:proofErr w:type="spellStart"/>
-      <w:r>
-        <w:t>center</w:t>
-      </w:r>
-      <w:proofErr w:type="spellEnd"/>
-      <w:r>
-        <w:t xml:space="preserve"> dot to separate compound units, e.g., “A·m</w:t>
+        <w:t>. Use the center dot to separate compound units, e.g., “A·m</w:t>
       </w:r>
       <w:r>
         <w:rPr>
@@ -8935,39 +8784,7 @@
         <w:t xml:space="preserve"> is zero, not a lowercase letter “o.” </w:t>
       </w:r>
       <w:r>
-        <w:t>The term for residual magnetization is “remanence”; the adjective is “remanent”; do not write “</w:t>
-      </w:r>
-      <w:proofErr w:type="spellStart"/>
-      <w:r>
-        <w:t>remnance</w:t>
-      </w:r>
-      <w:proofErr w:type="spellEnd"/>
-      <w:r>
-        <w:t>” or “remnant.” Use the word “</w:t>
-      </w:r>
-      <w:proofErr w:type="spellStart"/>
-      <w:r>
-        <w:t>micrometer</w:t>
-      </w:r>
-      <w:proofErr w:type="spellEnd"/>
-      <w:r>
-        <w:t xml:space="preserve">” instead of “micron.” A graph within a graph is an “inset,” not an “insert.” The word “alternatively” is preferred to the word “alternately” (unless you really mean something that alternates). Use the word “whereas” instead of “while” (unless you are referring to simultaneous events). Do not use the word “essentially” to mean “approximately” or “effectively.” Do not use the word “issue” as a euphemism for “problem.” When compositions are not specified, separate chemical symbols by </w:t>
-      </w:r>
-      <w:proofErr w:type="spellStart"/>
-      <w:r>
-        <w:t>en</w:t>
-      </w:r>
-      <w:proofErr w:type="spellEnd"/>
-      <w:r>
-        <w:t>-dashes; for example, “</w:t>
-      </w:r>
-      <w:proofErr w:type="spellStart"/>
-      <w:r>
-        <w:t>NiMn</w:t>
-      </w:r>
-      <w:proofErr w:type="spellEnd"/>
-      <w:r>
-        <w:t>” indicates the intermetallic compound Ni</w:t>
+        <w:t>The term for residual magnetization is “remanence”; the adjective is “remanent”; do not write “remnance” or “remnant.” Use the word “micrometer” instead of “micron.” A graph within a graph is an “inset,” not an “insert.” The word “alternatively” is preferred to the word “alternately” (unless you really mean something that alternates). Use the word “whereas” instead of “while” (unless you are referring to simultaneous events). Do not use the word “essentially” to mean “approximately” or “effectively.” Do not use the word “issue” as a euphemism for “problem.” When compositions are not specified, separate chemical symbols by en-dashes; for example, “NiMn” indicates the intermetallic compound Ni</w:t>
       </w:r>
       <w:r>
         <w:rPr>
@@ -9011,21 +8828,13 @@
         <w:pStyle w:val="PARAIndent"/>
       </w:pPr>
       <w:r>
-        <w:t>Be aware of the different meanings of the homophones “affect” (usually a verb) and “effect” (usually a noun), “complement” and “compliment,” “discreet” and “discrete,” “</w:t>
-      </w:r>
-      <w:proofErr w:type="gramStart"/>
-      <w:r>
-        <w:t>principal”</w:t>
+        <w:t>Be aware of the different meanings of the homophones “affect” (usually a verb) and “effect” (usually a noun), “complement” and “compliment,” “discreet” and “discrete,” “principal”</w:t>
       </w:r>
       <w:r>
         <w:t xml:space="preserve"> </w:t>
       </w:r>
       <w:r>
-        <w:t xml:space="preserve"> (</w:t>
-      </w:r>
-      <w:proofErr w:type="gramEnd"/>
-      <w:r>
-        <w:t>e.g.,</w:t>
+        <w:t xml:space="preserve"> (e.g.,</w:t>
       </w:r>
       <w:r>
         <w:t xml:space="preserve"> </w:t>
@@ -9170,15 +8979,7 @@
         <w:pStyle w:val="PARAIndent"/>
       </w:pPr>
       <w:r>
-        <w:t xml:space="preserve">A general IEEE </w:t>
-      </w:r>
-      <w:proofErr w:type="spellStart"/>
-      <w:r>
-        <w:t>styleguide</w:t>
-      </w:r>
-      <w:proofErr w:type="spellEnd"/>
-      <w:r>
-        <w:t xml:space="preserve"> is available at </w:t>
+        <w:t xml:space="preserve">A general IEEE styleguide is available at </w:t>
       </w:r>
       <w:r>
         <w:rPr>
@@ -9228,23 +9029,7 @@
         <w:t>journals</w:t>
       </w:r>
       <w:r>
-        <w:t xml:space="preserve">. They are categorized based on their construction, and use of </w:t>
-      </w:r>
-      <w:proofErr w:type="spellStart"/>
-      <w:r>
-        <w:t>color</w:t>
-      </w:r>
-      <w:proofErr w:type="spellEnd"/>
-      <w:r>
-        <w:t xml:space="preserve"> / shades of </w:t>
-      </w:r>
-      <w:proofErr w:type="spellStart"/>
-      <w:r>
-        <w:t>gray</w:t>
-      </w:r>
-      <w:proofErr w:type="spellEnd"/>
-      <w:r>
-        <w:t>:</w:t>
+        <w:t>. They are categorized based on their construction, and use of color / shades of gray:</w:t>
       </w:r>
     </w:p>
     <w:p>
@@ -9260,31 +9045,7 @@
         <w:pStyle w:val="PARA"/>
       </w:pPr>
       <w:r>
-        <w:t xml:space="preserve">Figures that are meant to appear in </w:t>
-      </w:r>
-      <w:proofErr w:type="spellStart"/>
-      <w:r>
-        <w:t>color</w:t>
-      </w:r>
-      <w:proofErr w:type="spellEnd"/>
-      <w:r>
-        <w:t>, or shades of black/</w:t>
-      </w:r>
-      <w:proofErr w:type="spellStart"/>
-      <w:r>
-        <w:t>gray</w:t>
-      </w:r>
-      <w:proofErr w:type="spellEnd"/>
-      <w:r>
-        <w:t xml:space="preserve">. Such figures may include photographs, illustrations, </w:t>
-      </w:r>
-      <w:proofErr w:type="spellStart"/>
-      <w:r>
-        <w:t>multicolor</w:t>
-      </w:r>
-      <w:proofErr w:type="spellEnd"/>
-      <w:r>
-        <w:t xml:space="preserve"> graphs, and flowcharts.</w:t>
+        <w:t>Figures that are meant to appear in color, or shades of black/gray. Such figures may include photographs, illustrations, multicolor graphs, and flowcharts.</w:t>
       </w:r>
     </w:p>
     <w:p>
@@ -9300,15 +9061,7 @@
         <w:pStyle w:val="PARA"/>
       </w:pPr>
       <w:r>
-        <w:t xml:space="preserve">Figures that are composed of only black lines and shapes. These figures should have no shades or half-tones of </w:t>
-      </w:r>
-      <w:proofErr w:type="spellStart"/>
-      <w:r>
-        <w:t>gray</w:t>
-      </w:r>
-      <w:proofErr w:type="spellEnd"/>
-      <w:r>
-        <w:t>, only black and white.</w:t>
+        <w:t>Figures that are composed of only black lines and shapes. These figures should have no shades or half-tones of gray, only black and white.</w:t>
       </w:r>
     </w:p>
     <w:p>
@@ -9340,15 +9093,7 @@
         <w:pStyle w:val="PARA"/>
       </w:pPr>
       <w:r>
-        <w:t xml:space="preserve">Data charts which are typically black and white, but sometimes include </w:t>
-      </w:r>
-      <w:proofErr w:type="spellStart"/>
-      <w:r>
-        <w:t>color</w:t>
-      </w:r>
-      <w:proofErr w:type="spellEnd"/>
-      <w:r>
-        <w:t>.</w:t>
+        <w:t>Data charts which are typically black and white, but sometimes include color.</w:t>
       </w:r>
     </w:p>
     <w:p>
@@ -9909,21 +9654,12 @@
               </w:rPr>
               <w:t>3</w:t>
             </w:r>
-            <w:proofErr w:type="gramStart"/>
             <w:r>
               <w:rPr>
                 <w:sz w:val="16"/>
                 <w:szCs w:val="16"/>
               </w:rPr>
-              <w:t>/(</w:t>
-            </w:r>
-            <w:proofErr w:type="gramEnd"/>
-            <w:r>
-              <w:rPr>
-                <w:sz w:val="16"/>
-                <w:szCs w:val="16"/>
-              </w:rPr>
-              <w:t>4</w:t>
+              <w:t>/(4</w:t>
             </w:r>
             <w:r>
               <w:rPr>
@@ -10385,21 +10121,12 @@
               </w:rPr>
               <w:t>3</w:t>
             </w:r>
-            <w:proofErr w:type="gramStart"/>
             <w:r>
               <w:rPr>
                 <w:sz w:val="16"/>
                 <w:szCs w:val="16"/>
               </w:rPr>
-              <w:t>/(</w:t>
-            </w:r>
-            <w:proofErr w:type="gramEnd"/>
-            <w:r>
-              <w:rPr>
-                <w:sz w:val="16"/>
-                <w:szCs w:val="16"/>
-              </w:rPr>
-              <w:t>4</w:t>
+              <w:t>/(4</w:t>
             </w:r>
             <w:r>
               <w:rPr>
@@ -10493,23 +10220,7 @@
                 <w:sz w:val="16"/>
                 <w:szCs w:val="16"/>
               </w:rPr>
-              <w:t>1 erg/(</w:t>
-            </w:r>
-            <w:proofErr w:type="spellStart"/>
-            <w:r>
-              <w:rPr>
-                <w:sz w:val="16"/>
-                <w:szCs w:val="16"/>
-              </w:rPr>
-              <w:t>G·g</w:t>
-            </w:r>
-            <w:proofErr w:type="spellEnd"/>
-            <w:r>
-              <w:rPr>
-                <w:sz w:val="16"/>
-                <w:szCs w:val="16"/>
-              </w:rPr>
-              <w:t xml:space="preserve">) = 1 emu/g </w:t>
+              <w:t xml:space="preserve">1 erg/(G·g) = 1 emu/g </w:t>
             </w:r>
             <w:r>
               <w:rPr>
@@ -10717,17 +10428,8 @@
                 <w:sz w:val="16"/>
                 <w:szCs w:val="16"/>
               </w:rPr>
-              <w:t xml:space="preserve"> </w:t>
+              <w:t xml:space="preserve"> Wb·m</w:t>
             </w:r>
-            <w:proofErr w:type="spellStart"/>
-            <w:r>
-              <w:rPr>
-                <w:sz w:val="16"/>
-                <w:szCs w:val="16"/>
-              </w:rPr>
-              <w:t>Wb·m</w:t>
-            </w:r>
-            <w:proofErr w:type="spellEnd"/>
           </w:p>
         </w:tc>
       </w:tr>
@@ -11432,23 +11134,7 @@
                 <w:sz w:val="16"/>
                 <w:szCs w:val="16"/>
               </w:rPr>
-              <w:t xml:space="preserve"> Wb/(</w:t>
-            </w:r>
-            <w:proofErr w:type="spellStart"/>
-            <w:r>
-              <w:rPr>
-                <w:sz w:val="16"/>
-                <w:szCs w:val="16"/>
-              </w:rPr>
-              <w:t>A·m</w:t>
-            </w:r>
-            <w:proofErr w:type="spellEnd"/>
-            <w:r>
-              <w:rPr>
-                <w:sz w:val="16"/>
-                <w:szCs w:val="16"/>
-              </w:rPr>
-              <w:t>)</w:t>
+              <w:t xml:space="preserve"> Wb/(A·m)</w:t>
             </w:r>
           </w:p>
         </w:tc>
@@ -11818,23 +11504,7 @@
                 <w:sz w:val="16"/>
                 <w:szCs w:val="16"/>
               </w:rPr>
-              <w:t xml:space="preserve"> 1</w:t>
-            </w:r>
-            <w:proofErr w:type="gramStart"/>
-            <w:r>
-              <w:rPr>
-                <w:sz w:val="16"/>
-                <w:szCs w:val="16"/>
-              </w:rPr>
-              <w:t>/(</w:t>
-            </w:r>
-            <w:proofErr w:type="gramEnd"/>
-            <w:r>
-              <w:rPr>
-                <w:sz w:val="16"/>
-                <w:szCs w:val="16"/>
-              </w:rPr>
-              <w:t>4</w:t>
+              <w:t xml:space="preserve"> 1/(4</w:t>
             </w:r>
             <w:r>
               <w:rPr>
@@ -11866,7 +11536,6 @@
       <w:pPr>
         <w:pStyle w:val="FootnoteText"/>
       </w:pPr>
-      <w:proofErr w:type="spellStart"/>
       <w:r>
         <w:rPr>
           <w:vertAlign w:val="superscript"/>
@@ -11874,11 +11543,7 @@
         <w:t>a</w:t>
       </w:r>
       <w:r>
-        <w:t>Gaussian</w:t>
-      </w:r>
-      <w:proofErr w:type="spellEnd"/>
-      <w:r>
-        <w:t xml:space="preserve"> units are the same as cg emu for magnetostatics; Mx = maxwell, G = gauss, Oe = oersted; Wb = weber, V = volt, s = second, T = tesla, m = meter, A = ampere, J = joule, kg = kilogram, H = henry.</w:t>
+        <w:t>Gaussian units are the same as cg emu for magnetostatics; Mx = maxwell, G = gauss, Oe = oersted; Wb = weber, V = volt, s = second, T = tesla, m = meter, A = ampere, J = joule, kg = kilogram, H = henry.</w:t>
       </w:r>
     </w:p>
     <w:p>
@@ -11895,23 +11560,7 @@
         <w:pStyle w:val="PARA"/>
       </w:pPr>
       <w:r>
-        <w:t xml:space="preserve">Figures compiled of more than one sub-figure presented side-by-side, or stacked. If a multipart figure is made up of multiple figure types (one part is </w:t>
-      </w:r>
-      <w:proofErr w:type="spellStart"/>
-      <w:r>
-        <w:t>lineart</w:t>
-      </w:r>
-      <w:proofErr w:type="spellEnd"/>
-      <w:r>
-        <w:t xml:space="preserve">, and another is grayscale or </w:t>
-      </w:r>
-      <w:proofErr w:type="spellStart"/>
-      <w:r>
-        <w:t>color</w:t>
-      </w:r>
-      <w:proofErr w:type="spellEnd"/>
-      <w:r>
-        <w:t>) the figure should meet the stricter guidelines.</w:t>
+        <w:t>Figures compiled of more than one sub-figure presented side-by-side, or stacked. If a multipart figure is made up of multiple figure types (one part is lineart, and another is grayscale or color) the figure should meet the stricter guidelines.</w:t>
       </w:r>
     </w:p>
     <w:p>
@@ -11966,31 +11615,7 @@
         <w:pStyle w:val="PARA"/>
       </w:pPr>
       <w:r>
-        <w:t xml:space="preserve">Most charts, graphs, and tables are one column wide (3.5 inches / 88 </w:t>
-      </w:r>
-      <w:proofErr w:type="spellStart"/>
-      <w:r>
-        <w:t>millimeters</w:t>
-      </w:r>
-      <w:proofErr w:type="spellEnd"/>
-      <w:r>
-        <w:t xml:space="preserve"> / 21 picas) or page wide (7.16 inches / 181 </w:t>
-      </w:r>
-      <w:proofErr w:type="spellStart"/>
-      <w:r>
-        <w:t>millimeters</w:t>
-      </w:r>
-      <w:proofErr w:type="spellEnd"/>
-      <w:r>
-        <w:t xml:space="preserve"> / 43 picas). The maximum depth a graphic can be is 8.5 inches (216 </w:t>
-      </w:r>
-      <w:proofErr w:type="spellStart"/>
-      <w:r>
-        <w:t>millimeters</w:t>
-      </w:r>
-      <w:proofErr w:type="spellEnd"/>
-      <w:r>
-        <w:t xml:space="preserve"> / 54 picas). When choosing the depth of a graphic, please allow space for a caption. Figures can be sized between column and page widths if the author chooses, however it is recommended that figures are not sized less than column width unless when necessary.</w:t>
+        <w:t>Most charts, graphs, and tables are one column wide (3.5 inches / 88 millimeters / 21 picas) or page wide (7.16 inches / 181 millimeters / 43 picas). The maximum depth a graphic can be is 8.5 inches (216 millimeters / 54 picas). When choosing the depth of a graphic, please allow space for a caption. Figures can be sized between column and page widths if the author chooses, however it is recommended that figures are not sized less than column width unless when necessary.</w:t>
       </w:r>
     </w:p>
     <w:p>
@@ -11998,15 +11623,7 @@
         <w:pStyle w:val="PARAIndent"/>
       </w:pPr>
       <w:r>
-        <w:t xml:space="preserve">There is currently one publication with column measurements that do not coincide with those listed above. Proceedings of the IEEE has a column measurement of 3.25 inches (82.5 </w:t>
-      </w:r>
-      <w:proofErr w:type="spellStart"/>
-      <w:r>
-        <w:t>millimeters</w:t>
-      </w:r>
-      <w:proofErr w:type="spellEnd"/>
-      <w:r>
-        <w:t xml:space="preserve"> / 19.5 picas). </w:t>
+        <w:t xml:space="preserve">There is currently one publication with column measurements that do not coincide with those listed above. Proceedings of the IEEE has a column measurement of 3.25 inches (82.5 millimeters / 19.5 picas). </w:t>
       </w:r>
     </w:p>
     <w:p>
@@ -12018,39 +11635,7 @@
       </w:r>
       <w:r>
         <w:br/>
-        <w:t xml:space="preserve">1 inch wide by 1.25 inches tall (25.4 </w:t>
-      </w:r>
-      <w:proofErr w:type="spellStart"/>
-      <w:r>
-        <w:t>millimeters</w:t>
-      </w:r>
-      <w:proofErr w:type="spellEnd"/>
-      <w:r>
-        <w:t xml:space="preserve"> x 31.75 </w:t>
-      </w:r>
-      <w:proofErr w:type="spellStart"/>
-      <w:r>
-        <w:t>millimeters</w:t>
-      </w:r>
-      <w:proofErr w:type="spellEnd"/>
-      <w:r>
-        <w:t xml:space="preserve"> / 6 picas x 7.5 picas). Author photos printed in editorials measure 1.59 inches wide by 2 inches tall (40 </w:t>
-      </w:r>
-      <w:proofErr w:type="spellStart"/>
-      <w:r>
-        <w:t>millimeters</w:t>
-      </w:r>
-      <w:proofErr w:type="spellEnd"/>
-      <w:r>
-        <w:t xml:space="preserve"> x 50 </w:t>
-      </w:r>
-      <w:proofErr w:type="spellStart"/>
-      <w:r>
-        <w:t>millimeters</w:t>
-      </w:r>
-      <w:proofErr w:type="spellEnd"/>
-      <w:r>
-        <w:t xml:space="preserve"> / 9.5 picas x 12 picas).</w:t>
+        <w:t>1 inch wide by 1.25 inches tall (25.4 millimeters x 31.75 millimeters / 6 picas x 7.5 picas). Author photos printed in editorials measure 1.59 inches wide by 2 inches tall (40 millimeters x 50 millimeters / 9.5 picas x 12 picas).</w:t>
       </w:r>
     </w:p>
     <w:p>
@@ -12066,15 +11651,7 @@
         <w:pStyle w:val="PARA"/>
       </w:pPr>
       <w:r>
-        <w:t xml:space="preserve">The proper resolution of your figures will depend on the type of figure it is as defined in the “Types of Figures” section. Author photographs, </w:t>
-      </w:r>
-      <w:proofErr w:type="spellStart"/>
-      <w:r>
-        <w:t>color</w:t>
-      </w:r>
-      <w:proofErr w:type="spellEnd"/>
-      <w:r>
-        <w:t>, and grayscale figures should be at least 300dpi. Line art, including tables should be a minimum of 600dpi.</w:t>
+        <w:t>The proper resolution of your figures will depend on the type of figure it is as defined in the “Types of Figures” section. Author photographs, color, and grayscale figures should be at least 300dpi. Line art, including tables should be a minimum of 600dpi.</w:t>
       </w:r>
     </w:p>
     <w:p>
@@ -12106,31 +11683,7 @@
         <w:pStyle w:val="PARA"/>
       </w:pPr>
       <w:r>
-        <w:t xml:space="preserve">The term </w:t>
-      </w:r>
-      <w:proofErr w:type="spellStart"/>
-      <w:r>
-        <w:t>color</w:t>
-      </w:r>
-      <w:proofErr w:type="spellEnd"/>
-      <w:r>
-        <w:t xml:space="preserve"> space refers to the entire sum of </w:t>
-      </w:r>
-      <w:proofErr w:type="spellStart"/>
-      <w:r>
-        <w:t>colors</w:t>
-      </w:r>
-      <w:proofErr w:type="spellEnd"/>
-      <w:r>
-        <w:t xml:space="preserve"> that can be represented within the said medium. For our purposes, the three main </w:t>
-      </w:r>
-      <w:proofErr w:type="spellStart"/>
-      <w:r>
-        <w:t>color</w:t>
-      </w:r>
-      <w:proofErr w:type="spellEnd"/>
-      <w:r>
-        <w:t xml:space="preserve"> spaces are Grayscale, RGB (red/green/blue) and CMYK (cyan/magenta/yellow/black). RGB is generally used with on-screen graphics, whereas CMYK is used for printing purposes.</w:t>
+        <w:t>The term color space refers to the entire sum of colors that can be represented within the said medium. For our purposes, the three main color spaces are Grayscale, RGB (red/green/blue) and CMYK (cyan/magenta/yellow/black). RGB is generally used with on-screen graphics, whereas CMYK is used for printing purposes.</w:t>
       </w:r>
     </w:p>
     <w:p>
@@ -12138,55 +11691,7 @@
         <w:pStyle w:val="PARAIndent"/>
       </w:pPr>
       <w:r>
-        <w:t xml:space="preserve">All </w:t>
-      </w:r>
-      <w:proofErr w:type="spellStart"/>
-      <w:r>
-        <w:t>color</w:t>
-      </w:r>
-      <w:proofErr w:type="spellEnd"/>
-      <w:r>
-        <w:t xml:space="preserve"> figures should be generated in RGB or CMYK </w:t>
-      </w:r>
-      <w:proofErr w:type="spellStart"/>
-      <w:r>
-        <w:t>color</w:t>
-      </w:r>
-      <w:proofErr w:type="spellEnd"/>
-      <w:r>
-        <w:t xml:space="preserve"> space. Grayscale images should be submitted in Grayscale </w:t>
-      </w:r>
-      <w:proofErr w:type="spellStart"/>
-      <w:r>
-        <w:t>color</w:t>
-      </w:r>
-      <w:proofErr w:type="spellEnd"/>
-      <w:r>
-        <w:t xml:space="preserve"> space. Line art may be provided in grayscale OR bitmap </w:t>
-      </w:r>
-      <w:proofErr w:type="spellStart"/>
-      <w:r>
-        <w:t>colorspace</w:t>
-      </w:r>
-      <w:proofErr w:type="spellEnd"/>
-      <w:r>
-        <w:t xml:space="preserve">. Note that “bitmap </w:t>
-      </w:r>
-      <w:proofErr w:type="spellStart"/>
-      <w:r>
-        <w:t>colorspace</w:t>
-      </w:r>
-      <w:proofErr w:type="spellEnd"/>
-      <w:r>
-        <w:t xml:space="preserve">” and “bitmap file format” are not the same thing. When bitmap </w:t>
-      </w:r>
-      <w:proofErr w:type="spellStart"/>
-      <w:r>
-        <w:t>color</w:t>
-      </w:r>
-      <w:proofErr w:type="spellEnd"/>
-      <w:r>
-        <w:t xml:space="preserve"> space is selected, .TIF/.TIFF/.PNG are the recommended file formats.</w:t>
+        <w:t>All color figures should be generated in RGB or CMYK color space. Grayscale images should be submitted in Grayscale color space. Line art may be provided in grayscale OR bitmap colorspace. Note that “bitmap colorspace” and “bitmap file format” are not the same thing. When bitmap color space is selected, .TIF/.TIFF/.PNG are the recommended file formats.</w:t>
       </w:r>
     </w:p>
     <w:p>
@@ -12268,9 +11773,10 @@
       </w:r>
       <w:r>
         <w:rPr>
+          <w:noProof/>
           <w:position w:val="-2"/>
         </w:rPr>
-        <w:object w:dxaOrig="100" w:dyaOrig="120" w14:anchorId="12D88ECF">
+        <w:object w:dxaOrig="100" w:dyaOrig="120" w14:anchorId="61946B63">
           <v:shapetype id="_x0000_t75" coordsize="21600,21600" o:spt="75" o:preferrelative="t" path="m@4@5l@4@11@9@11@9@5xe" filled="f" stroked="f">
             <v:stroke joinstyle="miter"/>
             <v:formulas>
@@ -12290,10 +11796,10 @@
             <v:path o:extrusionok="f" gradientshapeok="t" o:connecttype="rect"/>
             <o:lock v:ext="edit" aspectratio="t"/>
           </v:shapetype>
-          <v:shape id="_x0000_i1025" type="#_x0000_t75" style="width:5.25pt;height:5.25pt" o:ole="" fillcolor="window">
+          <v:shape id="_x0000_i1025" type="#_x0000_t75" alt="" style="width:5.05pt;height:5.05pt;mso-width-percent:0;mso-height-percent:0;mso-width-percent:0;mso-height-percent:0" o:ole="" fillcolor="window">
             <v:imagedata r:id="rId27" o:title=""/>
           </v:shape>
-          <o:OLEObject Type="Embed" ProgID="Equation.3" ShapeID="_x0000_i1025" DrawAspect="Content" ObjectID="_1830703063" r:id="rId28"/>
+          <o:OLEObject Type="Embed" ProgID="Equation.3" ShapeID="_x0000_i1025" DrawAspect="Content" ObjectID="_1831056705" r:id="rId28"/>
         </w:object>
       </w:r>
       <w:r>
@@ -12335,15 +11841,7 @@
         <w:sym w:font="Symbol" w:char="F0B4"/>
       </w:r>
       <w:r>
-        <w:t xml:space="preserve"> 1000” because the reader would not know whether the top axis label in Fig. 1 meant 16000 A/m or 0.016 A/m. Figure labels should be legible, approximately </w:t>
-      </w:r>
-      <w:proofErr w:type="gramStart"/>
-      <w:r>
-        <w:t>8 to 10 point</w:t>
-      </w:r>
-      <w:proofErr w:type="gramEnd"/>
-      <w:r>
-        <w:t xml:space="preserve"> type.</w:t>
+        <w:t xml:space="preserve"> 1000” because the reader would not know whether the top axis label in Fig. 1 meant 16000 A/m or 0.016 A/m. Figure labels should be legible, approximately 8 to 10 point type.</w:t>
       </w:r>
     </w:p>
     <w:p>
@@ -12360,31 +11858,7 @@
         <w:pStyle w:val="PARA"/>
       </w:pPr>
       <w:r>
-        <w:t xml:space="preserve">Multipart figures should be combined and </w:t>
-      </w:r>
-      <w:proofErr w:type="spellStart"/>
-      <w:r>
-        <w:t>labeled</w:t>
-      </w:r>
-      <w:proofErr w:type="spellEnd"/>
-      <w:r>
-        <w:t xml:space="preserve"> before final submission. Labels should appear </w:t>
-      </w:r>
-      <w:proofErr w:type="spellStart"/>
-      <w:r>
-        <w:t>centered</w:t>
-      </w:r>
-      <w:proofErr w:type="spellEnd"/>
-      <w:r>
-        <w:t xml:space="preserve"> below each subfigure in </w:t>
-      </w:r>
-      <w:proofErr w:type="gramStart"/>
-      <w:r>
-        <w:t>8 point</w:t>
-      </w:r>
-      <w:proofErr w:type="gramEnd"/>
-      <w:r>
-        <w:t xml:space="preserve"> Times New Roman font in the format of (a) (b) (c). </w:t>
+        <w:t xml:space="preserve">Multipart figures should be combined and labeled before final submission. Labels should appear centered below each subfigure in 8 point Times New Roman font in the format of (a) (b) (c). </w:t>
       </w:r>
     </w:p>
     <w:p>
@@ -12423,23 +11897,7 @@
         <w:pStyle w:val="PARAIndent"/>
       </w:pPr>
       <w:r>
-        <w:t xml:space="preserve">Author photographs should be named using the first five characters of the pictured author’s last name. For example, four author photographs for a paper may be named: oppen.ps, </w:t>
-      </w:r>
-      <w:proofErr w:type="spellStart"/>
-      <w:r>
-        <w:t>moshc.tif</w:t>
-      </w:r>
-      <w:proofErr w:type="spellEnd"/>
-      <w:r>
-        <w:t xml:space="preserve">, </w:t>
-      </w:r>
-      <w:proofErr w:type="spellStart"/>
-      <w:r>
-        <w:t>chen.eps</w:t>
-      </w:r>
-      <w:proofErr w:type="spellEnd"/>
-      <w:r>
-        <w:t>, and duran.pdf.</w:t>
+        <w:t>Author photographs should be named using the first five characters of the pictured author’s last name. For example, four author photographs for a paper may be named: oppen.ps, moshc.tif, chen.eps, and duran.pdf.</w:t>
       </w:r>
     </w:p>
     <w:p>
@@ -12447,23 +11905,7 @@
         <w:pStyle w:val="PARAIndent"/>
       </w:pPr>
       <w:r>
-        <w:t xml:space="preserve">If two authors or more have the same last name, their first initial(s) can be substituted for the fifth, fourth, third... letters of their surname until the degree where there is differentiation. For example, two authors Michael and Monica Oppenheimer’s photos would be named </w:t>
-      </w:r>
-      <w:proofErr w:type="spellStart"/>
-      <w:r>
-        <w:t>oppmi.tif</w:t>
-      </w:r>
-      <w:proofErr w:type="spellEnd"/>
-      <w:r>
-        <w:t xml:space="preserve">, and </w:t>
-      </w:r>
-      <w:proofErr w:type="spellStart"/>
-      <w:r>
-        <w:t>oppmo.eps</w:t>
-      </w:r>
-      <w:proofErr w:type="spellEnd"/>
-      <w:r>
-        <w:t>.</w:t>
+        <w:t>If two authors or more have the same last name, their first initial(s) can be substituted for the fifth, fourth, third... letters of their surname until the degree where there is differentiation. For example, two authors Michael and Monica Oppenheimer’s photos would be named oppmi.tif, and oppmo.eps.</w:t>
       </w:r>
     </w:p>
     <w:p>
@@ -12570,21 +12012,7 @@
         <w:rPr>
           <w:spacing w:val="-4"/>
         </w:rPr>
-        <w:t xml:space="preserve">All IEEE Transactions, Journals, and Letters allow an author to publish </w:t>
-      </w:r>
-      <w:proofErr w:type="spellStart"/>
-      <w:r>
-        <w:rPr>
-          <w:spacing w:val="-4"/>
-        </w:rPr>
-        <w:t>color</w:t>
-      </w:r>
-      <w:proofErr w:type="spellEnd"/>
-      <w:r>
-        <w:rPr>
-          <w:spacing w:val="-4"/>
-        </w:rPr>
-        <w:t xml:space="preserve"> figures on IEEE </w:t>
+        <w:t xml:space="preserve">All IEEE Transactions, Journals, and Letters allow an author to publish color figures on IEEE </w:t>
       </w:r>
       <w:r>
         <w:rPr>
@@ -12597,35 +12025,7 @@
         <w:rPr>
           <w:spacing w:val="-4"/>
         </w:rPr>
-        <w:t xml:space="preserve">® at no charge, and automatically convert them to grayscale for print versions. In most journals, figures and tables may alternatively be printed in </w:t>
-      </w:r>
-      <w:proofErr w:type="spellStart"/>
-      <w:r>
-        <w:rPr>
-          <w:spacing w:val="-4"/>
-        </w:rPr>
-        <w:t>color</w:t>
-      </w:r>
-      <w:proofErr w:type="spellEnd"/>
-      <w:r>
-        <w:rPr>
-          <w:spacing w:val="-4"/>
-        </w:rPr>
-        <w:t xml:space="preserve"> if an author chooses to do so. Please note that this service comes at an extra expense to the author. If you intend to have print </w:t>
-      </w:r>
-      <w:proofErr w:type="spellStart"/>
-      <w:r>
-        <w:rPr>
-          <w:spacing w:val="-4"/>
-        </w:rPr>
-        <w:t>color</w:t>
-      </w:r>
-      <w:proofErr w:type="spellEnd"/>
-      <w:r>
-        <w:rPr>
-          <w:spacing w:val="-4"/>
-        </w:rPr>
-        <w:t xml:space="preserve"> graphics, include a note with your final paper indicating which figures or tables you would like to be handled that way, and stating that you are willing to pay the additional fee.</w:t>
+        <w:t>® at no charge, and automatically convert them to grayscale for print versions. In most journals, figures and tables may alternatively be printed in color if an author chooses to do so. Please note that this service comes at an extra expense to the author. If you intend to have print color graphics, include a note with your final paper indicating which figures or tables you would like to be handled that way, and stating that you are willing to pay the additional fee.</w:t>
       </w:r>
     </w:p>
     <w:p>
@@ -12761,15 +12161,7 @@
         <w:pStyle w:val="PARA"/>
       </w:pPr>
       <w:r>
-        <w:t xml:space="preserve">When your article is accepted, you can submit the final files, including figures, tables, and photos, per the journal’s guidelines through the submission system used to submit the </w:t>
-      </w:r>
-      <w:proofErr w:type="spellStart"/>
-      <w:r>
-        <w:t>articlle</w:t>
-      </w:r>
-      <w:proofErr w:type="spellEnd"/>
-      <w:r>
-        <w:t xml:space="preserve">. You may use </w:t>
+        <w:t xml:space="preserve">When your article is accepted, you can submit the final files, including figures, tables, and photos, per the journal’s guidelines through the submission system used to submit the articlle. You may use </w:t>
       </w:r>
       <w:r>
         <w:rPr>
@@ -12789,14 +12181,12 @@
       <w:r>
         <w:t xml:space="preserve">, </w:t>
       </w:r>
-      <w:proofErr w:type="spellStart"/>
       <w:r>
         <w:rPr>
           <w:i/>
         </w:rPr>
         <w:t>Pkzip</w:t>
       </w:r>
-      <w:proofErr w:type="spellEnd"/>
       <w:r>
         <w:t xml:space="preserve">, </w:t>
       </w:r>
@@ -12809,14 +12199,12 @@
       <w:r>
         <w:t xml:space="preserve">, or </w:t>
       </w:r>
-      <w:proofErr w:type="spellStart"/>
       <w:r>
         <w:rPr>
           <w:i/>
         </w:rPr>
         <w:t>Gzip</w:t>
       </w:r>
-      <w:proofErr w:type="spellEnd"/>
       <w:r>
         <w:t>.</w:t>
       </w:r>
@@ -12876,21 +12264,7 @@
         <w:rPr>
           <w:spacing w:val="0"/>
         </w:rPr>
-        <w:t xml:space="preserve">Along with other information, you will be asked to select the subject from a pull-down list. There are various steps to the submission process; you must complete all steps for a complete submission. At the end of each </w:t>
-      </w:r>
-      <w:proofErr w:type="gramStart"/>
-      <w:r>
-        <w:rPr>
-          <w:spacing w:val="0"/>
-        </w:rPr>
-        <w:t>step</w:t>
-      </w:r>
-      <w:proofErr w:type="gramEnd"/>
-      <w:r>
-        <w:rPr>
-          <w:spacing w:val="0"/>
-        </w:rPr>
-        <w:t xml:space="preserve"> you must click “Save and Continue”; just uploading the paper is not sufficient. After the last step, you should see a confirmation that the submission is complete. You should also receive an e-mail confirmation. For inquiries regarding the submission of your article, please contact ieeeaccess@ieee.org.</w:t>
+        <w:t>Along with other information, you will be asked to select the subject from a pull-down list. There are various steps to the submission process; you must complete all steps for a complete submission. At the end of each step you must click “Save and Continue”; just uploading the paper is not sufficient. After the last step, you should see a confirmation that the submission is complete. You should also receive an e-mail confirmation. For inquiries regarding the submission of your article, please contact ieeeaccess@ieee.org.</w:t>
       </w:r>
     </w:p>
     <w:p>
@@ -12961,59 +12335,31 @@
         <w:rPr>
           <w:shd w:val="clear" w:color="auto" w:fill="FFFFFF"/>
         </w:rPr>
-        <w:t>Authors must submit an electronic IEEE Copyright Form (</w:t>
-      </w:r>
-      <w:proofErr w:type="spellStart"/>
+        <w:t>Authors must submit an electronic IEEE Copyright Form (eCF) upon submitting their final manuscript files.</w:t>
+      </w:r>
       <w:r>
         <w:rPr>
           <w:shd w:val="clear" w:color="auto" w:fill="FFFFFF"/>
         </w:rPr>
-        <w:t>eCF</w:t>
-      </w:r>
-      <w:proofErr w:type="spellEnd"/>
+        <w:t xml:space="preserve"> </w:t>
+      </w:r>
       <w:r>
         <w:rPr>
           <w:shd w:val="clear" w:color="auto" w:fill="FFFFFF"/>
         </w:rPr>
-        <w:t>) upon submitting their final manuscript files.</w:t>
+        <w:t>You</w:t>
       </w:r>
       <w:r>
         <w:rPr>
           <w:shd w:val="clear" w:color="auto" w:fill="FFFFFF"/>
         </w:rPr>
-        <w:t xml:space="preserve"> </w:t>
+        <w:t xml:space="preserve"> can a</w:t>
       </w:r>
       <w:r>
         <w:rPr>
           <w:shd w:val="clear" w:color="auto" w:fill="FFFFFF"/>
         </w:rPr>
-        <w:t>You</w:t>
-      </w:r>
-      <w:r>
-        <w:rPr>
-          <w:shd w:val="clear" w:color="auto" w:fill="FFFFFF"/>
-        </w:rPr>
-        <w:t xml:space="preserve"> can a</w:t>
-      </w:r>
-      <w:r>
-        <w:rPr>
-          <w:shd w:val="clear" w:color="auto" w:fill="FFFFFF"/>
-        </w:rPr>
-        <w:t xml:space="preserve">ccess the </w:t>
-      </w:r>
-      <w:proofErr w:type="spellStart"/>
-      <w:r>
-        <w:rPr>
-          <w:shd w:val="clear" w:color="auto" w:fill="FFFFFF"/>
-        </w:rPr>
-        <w:t>eCF</w:t>
-      </w:r>
-      <w:proofErr w:type="spellEnd"/>
-      <w:r>
-        <w:rPr>
-          <w:shd w:val="clear" w:color="auto" w:fill="FFFFFF"/>
-        </w:rPr>
-        <w:t xml:space="preserve"> system through your</w:t>
+        <w:t>ccess the eCF system through your</w:t>
       </w:r>
       <w:r>
         <w:rPr>
@@ -13275,9 +12621,11 @@
           <w:i/>
           <w:iCs/>
         </w:rPr>
-        <w:t xml:space="preserve">Title of His Published Book, </w:t>
-      </w:r>
-      <w:proofErr w:type="spellStart"/>
+        <w:t>Title of His Published Book, x</w:t>
+      </w:r>
+      <w:r>
+        <w:t xml:space="preserve">th ed. City of Publisher, (only U.S. State), Country: Abbrev. of Publisher, year, ch. </w:t>
+      </w:r>
       <w:r>
         <w:rPr>
           <w:rFonts w:cs="TimesNewRomanPS-ItalicMT"/>
@@ -13287,19 +12635,7 @@
         <w:t>x</w:t>
       </w:r>
       <w:r>
-        <w:t>th</w:t>
-      </w:r>
-      <w:proofErr w:type="spellEnd"/>
-      <w:r>
-        <w:t xml:space="preserve"> ed. City of Publisher, (only U.S. State), Country: Abbrev. of Publisher, year, </w:t>
-      </w:r>
-      <w:proofErr w:type="spellStart"/>
-      <w:r>
-        <w:t>ch.</w:t>
-      </w:r>
-      <w:proofErr w:type="spellEnd"/>
-      <w:r>
-        <w:t xml:space="preserve"> </w:t>
+        <w:t xml:space="preserve">, sec. </w:t>
       </w:r>
       <w:r>
         <w:rPr>
@@ -13310,7 +12646,7 @@
         <w:t>x</w:t>
       </w:r>
       <w:r>
-        <w:t xml:space="preserve">, sec. </w:t>
+        <w:t xml:space="preserve">, pp. </w:t>
       </w:r>
       <w:r>
         <w:rPr>
@@ -13318,17 +12654,6 @@
           <w:i/>
           <w:iCs/>
         </w:rPr>
-        <w:t>x</w:t>
-      </w:r>
-      <w:r>
-        <w:t xml:space="preserve">, pp. </w:t>
-      </w:r>
-      <w:r>
-        <w:rPr>
-          <w:rFonts w:cs="TimesNewRomanPS-ItalicMT"/>
-          <w:i/>
-          <w:iCs/>
-        </w:rPr>
         <w:t>xxx–xxx.</w:t>
       </w:r>
     </w:p>
@@ -13484,21 +12809,7 @@
         <w:rPr>
           <w:lang w:eastAsia="en-IN"/>
         </w:rPr>
-        <w:t>See [3]</w:t>
-      </w:r>
-      <w:proofErr w:type="gramStart"/>
-      <w:r>
-        <w:rPr>
-          <w:lang w:eastAsia="en-IN"/>
-        </w:rPr>
-        <w:t>–[</w:t>
-      </w:r>
-      <w:proofErr w:type="gramEnd"/>
-      <w:r>
-        <w:rPr>
-          <w:lang w:eastAsia="en-IN"/>
-        </w:rPr>
-        <w:t>5].</w:t>
+        <w:t>See [3]–[5].</w:t>
       </w:r>
     </w:p>
     <w:p>
@@ -13660,7 +12971,6 @@
         </w:rPr>
         <w:t xml:space="preserve">, </w:t>
       </w:r>
-      <w:proofErr w:type="spellStart"/>
       <w:r>
         <w:rPr>
           <w:i/>
@@ -13672,42 +12982,7 @@
         <w:rPr>
           <w:lang w:eastAsia="en-IN"/>
         </w:rPr>
-        <w:t>th</w:t>
-      </w:r>
-      <w:proofErr w:type="spellEnd"/>
-      <w:r>
-        <w:rPr>
-          <w:lang w:eastAsia="en-IN"/>
-        </w:rPr>
-        <w:t xml:space="preserve"> ed. City of Publisher, </w:t>
-      </w:r>
-      <w:proofErr w:type="gramStart"/>
-      <w:r>
-        <w:rPr>
-          <w:lang w:eastAsia="en-IN"/>
-        </w:rPr>
-        <w:t>State,  Country</w:t>
-      </w:r>
-      <w:proofErr w:type="gramEnd"/>
-      <w:r>
-        <w:rPr>
-          <w:lang w:eastAsia="en-IN"/>
-        </w:rPr>
-        <w:t xml:space="preserve">: Abbrev. of Publisher, year, </w:t>
-      </w:r>
-      <w:proofErr w:type="spellStart"/>
-      <w:r>
-        <w:rPr>
-          <w:lang w:eastAsia="en-IN"/>
-        </w:rPr>
-        <w:t>ch.</w:t>
-      </w:r>
-      <w:proofErr w:type="spellEnd"/>
-      <w:r>
-        <w:rPr>
-          <w:lang w:eastAsia="en-IN"/>
-        </w:rPr>
-        <w:t xml:space="preserve"> </w:t>
+        <w:t xml:space="preserve">th ed. City of Publisher, State,  Country: Abbrev. of Publisher, year, ch. </w:t>
       </w:r>
       <w:r>
         <w:rPr>
@@ -13777,27 +13052,13 @@
         <w:rPr>
           <w:lang w:eastAsia="en-IN"/>
         </w:rPr>
-        <w:t>See [10]</w:t>
-      </w:r>
-      <w:proofErr w:type="gramStart"/>
+        <w:t>See [10]–</w:t>
+      </w:r>
       <w:r>
         <w:rPr>
           <w:lang w:eastAsia="en-IN"/>
         </w:rPr>
-        <w:t>–</w:t>
-      </w:r>
-      <w:r>
-        <w:rPr>
-          <w:lang w:eastAsia="en-IN"/>
-        </w:rPr>
-        <w:t>[</w:t>
-      </w:r>
-      <w:proofErr w:type="gramEnd"/>
-      <w:r>
-        <w:rPr>
-          <w:lang w:eastAsia="en-IN"/>
-        </w:rPr>
-        <w:t>13].</w:t>
+        <w:t>[13].</w:t>
       </w:r>
     </w:p>
     <w:p>
@@ -13928,27 +13189,13 @@
         <w:rPr>
           <w:lang w:eastAsia="en-IN"/>
         </w:rPr>
-        <w:t>4]</w:t>
-      </w:r>
-      <w:proofErr w:type="gramStart"/>
+        <w:t>4]–</w:t>
+      </w:r>
       <w:r>
         <w:rPr>
           <w:lang w:eastAsia="en-IN"/>
         </w:rPr>
-        <w:t>–</w:t>
-      </w:r>
-      <w:r>
-        <w:rPr>
-          <w:lang w:eastAsia="en-IN"/>
-        </w:rPr>
-        <w:t>[</w:t>
-      </w:r>
-      <w:proofErr w:type="gramEnd"/>
-      <w:r>
-        <w:rPr>
-          <w:lang w:eastAsia="en-IN"/>
-        </w:rPr>
-        <w:t>1</w:t>
+        <w:t>[1</w:t>
       </w:r>
       <w:r>
         <w:rPr>
@@ -14165,14 +13412,12 @@
       <w:r>
         <w:t xml:space="preserve">., City of Conf., Abbrev. State (if given), Country, year, pp. </w:t>
       </w:r>
-      <w:proofErr w:type="spellStart"/>
       <w:r>
         <w:rPr>
           <w:i/>
         </w:rPr>
         <w:t>xxxxxx</w:t>
       </w:r>
-      <w:proofErr w:type="spellEnd"/>
       <w:r>
         <w:t>.</w:t>
       </w:r>
@@ -14277,17 +13522,8 @@
           <w:rFonts w:eastAsia="NimbusRomNo9L-ReguItal"/>
           <w:i/>
         </w:rPr>
-        <w:t xml:space="preserve">x xxx </w:t>
-      </w:r>
-      <w:proofErr w:type="spellStart"/>
-      <w:r>
-        <w:rPr>
-          <w:rFonts w:eastAsia="NimbusRomNo9L-ReguItal"/>
-          <w:i/>
-        </w:rPr>
-        <w:t>xxx</w:t>
-      </w:r>
-      <w:proofErr w:type="spellEnd"/>
+        <w:t>x xxx xxx</w:t>
+      </w:r>
       <w:r>
         <w:rPr>
           <w:rFonts w:eastAsia="CMSY7"/>
@@ -14463,30 +13699,110 @@
           <w:rFonts w:eastAsia="CMSY7"/>
           <w:lang w:eastAsia="en-IN"/>
         </w:rPr>
-        <w:t>See [27]</w:t>
-      </w:r>
-      <w:proofErr w:type="gramStart"/>
+        <w:t>See [27]–</w:t>
+      </w:r>
       <w:r>
         <w:rPr>
           <w:rFonts w:eastAsia="CMSY7"/>
           <w:lang w:eastAsia="en-IN"/>
         </w:rPr>
-        <w:t>–</w:t>
-      </w:r>
+        <w:t>[29].</w:t>
+      </w:r>
+    </w:p>
+    <w:p>
+      <w:pPr>
+        <w:pStyle w:val="REFBUL"/>
+      </w:pPr>
+      <w:r>
+        <w:rPr>
+          <w:rFonts w:eastAsia="NimbusRomNo9L-ReguItal"/>
+          <w:lang w:eastAsia="en-IN"/>
+        </w:rPr>
+        <w:t>Basic formats for standards:</w:t>
+      </w:r>
+    </w:p>
+    <w:p>
+      <w:pPr>
+        <w:pStyle w:val="REFTxt"/>
+        <w:ind w:left="960" w:hanging="240"/>
+      </w:pPr>
+      <w:r>
+        <w:t>1)</w:t>
+      </w:r>
+      <w:r>
+        <w:tab/>
+      </w:r>
+      <w:r>
+        <w:rPr>
+          <w:i/>
+        </w:rPr>
+        <w:t>Title of Standard</w:t>
+      </w:r>
+      <w:r>
+        <w:t>, Standard number, date.</w:t>
+      </w:r>
+    </w:p>
+    <w:p>
+      <w:pPr>
+        <w:pStyle w:val="REFTxt"/>
+        <w:ind w:left="960" w:hanging="240"/>
+      </w:pPr>
+      <w:r>
+        <w:t>2)</w:t>
+      </w:r>
+      <w:r>
+        <w:tab/>
+      </w:r>
+      <w:r>
+        <w:rPr>
+          <w:i/>
+        </w:rPr>
+        <w:t>Title of Standard</w:t>
+      </w:r>
+      <w:r>
+        <w:t>, Standard number, Corporate author, location, date.</w:t>
+      </w:r>
+    </w:p>
+    <w:p>
+      <w:pPr>
+        <w:pStyle w:val="REFTxt"/>
+        <w:rPr>
+          <w:lang w:eastAsia="en-IN"/>
+        </w:rPr>
+      </w:pPr>
       <w:r>
         <w:rPr>
           <w:rFonts w:eastAsia="CMSY7"/>
           <w:lang w:eastAsia="en-IN"/>
         </w:rPr>
-        <w:t>[</w:t>
-      </w:r>
-      <w:proofErr w:type="gramEnd"/>
+        <w:t>See [30], [31].</w:t>
+      </w:r>
+    </w:p>
+    <w:p>
+      <w:pPr>
+        <w:pStyle w:val="REFBUL"/>
+      </w:pPr>
+      <w:r>
+        <w:rPr>
+          <w:rFonts w:eastAsia="NimbusRomNo9L-ReguItal"/>
+          <w:lang w:eastAsia="en-IN"/>
+        </w:rPr>
+        <w:t>Article number in reference examples:</w:t>
+      </w:r>
+    </w:p>
+    <w:p>
+      <w:pPr>
+        <w:pStyle w:val="REFTxt"/>
+        <w:rPr>
+          <w:lang w:eastAsia="en-IN"/>
+        </w:rPr>
+      </w:pPr>
       <w:r>
         <w:rPr>
           <w:rFonts w:eastAsia="CMSY7"/>
           <w:lang w:eastAsia="en-IN"/>
         </w:rPr>
-        <w:t>29].</w:t>
+        <w:t>See [32], [33].</w:t>
       </w:r>
     </w:p>
     <w:p>
@@ -14498,57 +13814,7 @@
           <w:rFonts w:eastAsia="NimbusRomNo9L-ReguItal"/>
           <w:lang w:eastAsia="en-IN"/>
         </w:rPr>
-        <w:t>Basic formats for standards:</w:t>
-      </w:r>
-    </w:p>
-    <w:p>
-      <w:pPr>
-        <w:pStyle w:val="REFTxt"/>
-        <w:ind w:left="960" w:hanging="240"/>
-      </w:pPr>
-      <w:r>
-        <w:t>1)</w:t>
-      </w:r>
-      <w:r>
-        <w:tab/>
-      </w:r>
-      <w:r>
-        <w:rPr>
-          <w:i/>
-        </w:rPr>
-        <w:t>Title of Standard</w:t>
-      </w:r>
-      <w:r>
-        <w:t>, Standard number, date.</w:t>
-      </w:r>
-    </w:p>
-    <w:p>
-      <w:pPr>
-        <w:pStyle w:val="REFTxt"/>
-        <w:ind w:left="960" w:hanging="240"/>
-      </w:pPr>
-      <w:r>
-        <w:t>2)</w:t>
-      </w:r>
-      <w:r>
-        <w:tab/>
-      </w:r>
-      <w:r>
-        <w:rPr>
-          <w:i/>
-        </w:rPr>
-        <w:t>Title of Standard</w:t>
-      </w:r>
-      <w:r>
-        <w:t xml:space="preserve">, Standard number, </w:t>
-      </w:r>
-      <w:proofErr w:type="gramStart"/>
-      <w:r>
-        <w:t>Corporate</w:t>
-      </w:r>
-      <w:proofErr w:type="gramEnd"/>
-      <w:r>
-        <w:t xml:space="preserve"> author, location, date.</w:t>
+        <w:t>Example when using et al.:</w:t>
       </w:r>
     </w:p>
     <w:p>
@@ -14563,60 +13829,6 @@
           <w:rFonts w:eastAsia="CMSY7"/>
           <w:lang w:eastAsia="en-IN"/>
         </w:rPr>
-        <w:t>See [30], [31].</w:t>
-      </w:r>
-    </w:p>
-    <w:p>
-      <w:pPr>
-        <w:pStyle w:val="REFBUL"/>
-      </w:pPr>
-      <w:r>
-        <w:rPr>
-          <w:rFonts w:eastAsia="NimbusRomNo9L-ReguItal"/>
-          <w:lang w:eastAsia="en-IN"/>
-        </w:rPr>
-        <w:t>Article number in reference examples:</w:t>
-      </w:r>
-    </w:p>
-    <w:p>
-      <w:pPr>
-        <w:pStyle w:val="REFTxt"/>
-        <w:rPr>
-          <w:lang w:eastAsia="en-IN"/>
-        </w:rPr>
-      </w:pPr>
-      <w:r>
-        <w:rPr>
-          <w:rFonts w:eastAsia="CMSY7"/>
-          <w:lang w:eastAsia="en-IN"/>
-        </w:rPr>
-        <w:t>See [32], [33].</w:t>
-      </w:r>
-    </w:p>
-    <w:p>
-      <w:pPr>
-        <w:pStyle w:val="REFBUL"/>
-      </w:pPr>
-      <w:r>
-        <w:rPr>
-          <w:rFonts w:eastAsia="NimbusRomNo9L-ReguItal"/>
-          <w:lang w:eastAsia="en-IN"/>
-        </w:rPr>
-        <w:t>Example when using et al.:</w:t>
-      </w:r>
-    </w:p>
-    <w:p>
-      <w:pPr>
-        <w:pStyle w:val="REFTxt"/>
-        <w:rPr>
-          <w:lang w:eastAsia="en-IN"/>
-        </w:rPr>
-      </w:pPr>
-      <w:r>
-        <w:rPr>
-          <w:rFonts w:eastAsia="CMSY7"/>
-          <w:lang w:eastAsia="en-IN"/>
-        </w:rPr>
         <w:t>See [34].</w:t>
       </w:r>
     </w:p>
@@ -14637,23 +13849,7 @@
         </w:rPr>
       </w:pPr>
       <w:r>
-        <w:t xml:space="preserve">The preferred spelling of the word “acknowledgment” in American English is without an “e” after the “g.” Use the singular heading even if you have many acknowledgments. Avoid expressions such as “One of us (S.B.A.) would like to thank </w:t>
-      </w:r>
-      <w:proofErr w:type="gramStart"/>
-      <w:r>
-        <w:t>. . . .</w:t>
-      </w:r>
-      <w:proofErr w:type="gramEnd"/>
-      <w:r>
-        <w:t xml:space="preserve">” Instead, write “F. A. Author thanks </w:t>
-      </w:r>
-      <w:proofErr w:type="gramStart"/>
-      <w:r>
-        <w:t>. . . .</w:t>
-      </w:r>
-      <w:proofErr w:type="gramEnd"/>
-      <w:r>
-        <w:t>” In most cases, sponsor and financial support acknowledgments are placed in the unnumbered footnote on the first page, not here.</w:t>
+        <w:t>The preferred spelling of the word “acknowledgment” in American English is without an “e” after the “g.” Use the singular heading even if you have many acknowledgments. Avoid expressions such as “One of us (S.B.A.) would like to thank . . . .” Instead, write “F. A. Author thanks . . . .” In most cases, sponsor and financial support acknowledgments are placed in the unnumbered footnote on the first page, not here.</w:t>
       </w:r>
     </w:p>
     <w:p>
@@ -14761,51 +13957,50 @@
           <w:rFonts w:eastAsia="NimbusRomNo9L-ReguItal"/>
           <w:i/>
         </w:rPr>
-        <w:t xml:space="preserve">IEEE Trans. Antennas </w:t>
-      </w:r>
-      <w:proofErr w:type="spellStart"/>
+        <w:t>IEEE Trans. Antennas Propagat</w:t>
+      </w:r>
+      <w:r>
+        <w:t>., to be published.</w:t>
+      </w:r>
+    </w:p>
+    <w:p>
+      <w:pPr>
+        <w:pStyle w:val="References"/>
+      </w:pPr>
+      <w:r>
+        <w:t>E. E. Reber, R. L. Michell, and C. J. Carter, “Oxygen absorption in the earth’s atmosphere,” Aerospace Corp., Los Angeles, CA, USA, Tech. Rep. TR-0200 (4230-46)-3, Nov. 1988.</w:t>
+      </w:r>
+    </w:p>
+    <w:p>
+      <w:pPr>
+        <w:pStyle w:val="References"/>
+      </w:pPr>
+      <w:r>
+        <w:t>J. H. Davis and J. R. Cogdell, “Calibration program for the 16-foot antenna,” Elect. Eng. Res. Lab., Univ. Texas, Austin, TX, USA, Tech. Memo. NGL-006-69-3, Nov. 15, 1987.</w:t>
+      </w:r>
+    </w:p>
+    <w:p>
+      <w:pPr>
+        <w:pStyle w:val="References"/>
+      </w:pPr>
       <w:r>
         <w:rPr>
           <w:rFonts w:eastAsia="NimbusRomNo9L-ReguItal"/>
           <w:i/>
         </w:rPr>
-        <w:t>Propagat</w:t>
-      </w:r>
-      <w:proofErr w:type="spellEnd"/>
-      <w:r>
-        <w:t>., to be published.</w:t>
-      </w:r>
-    </w:p>
-    <w:p>
-      <w:pPr>
-        <w:pStyle w:val="References"/>
-      </w:pPr>
-      <w:r>
-        <w:t xml:space="preserve">E. E. </w:t>
-      </w:r>
-      <w:proofErr w:type="spellStart"/>
-      <w:r>
-        <w:t>Reber</w:t>
-      </w:r>
-      <w:proofErr w:type="spellEnd"/>
-      <w:r>
-        <w:t>, R. L. Michell, and C. J. Carter, “Oxygen absorption in the earth’s atmosphere,” Aerospace Corp., Los Angeles, CA, USA, Tech. Rep. TR-0200 (4230-46)-3, Nov. 1988.</w:t>
-      </w:r>
-    </w:p>
-    <w:p>
-      <w:pPr>
-        <w:pStyle w:val="References"/>
-      </w:pPr>
-      <w:r>
-        <w:t xml:space="preserve">J. H. Davis and J. R. </w:t>
-      </w:r>
-      <w:proofErr w:type="spellStart"/>
-      <w:r>
-        <w:t>Cogdell</w:t>
-      </w:r>
-      <w:proofErr w:type="spellEnd"/>
-      <w:r>
-        <w:t>, “Calibration program for the 16-foot antenna,” Elect. Eng. Res. Lab., Univ. Texas, Austin, TX, USA, Tech. Memo. NGL-006-69-3, Nov. 15, 1987.</w:t>
+        <w:t>Transmission Systems for Communications</w:t>
+      </w:r>
+      <w:r>
+        <w:t>, 3</w:t>
+      </w:r>
+      <w:r>
+        <w:rPr>
+          <w:vertAlign w:val="superscript"/>
+        </w:rPr>
+        <w:t xml:space="preserve">rd </w:t>
+      </w:r>
+      <w:r>
+        <w:t>ed., Western Electric Co., Winston-Salem, NC, USA, 1985, pp. 44–60.</w:t>
       </w:r>
     </w:p>
     <w:p>
@@ -14817,19 +14012,36 @@
           <w:rFonts w:eastAsia="NimbusRomNo9L-ReguItal"/>
           <w:i/>
         </w:rPr>
-        <w:t>Transmission Systems for Communications</w:t>
-      </w:r>
-      <w:r>
-        <w:t>, 3</w:t>
+        <w:t>Motorola Semiconductor Data Manual</w:t>
+      </w:r>
+      <w:r>
+        <w:t>, Motorola Semiconductor Products Inc., Phoenix, AZ, USA, 1989.</w:t>
+      </w:r>
+    </w:p>
+    <w:p>
+      <w:pPr>
+        <w:pStyle w:val="References"/>
+      </w:pPr>
+      <w:r>
+        <w:t>G. O. Young, “Synthetic structure of industrial plastics,” in Plastics, vol. 3, Polymers of Hexadromicon, J. Peters, Ed., 2</w:t>
       </w:r>
       <w:r>
         <w:rPr>
           <w:vertAlign w:val="superscript"/>
         </w:rPr>
-        <w:t xml:space="preserve">rd </w:t>
-      </w:r>
-      <w:r>
-        <w:t>ed., Western Electric Co., Winston-Salem, NC, USA, 1985, pp. 44–60.</w:t>
+        <w:t xml:space="preserve">nd </w:t>
+      </w:r>
+      <w:r>
+        <w:t xml:space="preserve">ed. New York, NY, USA: McGraw-Hill, 1964, pp. 15-64. [Online]. Available: </w:t>
+      </w:r>
+      <w:r>
+        <w:rPr>
+          <w:u w:val="single"/>
+        </w:rPr>
+        <w:t>http://www.bookref.com</w:t>
+      </w:r>
+      <w:r>
+        <w:t>.</w:t>
       </w:r>
     </w:p>
     <w:p>
@@ -14841,10 +14053,16 @@
           <w:rFonts w:eastAsia="NimbusRomNo9L-ReguItal"/>
           <w:i/>
         </w:rPr>
-        <w:t>Motorola Semiconductor Data Manual</w:t>
-      </w:r>
-      <w:r>
-        <w:t>, Motorola Semiconductor Products Inc., Phoenix, AZ, USA, 1989.</w:t>
+        <w:t>The Founders’ Constitution</w:t>
+      </w:r>
+      <w:r>
+        <w:t xml:space="preserve">, Philip B. Kurland and Ralph Lerner, eds., Chicago, IL, USA: Univ. Chicago Press, 1987. [Online]. Available: </w:t>
+      </w:r>
+      <w:r>
+        <w:rPr>
+          <w:u w:val="single"/>
+        </w:rPr>
+        <w:t>http://press-pubs.uchicago.edu/founders/</w:t>
       </w:r>
     </w:p>
     <w:p>
@@ -14852,48 +14070,34 @@
         <w:pStyle w:val="References"/>
       </w:pPr>
       <w:r>
-        <w:t xml:space="preserve">G. O. Young, “Synthetic structure of industrial plastics,” in Plastics, vol. 3, Polymers of </w:t>
-      </w:r>
-      <w:proofErr w:type="spellStart"/>
-      <w:r>
-        <w:t>Hexadromicon</w:t>
-      </w:r>
-      <w:proofErr w:type="spellEnd"/>
-      <w:r>
-        <w:t>, J. Peters, Ed., 2</w:t>
-      </w:r>
-      <w:r>
-        <w:rPr>
-          <w:vertAlign w:val="superscript"/>
-        </w:rPr>
-        <w:t xml:space="preserve">nd </w:t>
-      </w:r>
-      <w:r>
-        <w:t xml:space="preserve">ed. New York, NY, USA: McGraw-Hill, 1964, pp. 15-64. [Online]. Available: </w:t>
+        <w:t xml:space="preserve">The Terahertz Wave eBook. ZOmega Terahertz Corp., 2014. [Online]. Available: </w:t>
       </w:r>
       <w:r>
         <w:rPr>
           <w:u w:val="single"/>
         </w:rPr>
-        <w:t>http://www.bookref.com</w:t>
-      </w:r>
-      <w:r>
-        <w:t>.</w:t>
+        <w:t>http://dl.z-thz.com/eBook/zomega_ebook_pdf_1206_sr.pdf</w:t>
+      </w:r>
+      <w:r>
+        <w:t>. Accessed on: May 19, 2014.</w:t>
       </w:r>
     </w:p>
     <w:p>
       <w:pPr>
         <w:pStyle w:val="References"/>
       </w:pPr>
+      <w:r>
+        <w:t xml:space="preserve">Philip B. Kurland and Ralph Lerner, eds., </w:t>
+      </w:r>
       <w:r>
         <w:rPr>
           <w:rFonts w:eastAsia="NimbusRomNo9L-ReguItal"/>
           <w:i/>
         </w:rPr>
-        <w:t>The Founders’ Constitution</w:t>
-      </w:r>
-      <w:r>
-        <w:t xml:space="preserve">, Philip B. Kurland and Ralph Lerner, eds., Chicago, IL, USA: Univ. Chicago Press, 1987. [Online]. Available: </w:t>
+        <w:t xml:space="preserve">The Founders’ Constitution. </w:t>
+      </w:r>
+      <w:r>
+        <w:t xml:space="preserve">Chicago, IL, USA: Univ. of Chicago Press, 1987, Accessed on: Feb. 28, 2010, [Online] Available: </w:t>
       </w:r>
       <w:r>
         <w:rPr>
@@ -14907,48 +14111,17 @@
         <w:pStyle w:val="References"/>
       </w:pPr>
       <w:r>
-        <w:t xml:space="preserve">The Terahertz Wave eBook. </w:t>
-      </w:r>
-      <w:proofErr w:type="spellStart"/>
-      <w:r>
-        <w:t>ZOmega</w:t>
-      </w:r>
-      <w:proofErr w:type="spellEnd"/>
-      <w:r>
-        <w:t xml:space="preserve"> Terahertz Corp., 2014. [Online]. Available: </w:t>
-      </w:r>
-      <w:r>
-        <w:rPr>
-          <w:u w:val="single"/>
-        </w:rPr>
-        <w:t>http://dl.z-thz.com/eBook/zomega_ebook_pdf_1206_sr.pdf</w:t>
-      </w:r>
-      <w:r>
-        <w:t>. Accessed on: May 19, 2014.</w:t>
-      </w:r>
-    </w:p>
-    <w:p>
-      <w:pPr>
-        <w:pStyle w:val="References"/>
-      </w:pPr>
-      <w:r>
-        <w:t xml:space="preserve">Philip B. Kurland and Ralph Lerner, eds., </w:t>
+        <w:t xml:space="preserve">J. S. Turner, “New directions in communications,” </w:t>
       </w:r>
       <w:r>
         <w:rPr>
           <w:rFonts w:eastAsia="NimbusRomNo9L-ReguItal"/>
           <w:i/>
         </w:rPr>
-        <w:t xml:space="preserve">The Founders’ Constitution. </w:t>
-      </w:r>
-      <w:r>
-        <w:t xml:space="preserve">Chicago, IL, USA: Univ. of Chicago Press, 1987, Accessed on: Feb. 28, 2010, [Online] Available: </w:t>
-      </w:r>
-      <w:r>
-        <w:rPr>
-          <w:u w:val="single"/>
-        </w:rPr>
-        <w:t>http://press-pubs.uchicago.edu/founders/</w:t>
+        <w:t>IEEE J. Sel. Areas Commun</w:t>
+      </w:r>
+      <w:r>
+        <w:t>., vol. 13, no. 1, pp. 11-23, Jan. 1995.</w:t>
       </w:r>
     </w:p>
     <w:p>
@@ -14956,44 +14129,45 @@
         <w:pStyle w:val="References"/>
       </w:pPr>
       <w:r>
-        <w:t xml:space="preserve">J. S. Turner, “New directions in communications,” </w:t>
+        <w:t xml:space="preserve">W. P. Risk, G. S. Kino, and H. J. Shaw, “Fiber-optic frequency shifter using a surface acoustic wave incident at an oblique angle,” </w:t>
       </w:r>
       <w:r>
         <w:rPr>
           <w:rFonts w:eastAsia="NimbusRomNo9L-ReguItal"/>
           <w:i/>
         </w:rPr>
-        <w:t xml:space="preserve">IEEE J. Sel. Areas </w:t>
-      </w:r>
-      <w:proofErr w:type="spellStart"/>
+        <w:t>Opt. Lett.</w:t>
+      </w:r>
+      <w:r>
+        <w:t>, vol. 11, no. 2, pp. 115–117, Feb. 1986.</w:t>
+      </w:r>
+    </w:p>
+    <w:p>
+      <w:pPr>
+        <w:pStyle w:val="References"/>
+      </w:pPr>
+      <w:r>
+        <w:t xml:space="preserve">P. Kopyt </w:t>
+      </w:r>
       <w:r>
         <w:rPr>
           <w:rFonts w:eastAsia="NimbusRomNo9L-ReguItal"/>
           <w:i/>
         </w:rPr>
-        <w:t>Commun</w:t>
-      </w:r>
-      <w:proofErr w:type="spellEnd"/>
-      <w:r>
-        <w:t>., vol. 13, no. 1, pp. 11-23, Jan. 1995.</w:t>
-      </w:r>
-    </w:p>
-    <w:p>
-      <w:pPr>
-        <w:pStyle w:val="References"/>
-      </w:pPr>
-      <w:r>
-        <w:t xml:space="preserve">W. P. Risk, G. S. Kino, and H. J. Shaw, “Fiber-optic frequency shifter using a surface acoustic wave incident at an oblique angle,” </w:t>
+        <w:t>et al., “</w:t>
+      </w:r>
+      <w:r>
+        <w:t xml:space="preserve">Electric properties of graphene-based conductive layers from DC up to terahertz range,” </w:t>
       </w:r>
       <w:r>
         <w:rPr>
           <w:rFonts w:eastAsia="NimbusRomNo9L-ReguItal"/>
           <w:i/>
         </w:rPr>
-        <w:t>Opt. Lett.</w:t>
-      </w:r>
-      <w:r>
-        <w:t>, vol. 11, no. 2, pp. 115–117, Feb. 1986.</w:t>
+        <w:t xml:space="preserve">IEEE THz Sci. Technol., </w:t>
+      </w:r>
+      <w:r>
+        <w:t>to be published. DOI: 10.1109/TTHZ.2016.2544142.</w:t>
       </w:r>
     </w:p>
     <w:p>
@@ -15001,35 +14175,127 @@
         <w:pStyle w:val="References"/>
       </w:pPr>
       <w:r>
-        <w:t xml:space="preserve">P. </w:t>
-      </w:r>
-      <w:proofErr w:type="spellStart"/>
-      <w:r>
-        <w:t>Kopyt</w:t>
-      </w:r>
-      <w:proofErr w:type="spellEnd"/>
-      <w:r>
-        <w:t xml:space="preserve"> </w:t>
+        <w:t xml:space="preserve">PROCESS Corporation, Boston, MA, USA. Intranets: Internet technologies deployed behind the firewall for corporate productivity. Presented at INET96 Annual Meeting. [Online]. Available: </w:t>
+      </w:r>
+      <w:r>
+        <w:rPr>
+          <w:u w:val="single"/>
+        </w:rPr>
+        <w:t>http://home.process.com/Intranets/wp2.htp</w:t>
+      </w:r>
+    </w:p>
+    <w:p>
+      <w:pPr>
+        <w:pStyle w:val="References"/>
+        <w:rPr>
+          <w:spacing w:val="2"/>
+        </w:rPr>
+      </w:pPr>
+      <w:r>
+        <w:rPr>
+          <w:spacing w:val="2"/>
+        </w:rPr>
+        <w:t xml:space="preserve">R. J. Hijmans and J. van Etten, “Raster: Geographic analysis and modeling with raster data,” R Package Version 2.0-12, Jan. 12, 2012. [Online]. Available: </w:t>
+      </w:r>
+      <w:r>
+        <w:rPr>
+          <w:spacing w:val="2"/>
+          <w:u w:val="single"/>
+        </w:rPr>
+        <w:t>http://CRAN.R-project.org/package=</w:t>
+      </w:r>
+      <w:r>
+        <w:rPr>
+          <w:spacing w:val="2"/>
+          <w:u w:val="single"/>
+        </w:rPr>
+        <w:br/>
+      </w:r>
+      <w:r>
+        <w:rPr>
+          <w:spacing w:val="2"/>
+          <w:u w:val="single"/>
+        </w:rPr>
+        <w:t>raster</w:t>
+      </w:r>
+    </w:p>
+    <w:p>
+      <w:pPr>
+        <w:pStyle w:val="References"/>
+      </w:pPr>
+      <w:r>
+        <w:t xml:space="preserve">Teralyzer. Lytera UG, Kirchhain, Germany [Online]. Available: </w:t>
+      </w:r>
+      <w:r>
+        <w:rPr>
+          <w:u w:val="single"/>
+        </w:rPr>
+        <w:t>http://www.lytera.de/Terahertz_THz_Spectroscopy.php?id=home</w:t>
+      </w:r>
+      <w:r>
+        <w:t>, Accessed on: Jun. 5, 2014</w:t>
+      </w:r>
+    </w:p>
+    <w:p>
+      <w:pPr>
+        <w:pStyle w:val="References"/>
+      </w:pPr>
+      <w:r>
+        <w:t>U.S. House. 102</w:t>
+      </w:r>
+      <w:r>
+        <w:rPr>
+          <w:vertAlign w:val="superscript"/>
+        </w:rPr>
+        <w:t xml:space="preserve">nd </w:t>
+      </w:r>
+      <w:r>
+        <w:t>Congress, 1</w:t>
+      </w:r>
+      <w:r>
+        <w:rPr>
+          <w:vertAlign w:val="superscript"/>
+        </w:rPr>
+        <w:t xml:space="preserve">st </w:t>
+      </w:r>
+      <w:r>
+        <w:t xml:space="preserve">Session. (1991, Jan. 11). </w:t>
       </w:r>
       <w:r>
         <w:rPr>
           <w:rFonts w:eastAsia="NimbusRomNo9L-ReguItal"/>
           <w:i/>
         </w:rPr>
-        <w:t>et al., “</w:t>
-      </w:r>
-      <w:r>
-        <w:t xml:space="preserve">Electric properties of graphene-based conductive layers from DC up to terahertz range,” </w:t>
+        <w:t>H. Con. Res. 1, Sense of the Congress on Approval of Military Action</w:t>
+      </w:r>
+      <w:r>
+        <w:t>. [Online]. Available: LEXIS Library: GENFED File: BILLS</w:t>
+      </w:r>
+    </w:p>
+    <w:p>
+      <w:pPr>
+        <w:pStyle w:val="References"/>
+      </w:pPr>
+      <w:r>
+        <w:t>Musical toothbrush with mirror, by L.M.R. Brooks. (1992, May 19). Patent D 326 189 [Online]. Available: NEXIS Library: LEXPAT File: DES</w:t>
+      </w:r>
+    </w:p>
+    <w:p>
+      <w:pPr>
+        <w:pStyle w:val="References"/>
+      </w:pPr>
+      <w:r>
+        <w:t xml:space="preserve">D. B. Payne and J. R. Stern, “Wavelength-switched pas- sively coupled single-mode optical network,” in </w:t>
       </w:r>
       <w:r>
         <w:rPr>
           <w:rFonts w:eastAsia="NimbusRomNo9L-ReguItal"/>
           <w:i/>
         </w:rPr>
-        <w:t xml:space="preserve">IEEE THz Sci. Technol., </w:t>
-      </w:r>
-      <w:r>
-        <w:t>to be published. DOI: 10.1109/TTHZ.2016.2544142.</w:t>
+        <w:t xml:space="preserve">Proc. IOOC-ECOC, </w:t>
+      </w:r>
+      <w:r>
+        <w:t>Boston, MA, USA, 1985, pp. 585–590.</w:t>
       </w:r>
     </w:p>
     <w:p>
@@ -15037,200 +14303,7 @@
         <w:pStyle w:val="References"/>
       </w:pPr>
       <w:r>
-        <w:t xml:space="preserve">PROCESS Corporation, Boston, MA, USA. Intranets: Internet technologies deployed behind the firewall for corporate productivity. Presented at INET96 Annual Meeting. [Online]. Available: </w:t>
-      </w:r>
-      <w:r>
-        <w:rPr>
-          <w:u w:val="single"/>
-        </w:rPr>
-        <w:t>http://home.process.com/Intranets/wp2.htp</w:t>
-      </w:r>
-    </w:p>
-    <w:p>
-      <w:pPr>
-        <w:pStyle w:val="References"/>
-        <w:rPr>
-          <w:spacing w:val="2"/>
-        </w:rPr>
-      </w:pPr>
-      <w:r>
-        <w:rPr>
-          <w:spacing w:val="2"/>
-        </w:rPr>
-        <w:t xml:space="preserve">R. J. </w:t>
-      </w:r>
-      <w:proofErr w:type="spellStart"/>
-      <w:r>
-        <w:rPr>
-          <w:spacing w:val="2"/>
-        </w:rPr>
-        <w:t>Hijmans</w:t>
-      </w:r>
-      <w:proofErr w:type="spellEnd"/>
-      <w:r>
-        <w:rPr>
-          <w:spacing w:val="2"/>
-        </w:rPr>
-        <w:t xml:space="preserve"> and J. van Etten, “Raster: Geographic analysis and </w:t>
-      </w:r>
-      <w:proofErr w:type="spellStart"/>
-      <w:r>
-        <w:rPr>
-          <w:spacing w:val="2"/>
-        </w:rPr>
-        <w:t>modeling</w:t>
-      </w:r>
-      <w:proofErr w:type="spellEnd"/>
-      <w:r>
-        <w:rPr>
-          <w:spacing w:val="2"/>
-        </w:rPr>
-        <w:t xml:space="preserve"> with raster data,” R Package Version 2.0-12, Jan. 12, 2012. [Online]. Available: </w:t>
-      </w:r>
-      <w:r>
-        <w:rPr>
-          <w:spacing w:val="2"/>
-          <w:u w:val="single"/>
-        </w:rPr>
-        <w:t>http://CRAN.R-project.org/package=</w:t>
-      </w:r>
-      <w:r>
-        <w:rPr>
-          <w:spacing w:val="2"/>
-          <w:u w:val="single"/>
-        </w:rPr>
-        <w:br/>
-      </w:r>
-      <w:r>
-        <w:rPr>
-          <w:spacing w:val="2"/>
-          <w:u w:val="single"/>
-        </w:rPr>
-        <w:t>raster</w:t>
-      </w:r>
-    </w:p>
-    <w:p>
-      <w:pPr>
-        <w:pStyle w:val="References"/>
-      </w:pPr>
-      <w:proofErr w:type="spellStart"/>
-      <w:r>
-        <w:t>Teralyzer</w:t>
-      </w:r>
-      <w:proofErr w:type="spellEnd"/>
-      <w:r>
-        <w:t xml:space="preserve">. </w:t>
-      </w:r>
-      <w:proofErr w:type="spellStart"/>
-      <w:r>
-        <w:t>Lytera</w:t>
-      </w:r>
-      <w:proofErr w:type="spellEnd"/>
-      <w:r>
-        <w:t xml:space="preserve"> UG, </w:t>
-      </w:r>
-      <w:proofErr w:type="spellStart"/>
-      <w:r>
-        <w:t>Kirchhain</w:t>
-      </w:r>
-      <w:proofErr w:type="spellEnd"/>
-      <w:r>
-        <w:t xml:space="preserve">, Germany [Online]. Available: </w:t>
-      </w:r>
-      <w:r>
-        <w:rPr>
-          <w:u w:val="single"/>
-        </w:rPr>
-        <w:t>http://www.lytera.de/Terahertz_THz_Spectroscopy.php?id=home</w:t>
-      </w:r>
-      <w:r>
-        <w:t>, Accessed on: Jun. 5, 2014</w:t>
-      </w:r>
-    </w:p>
-    <w:p>
-      <w:pPr>
-        <w:pStyle w:val="References"/>
-      </w:pPr>
-      <w:r>
-        <w:t>U.S. House. 102</w:t>
-      </w:r>
-      <w:r>
-        <w:rPr>
-          <w:vertAlign w:val="superscript"/>
-        </w:rPr>
-        <w:t xml:space="preserve">nd </w:t>
-      </w:r>
-      <w:r>
-        <w:t>Congress, 1</w:t>
-      </w:r>
-      <w:r>
-        <w:rPr>
-          <w:vertAlign w:val="superscript"/>
-        </w:rPr>
-        <w:t xml:space="preserve">st </w:t>
-      </w:r>
-      <w:r>
-        <w:t xml:space="preserve">Session. (1991, Jan. 11). </w:t>
-      </w:r>
-      <w:r>
-        <w:rPr>
-          <w:rFonts w:eastAsia="NimbusRomNo9L-ReguItal"/>
-          <w:i/>
-        </w:rPr>
-        <w:t>H. Con. Res. 1, Sense of the Congress on Approval of Military Action</w:t>
-      </w:r>
-      <w:r>
-        <w:t>. [Online]. Available: LEXIS Library: GENFED File: BILLS</w:t>
-      </w:r>
-    </w:p>
-    <w:p>
-      <w:pPr>
-        <w:pStyle w:val="References"/>
-      </w:pPr>
-      <w:r>
-        <w:t>Musical toothbrush with mirror, by L.M.R. Brooks. (1992, May 19). Patent D 326 189 [Online]. Available: NEXIS Library: LEXPAT File: DES</w:t>
-      </w:r>
-    </w:p>
-    <w:p>
-      <w:pPr>
-        <w:pStyle w:val="References"/>
-      </w:pPr>
-      <w:r>
-        <w:t xml:space="preserve">D. B. Payne and J. R. Stern, “Wavelength-switched pas- </w:t>
-      </w:r>
-      <w:proofErr w:type="spellStart"/>
-      <w:r>
-        <w:t>sively</w:t>
-      </w:r>
-      <w:proofErr w:type="spellEnd"/>
-      <w:r>
-        <w:t xml:space="preserve"> coupled single-mode optical network,” in </w:t>
-      </w:r>
-      <w:r>
-        <w:rPr>
-          <w:rFonts w:eastAsia="NimbusRomNo9L-ReguItal"/>
-          <w:i/>
-        </w:rPr>
-        <w:t xml:space="preserve">Proc. IOOC-ECOC, </w:t>
-      </w:r>
-      <w:r>
-        <w:t>Boston, MA, USA, 1985, pp. 585–590.</w:t>
-      </w:r>
-    </w:p>
-    <w:p>
-      <w:pPr>
-        <w:pStyle w:val="References"/>
-      </w:pPr>
-      <w:r>
-        <w:t xml:space="preserve">D. </w:t>
-      </w:r>
-      <w:proofErr w:type="spellStart"/>
-      <w:r>
-        <w:t>Ebehard</w:t>
-      </w:r>
-      <w:proofErr w:type="spellEnd"/>
-      <w:r>
-        <w:t xml:space="preserve"> and E. Voges, “Digital single sideband detection for interferometric sensors,” presented at the </w:t>
+        <w:t xml:space="preserve">D. Ebehard and E. Voges, “Digital single sideband detection for interferometric sensors,” presented at the </w:t>
       </w:r>
       <w:r>
         <w:rPr>
@@ -15269,15 +14342,7 @@
         <w:pStyle w:val="References"/>
       </w:pPr>
       <w:r>
-        <w:t xml:space="preserve">G. </w:t>
-      </w:r>
-      <w:proofErr w:type="spellStart"/>
-      <w:r>
-        <w:t>Brandli</w:t>
-      </w:r>
-      <w:proofErr w:type="spellEnd"/>
-      <w:r>
-        <w:t xml:space="preserve"> and M. Dick, “Alternating current fed power supply,” U.S. Patent 4 084 217, Nov. 4, 1978.</w:t>
+        <w:t>G. Brandli and M. Dick, “Alternating current fed power supply,” U.S. Patent 4 084 217, Nov. 4, 1978.</w:t>
       </w:r>
     </w:p>
     <w:p>
@@ -15285,15 +14350,7 @@
         <w:pStyle w:val="References"/>
       </w:pPr>
       <w:r>
-        <w:t xml:space="preserve">J. O. Williams, “Narrow-band </w:t>
-      </w:r>
-      <w:proofErr w:type="spellStart"/>
-      <w:r>
-        <w:t>analyzer</w:t>
-      </w:r>
-      <w:proofErr w:type="spellEnd"/>
-      <w:r>
-        <w:t>,” Ph.D. dissertation, Dept. Elect. Eng., Harvard Univ., Cambridge, MA, USA, 1993.</w:t>
+        <w:t>J. O. Williams, “Narrow-band analyzer,” Ph.D. dissertation, Dept. Elect. Eng., Harvard Univ., Cambridge, MA, USA, 1993.</w:t>
       </w:r>
     </w:p>
     <w:p>
@@ -15349,23 +14406,7 @@
         <w:pStyle w:val="References"/>
       </w:pPr>
       <w:r>
-        <w:t xml:space="preserve">R. Fardel, M. Nagel, F. </w:t>
-      </w:r>
-      <w:proofErr w:type="spellStart"/>
-      <w:r>
-        <w:t>Nuesch</w:t>
-      </w:r>
-      <w:proofErr w:type="spellEnd"/>
-      <w:r>
-        <w:t xml:space="preserve">, T. Lippert, and A. </w:t>
-      </w:r>
-      <w:proofErr w:type="spellStart"/>
-      <w:r>
-        <w:t>Wokaun</w:t>
-      </w:r>
-      <w:proofErr w:type="spellEnd"/>
-      <w:r>
-        <w:t xml:space="preserve">, “Fabrication of organic light emitting diode pixels by laser-assisted forward transfer,” </w:t>
+        <w:t xml:space="preserve">R. Fardel, M. Nagel, F. Nuesch, T. Lippert, and A. Wokaun, “Fabrication of organic light emitting diode pixels by laser-assisted forward transfer,” </w:t>
       </w:r>
       <w:r>
         <w:rPr>
@@ -15383,31 +14424,7 @@
         <w:pStyle w:val="References"/>
       </w:pPr>
       <w:r>
-        <w:t xml:space="preserve">J. Zhang and N. </w:t>
-      </w:r>
-      <w:proofErr w:type="spellStart"/>
-      <w:r>
-        <w:t>Tansu</w:t>
-      </w:r>
-      <w:proofErr w:type="spellEnd"/>
-      <w:r>
-        <w:t xml:space="preserve">, “Optical gain and laser characteristics of </w:t>
-      </w:r>
-      <w:proofErr w:type="spellStart"/>
-      <w:r>
-        <w:t>InGaN</w:t>
-      </w:r>
-      <w:proofErr w:type="spellEnd"/>
-      <w:r>
-        <w:t xml:space="preserve"> quantum wells on ternary </w:t>
-      </w:r>
-      <w:proofErr w:type="spellStart"/>
-      <w:r>
-        <w:t>InGaN</w:t>
-      </w:r>
-      <w:proofErr w:type="spellEnd"/>
-      <w:r>
-        <w:t xml:space="preserve"> substrates,” </w:t>
+        <w:t xml:space="preserve">J. Zhang and N. Tansu, “Optical gain and laser characteristics of InGaN quantum wells on ternary InGaN substrates,” </w:t>
       </w:r>
       <w:r>
         <w:rPr>
@@ -15425,15 +14442,7 @@
         <w:pStyle w:val="References"/>
       </w:pPr>
       <w:r>
-        <w:t xml:space="preserve">S. </w:t>
-      </w:r>
-      <w:proofErr w:type="spellStart"/>
-      <w:r>
-        <w:t>Azodolmolky</w:t>
-      </w:r>
-      <w:proofErr w:type="spellEnd"/>
-      <w:r>
-        <w:t xml:space="preserve"> </w:t>
+        <w:t xml:space="preserve">S. Azodolmolky </w:t>
       </w:r>
       <w:r>
         <w:rPr>
@@ -15450,23 +14459,7 @@
           <w:rFonts w:eastAsia="NimbusRomNo9L-ReguItal"/>
           <w:i/>
         </w:rPr>
-        <w:t xml:space="preserve">J. </w:t>
-      </w:r>
-      <w:proofErr w:type="spellStart"/>
-      <w:r>
-        <w:rPr>
-          <w:rFonts w:eastAsia="NimbusRomNo9L-ReguItal"/>
-          <w:i/>
-        </w:rPr>
-        <w:t>Lightw</w:t>
-      </w:r>
-      <w:proofErr w:type="spellEnd"/>
-      <w:r>
-        <w:rPr>
-          <w:rFonts w:eastAsia="NimbusRomNo9L-ReguItal"/>
-          <w:i/>
-        </w:rPr>
-        <w:t>. Technol.</w:t>
+        <w:t>J. Lightw. Technol.</w:t>
       </w:r>
       <w:r>
         <w:t>, vol. 29, no. 4, pp. 439–448, Sep. 2011.</w:t>
@@ -15672,23 +14665,7 @@
         </w:rPr>
       </w:pPr>
       <w:r>
-        <w:t xml:space="preserve">The third paragraph begins with the author’s title and last name (e.g., </w:t>
-      </w:r>
-      <w:proofErr w:type="spellStart"/>
-      <w:r>
-        <w:t>Dr.</w:t>
-      </w:r>
-      <w:proofErr w:type="spellEnd"/>
-      <w:r>
-        <w:t xml:space="preserve"> Smith, Prof. Jones, Mr. </w:t>
-      </w:r>
-      <w:proofErr w:type="spellStart"/>
-      <w:r>
-        <w:t>Kajor</w:t>
-      </w:r>
-      <w:proofErr w:type="spellEnd"/>
-      <w:r>
-        <w:t>, Ms. Hunter). List any memberships in professional societies other than the IEEE. Finally, list any awards and work for IEEE committees and publications. If a photograph is provided, it should be of good quality, and professional-looking. Following are two examples of an author’s biography.</w:t>
+        <w:t>The third paragraph begins with the author’s title and last name (e.g., Dr. Smith, Prof. Jones, Mr. Kajor, Ms. Hunter). List any memberships in professional societies other than the IEEE. Finally, list any awards and work for IEEE committees and publications. If a photograph is provided, it should be of good quality, and professional-looking. Following are two examples of an author’s biography.</w:t>
       </w:r>
       <w:r>
         <w:rPr>
@@ -15837,13 +14814,8 @@
       <w:pPr>
         <w:pStyle w:val="AUBiosNoSpace"/>
       </w:pPr>
-      <w:proofErr w:type="spellStart"/>
-      <w:r>
-        <w:t>Dr.</w:t>
-      </w:r>
-      <w:proofErr w:type="spellEnd"/>
-      <w:r>
-        <w:t xml:space="preserve"> Author was a recipient of the International Association of Geomagnetism and Aeronomy Young Scientist Award for Excellence in 2008, and the IEEE Electromagnetic Compatibility Society Best Symposium Paper Award in 2011.</w:t>
+      <w:r>
+        <w:t>Dr. Author was a recipient of the International Association of Geomagnetism and Aeronomy Young Scientist Award for Excellence in 2008, and the IEEE Electromagnetic Compatibility Society Best Symposium Paper Award in 2011.</w:t>
       </w:r>
     </w:p>
     <w:p>
@@ -15884,23 +14856,7 @@
         <w:pStyle w:val="AUBiosNoSpace"/>
       </w:pPr>
       <w:r>
-        <w:t xml:space="preserve">From 2008 to 2009, he was a Research Assistant with the Institute of Physics, Academia </w:t>
-      </w:r>
-      <w:proofErr w:type="spellStart"/>
-      <w:r>
-        <w:t>Sinica</w:t>
-      </w:r>
-      <w:proofErr w:type="spellEnd"/>
-      <w:r>
-        <w:t xml:space="preserve">, </w:t>
-      </w:r>
-      <w:proofErr w:type="spellStart"/>
-      <w:r>
-        <w:t>Tapei</w:t>
-      </w:r>
-      <w:proofErr w:type="spellEnd"/>
-      <w:r>
-        <w:t xml:space="preserve">, Taiwan. His research interest includes the development of surface processing and biological/medical treatment techniques using nonthermal atmospheric pressure plasmas, fundamental study of plasma sources, and fabrication of micro- or nanostructured surfaces. </w:t>
+        <w:t xml:space="preserve">From 2008 to 2009, he was a Research Assistant with the Institute of Physics, Academia Sinica, Tapei, Taiwan. His research interest includes the development of surface processing and biological/medical treatment techniques using nonthermal atmospheric pressure plasmas, fundamental study of plasma sources, and fabrication of micro- or nanostructured surfaces. </w:t>
       </w:r>
     </w:p>
     <w:p>
@@ -15908,15 +14864,7 @@
         <w:pStyle w:val="AUBiosNoSpace"/>
       </w:pPr>
       <w:r>
-        <w:t xml:space="preserve">Mr. Author’s awards and </w:t>
-      </w:r>
-      <w:proofErr w:type="spellStart"/>
-      <w:r>
-        <w:t>honors</w:t>
-      </w:r>
-      <w:proofErr w:type="spellEnd"/>
-      <w:r>
-        <w:t xml:space="preserve"> include the Frew Fellowship (Australian Academy of Science), the I. I. Rabi Prize (APS), the European Frequency and Time Forum Award, the Carl Zeiss Research Award, the William F. Meggers Award and the Adolph Lomb Medal (OSA).</w:t>
+        <w:t>Mr. Author’s awards and honors include the Frew Fellowship (Australian Academy of Science), the I. I. Rabi Prize (APS), the European Frequency and Time Forum Award, the Carl Zeiss Research Award, the William F. Meggers Award and the Adolph Lomb Medal (OSA).</w:t>
       </w:r>
     </w:p>
     <w:p>
@@ -15938,7 +14886,7 @@
 </file>
 
 <file path=word/endnotes.xml><?xml version="1.0" encoding="utf-8"?>
-<w:endnotes xmlns:wpc="http://schemas.microsoft.com/office/word/2010/wordprocessingCanvas" xmlns:cx="http://schemas.microsoft.com/office/drawing/2014/chartex" xmlns:cx1="http://schemas.microsoft.com/office/drawing/2015/9/8/chartex" xmlns:cx2="http://schemas.microsoft.com/office/drawing/2015/10/21/chartex" xmlns:cx3="http://schemas.microsoft.com/office/drawing/2016/5/9/chartex" xmlns:cx4="http://schemas.microsoft.com/office/drawing/2016/5/10/chartex" xmlns:cx5="http://schemas.microsoft.com/office/drawing/2016/5/11/chartex" xmlns:cx6="http://schemas.microsoft.com/office/drawing/2016/5/12/chartex" xmlns:cx7="http://schemas.microsoft.com/office/drawing/2016/5/13/chartex" xmlns:cx8="http://schemas.microsoft.com/office/drawing/2016/5/14/chartex" xmlns:mc="http://schemas.openxmlformats.org/markup-compatibility/2006" xmlns:aink="http://schemas.microsoft.com/office/drawing/2016/ink" xmlns:am3d="http://schemas.microsoft.com/office/drawing/2017/model3d" xmlns:o="urn:schemas-microsoft-com:office:office" xmlns:oel="http://schemas.microsoft.com/office/2019/extlst" xmlns:r="http://schemas.openxmlformats.org/officeDocument/2006/relationships" xmlns:m="http://schemas.openxmlformats.org/officeDocument/2006/math" xmlns:v="urn:schemas-microsoft-com:vml" xmlns:wp14="http://schemas.microsoft.com/office/word/2010/wordprocessingDrawing" xmlns:wp="http://schemas.openxmlformats.org/drawingml/2006/wordprocessingDrawing" xmlns:w10="urn:schemas-microsoft-com:office:word" xmlns:w="http://schemas.openxmlformats.org/wordprocessingml/2006/main" xmlns:w14="http://schemas.microsoft.com/office/word/2010/wordml" xmlns:w15="http://schemas.microsoft.com/office/word/2012/wordml" xmlns:w16cex="http://schemas.microsoft.com/office/word/2018/wordml/cex" xmlns:w16cid="http://schemas.microsoft.com/office/word/2016/wordml/cid" xmlns:w16="http://schemas.microsoft.com/office/word/2018/wordml" xmlns:w16sdtdh="http://schemas.microsoft.com/office/word/2020/wordml/sdtdatahash" xmlns:w16se="http://schemas.microsoft.com/office/word/2015/wordml/symex" xmlns:wpg="http://schemas.microsoft.com/office/word/2010/wordprocessingGroup" xmlns:wpi="http://schemas.microsoft.com/office/word/2010/wordprocessingInk" xmlns:wne="http://schemas.microsoft.com/office/word/2006/wordml" xmlns:wps="http://schemas.microsoft.com/office/word/2010/wordprocessingShape" mc:Ignorable="w14 w15 w16se w16cid w16 w16cex w16sdtdh wp14">
+<w:endnotes xmlns:wpc="http://schemas.microsoft.com/office/word/2010/wordprocessingCanvas" xmlns:cx="http://schemas.microsoft.com/office/drawing/2014/chartex" xmlns:cx1="http://schemas.microsoft.com/office/drawing/2015/9/8/chartex" xmlns:cx2="http://schemas.microsoft.com/office/drawing/2015/10/21/chartex" xmlns:cx3="http://schemas.microsoft.com/office/drawing/2016/5/9/chartex" xmlns:cx4="http://schemas.microsoft.com/office/drawing/2016/5/10/chartex" xmlns:cx5="http://schemas.microsoft.com/office/drawing/2016/5/11/chartex" xmlns:cx6="http://schemas.microsoft.com/office/drawing/2016/5/12/chartex" xmlns:cx7="http://schemas.microsoft.com/office/drawing/2016/5/13/chartex" xmlns:cx8="http://schemas.microsoft.com/office/drawing/2016/5/14/chartex" xmlns:mc="http://schemas.openxmlformats.org/markup-compatibility/2006" xmlns:aink="http://schemas.microsoft.com/office/drawing/2016/ink" xmlns:am3d="http://schemas.microsoft.com/office/drawing/2017/model3d" xmlns:o="urn:schemas-microsoft-com:office:office" xmlns:oel="http://schemas.microsoft.com/office/2019/extlst" xmlns:r="http://schemas.openxmlformats.org/officeDocument/2006/relationships" xmlns:m="http://schemas.openxmlformats.org/officeDocument/2006/math" xmlns:v="urn:schemas-microsoft-com:vml" xmlns:wp14="http://schemas.microsoft.com/office/word/2010/wordprocessingDrawing" xmlns:wp="http://schemas.openxmlformats.org/drawingml/2006/wordprocessingDrawing" xmlns:w10="urn:schemas-microsoft-com:office:word" xmlns:w="http://schemas.openxmlformats.org/wordprocessingml/2006/main" xmlns:w14="http://schemas.microsoft.com/office/word/2010/wordml" xmlns:w15="http://schemas.microsoft.com/office/word/2012/wordml" xmlns:w16cex="http://schemas.microsoft.com/office/word/2018/wordml/cex" xmlns:w16cid="http://schemas.microsoft.com/office/word/2016/wordml/cid" xmlns:w16="http://schemas.microsoft.com/office/word/2018/wordml" xmlns:w16du="http://schemas.microsoft.com/office/word/2023/wordml/word16du" xmlns:w16sdtdh="http://schemas.microsoft.com/office/word/2020/wordml/sdtdatahash" xmlns:w16sdtfl="http://schemas.microsoft.com/office/word/2024/wordml/sdtformatlock" xmlns:w16se="http://schemas.microsoft.com/office/word/2015/wordml/symex" xmlns:wpg="http://schemas.microsoft.com/office/word/2010/wordprocessingGroup" xmlns:wpi="http://schemas.microsoft.com/office/word/2010/wordprocessingInk" xmlns:wne="http://schemas.microsoft.com/office/word/2006/wordml" xmlns:wps="http://schemas.microsoft.com/office/word/2010/wordprocessingShape" mc:Ignorable="w14 w15 w16se w16cid w16 w16cex w16sdtdh w16sdtfl w16du wp14">
   <w:endnote w:type="separator" w:id="-1">
     <w:p>
       <w:r>
@@ -15957,7 +14905,7 @@
 </file>
 
 <file path=word/footer1.xml><?xml version="1.0" encoding="utf-8"?>
-<w:ftr xmlns:wpc="http://schemas.microsoft.com/office/word/2010/wordprocessingCanvas" xmlns:cx="http://schemas.microsoft.com/office/drawing/2014/chartex" xmlns:cx1="http://schemas.microsoft.com/office/drawing/2015/9/8/chartex" xmlns:cx2="http://schemas.microsoft.com/office/drawing/2015/10/21/chartex" xmlns:cx3="http://schemas.microsoft.com/office/drawing/2016/5/9/chartex" xmlns:cx4="http://schemas.microsoft.com/office/drawing/2016/5/10/chartex" xmlns:cx5="http://schemas.microsoft.com/office/drawing/2016/5/11/chartex" xmlns:cx6="http://schemas.microsoft.com/office/drawing/2016/5/12/chartex" xmlns:cx7="http://schemas.microsoft.com/office/drawing/2016/5/13/chartex" xmlns:cx8="http://schemas.microsoft.com/office/drawing/2016/5/14/chartex" xmlns:mc="http://schemas.openxmlformats.org/markup-compatibility/2006" xmlns:aink="http://schemas.microsoft.com/office/drawing/2016/ink" xmlns:am3d="http://schemas.microsoft.com/office/drawing/2017/model3d" xmlns:o="urn:schemas-microsoft-com:office:office" xmlns:oel="http://schemas.microsoft.com/office/2019/extlst" xmlns:r="http://schemas.openxmlformats.org/officeDocument/2006/relationships" xmlns:m="http://schemas.openxmlformats.org/officeDocument/2006/math" xmlns:v="urn:schemas-microsoft-com:vml" xmlns:wp14="http://schemas.microsoft.com/office/word/2010/wordprocessingDrawing" xmlns:wp="http://schemas.openxmlformats.org/drawingml/2006/wordprocessingDrawing" xmlns:w10="urn:schemas-microsoft-com:office:word" xmlns:w="http://schemas.openxmlformats.org/wordprocessingml/2006/main" xmlns:w14="http://schemas.microsoft.com/office/word/2010/wordml" xmlns:w15="http://schemas.microsoft.com/office/word/2012/wordml" xmlns:w16cex="http://schemas.microsoft.com/office/word/2018/wordml/cex" xmlns:w16cid="http://schemas.microsoft.com/office/word/2016/wordml/cid" xmlns:w16="http://schemas.microsoft.com/office/word/2018/wordml" xmlns:w16sdtdh="http://schemas.microsoft.com/office/word/2020/wordml/sdtdatahash" xmlns:w16se="http://schemas.microsoft.com/office/word/2015/wordml/symex" xmlns:wpg="http://schemas.microsoft.com/office/word/2010/wordprocessingGroup" xmlns:wpi="http://schemas.microsoft.com/office/word/2010/wordprocessingInk" xmlns:wne="http://schemas.microsoft.com/office/word/2006/wordml" xmlns:wps="http://schemas.microsoft.com/office/word/2010/wordprocessingShape" mc:Ignorable="w14 w15 w16se w16cid w16 w16cex w16sdtdh wp14">
+<w:ftr xmlns:wpc="http://schemas.microsoft.com/office/word/2010/wordprocessingCanvas" xmlns:cx="http://schemas.microsoft.com/office/drawing/2014/chartex" xmlns:cx1="http://schemas.microsoft.com/office/drawing/2015/9/8/chartex" xmlns:cx2="http://schemas.microsoft.com/office/drawing/2015/10/21/chartex" xmlns:cx3="http://schemas.microsoft.com/office/drawing/2016/5/9/chartex" xmlns:cx4="http://schemas.microsoft.com/office/drawing/2016/5/10/chartex" xmlns:cx5="http://schemas.microsoft.com/office/drawing/2016/5/11/chartex" xmlns:cx6="http://schemas.microsoft.com/office/drawing/2016/5/12/chartex" xmlns:cx7="http://schemas.microsoft.com/office/drawing/2016/5/13/chartex" xmlns:cx8="http://schemas.microsoft.com/office/drawing/2016/5/14/chartex" xmlns:mc="http://schemas.openxmlformats.org/markup-compatibility/2006" xmlns:aink="http://schemas.microsoft.com/office/drawing/2016/ink" xmlns:am3d="http://schemas.microsoft.com/office/drawing/2017/model3d" xmlns:o="urn:schemas-microsoft-com:office:office" xmlns:oel="http://schemas.microsoft.com/office/2019/extlst" xmlns:r="http://schemas.openxmlformats.org/officeDocument/2006/relationships" xmlns:m="http://schemas.openxmlformats.org/officeDocument/2006/math" xmlns:v="urn:schemas-microsoft-com:vml" xmlns:wp14="http://schemas.microsoft.com/office/word/2010/wordprocessingDrawing" xmlns:wp="http://schemas.openxmlformats.org/drawingml/2006/wordprocessingDrawing" xmlns:w10="urn:schemas-microsoft-com:office:word" xmlns:w="http://schemas.openxmlformats.org/wordprocessingml/2006/main" xmlns:w14="http://schemas.microsoft.com/office/word/2010/wordml" xmlns:w15="http://schemas.microsoft.com/office/word/2012/wordml" xmlns:w16cex="http://schemas.microsoft.com/office/word/2018/wordml/cex" xmlns:w16cid="http://schemas.microsoft.com/office/word/2016/wordml/cid" xmlns:w16="http://schemas.microsoft.com/office/word/2018/wordml" xmlns:w16du="http://schemas.microsoft.com/office/word/2023/wordml/word16du" xmlns:w16sdtdh="http://schemas.microsoft.com/office/word/2020/wordml/sdtdatahash" xmlns:w16sdtfl="http://schemas.microsoft.com/office/word/2024/wordml/sdtformatlock" xmlns:w16se="http://schemas.microsoft.com/office/word/2015/wordml/symex" xmlns:wpg="http://schemas.microsoft.com/office/word/2010/wordprocessingGroup" xmlns:wpi="http://schemas.microsoft.com/office/word/2010/wordprocessingInk" xmlns:wne="http://schemas.microsoft.com/office/word/2006/wordml" xmlns:wps="http://schemas.microsoft.com/office/word/2010/wordprocessingShape" mc:Ignorable="w14 w15 w16se w16cid w16 w16cex w16sdtdh w16sdtfl w16du wp14">
   <w:p>
     <w:pPr>
       <w:pStyle w:val="Footer"/>
@@ -16018,7 +14966,7 @@
 </file>
 
 <file path=word/footer2.xml><?xml version="1.0" encoding="utf-8"?>
-<w:ftr xmlns:wpc="http://schemas.microsoft.com/office/word/2010/wordprocessingCanvas" xmlns:cx="http://schemas.microsoft.com/office/drawing/2014/chartex" xmlns:cx1="http://schemas.microsoft.com/office/drawing/2015/9/8/chartex" xmlns:cx2="http://schemas.microsoft.com/office/drawing/2015/10/21/chartex" xmlns:cx3="http://schemas.microsoft.com/office/drawing/2016/5/9/chartex" xmlns:cx4="http://schemas.microsoft.com/office/drawing/2016/5/10/chartex" xmlns:cx5="http://schemas.microsoft.com/office/drawing/2016/5/11/chartex" xmlns:cx6="http://schemas.microsoft.com/office/drawing/2016/5/12/chartex" xmlns:cx7="http://schemas.microsoft.com/office/drawing/2016/5/13/chartex" xmlns:cx8="http://schemas.microsoft.com/office/drawing/2016/5/14/chartex" xmlns:mc="http://schemas.openxmlformats.org/markup-compatibility/2006" xmlns:aink="http://schemas.microsoft.com/office/drawing/2016/ink" xmlns:am3d="http://schemas.microsoft.com/office/drawing/2017/model3d" xmlns:o="urn:schemas-microsoft-com:office:office" xmlns:oel="http://schemas.microsoft.com/office/2019/extlst" xmlns:r="http://schemas.openxmlformats.org/officeDocument/2006/relationships" xmlns:m="http://schemas.openxmlformats.org/officeDocument/2006/math" xmlns:v="urn:schemas-microsoft-com:vml" xmlns:wp14="http://schemas.microsoft.com/office/word/2010/wordprocessingDrawing" xmlns:wp="http://schemas.openxmlformats.org/drawingml/2006/wordprocessingDrawing" xmlns:w10="urn:schemas-microsoft-com:office:word" xmlns:w="http://schemas.openxmlformats.org/wordprocessingml/2006/main" xmlns:w14="http://schemas.microsoft.com/office/word/2010/wordml" xmlns:w15="http://schemas.microsoft.com/office/word/2012/wordml" xmlns:w16cex="http://schemas.microsoft.com/office/word/2018/wordml/cex" xmlns:w16cid="http://schemas.microsoft.com/office/word/2016/wordml/cid" xmlns:w16="http://schemas.microsoft.com/office/word/2018/wordml" xmlns:w16sdtdh="http://schemas.microsoft.com/office/word/2020/wordml/sdtdatahash" xmlns:w16se="http://schemas.microsoft.com/office/word/2015/wordml/symex" xmlns:wpg="http://schemas.microsoft.com/office/word/2010/wordprocessingGroup" xmlns:wpi="http://schemas.microsoft.com/office/word/2010/wordprocessingInk" xmlns:wne="http://schemas.microsoft.com/office/word/2006/wordml" xmlns:wps="http://schemas.microsoft.com/office/word/2010/wordprocessingShape" mc:Ignorable="w14 w15 w16se w16cid w16 w16cex w16sdtdh wp14">
+<w:ftr xmlns:wpc="http://schemas.microsoft.com/office/word/2010/wordprocessingCanvas" xmlns:cx="http://schemas.microsoft.com/office/drawing/2014/chartex" xmlns:cx1="http://schemas.microsoft.com/office/drawing/2015/9/8/chartex" xmlns:cx2="http://schemas.microsoft.com/office/drawing/2015/10/21/chartex" xmlns:cx3="http://schemas.microsoft.com/office/drawing/2016/5/9/chartex" xmlns:cx4="http://schemas.microsoft.com/office/drawing/2016/5/10/chartex" xmlns:cx5="http://schemas.microsoft.com/office/drawing/2016/5/11/chartex" xmlns:cx6="http://schemas.microsoft.com/office/drawing/2016/5/12/chartex" xmlns:cx7="http://schemas.microsoft.com/office/drawing/2016/5/13/chartex" xmlns:cx8="http://schemas.microsoft.com/office/drawing/2016/5/14/chartex" xmlns:mc="http://schemas.openxmlformats.org/markup-compatibility/2006" xmlns:aink="http://schemas.microsoft.com/office/drawing/2016/ink" xmlns:am3d="http://schemas.microsoft.com/office/drawing/2017/model3d" xmlns:o="urn:schemas-microsoft-com:office:office" xmlns:oel="http://schemas.microsoft.com/office/2019/extlst" xmlns:r="http://schemas.openxmlformats.org/officeDocument/2006/relationships" xmlns:m="http://schemas.openxmlformats.org/officeDocument/2006/math" xmlns:v="urn:schemas-microsoft-com:vml" xmlns:wp14="http://schemas.microsoft.com/office/word/2010/wordprocessingDrawing" xmlns:wp="http://schemas.openxmlformats.org/drawingml/2006/wordprocessingDrawing" xmlns:w10="urn:schemas-microsoft-com:office:word" xmlns:w="http://schemas.openxmlformats.org/wordprocessingml/2006/main" xmlns:w14="http://schemas.microsoft.com/office/word/2010/wordml" xmlns:w15="http://schemas.microsoft.com/office/word/2012/wordml" xmlns:w16cex="http://schemas.microsoft.com/office/word/2018/wordml/cex" xmlns:w16cid="http://schemas.microsoft.com/office/word/2016/wordml/cid" xmlns:w16="http://schemas.microsoft.com/office/word/2018/wordml" xmlns:w16du="http://schemas.microsoft.com/office/word/2023/wordml/word16du" xmlns:w16sdtdh="http://schemas.microsoft.com/office/word/2020/wordml/sdtdatahash" xmlns:w16sdtfl="http://schemas.microsoft.com/office/word/2024/wordml/sdtformatlock" xmlns:w16se="http://schemas.microsoft.com/office/word/2015/wordml/symex" xmlns:wpg="http://schemas.microsoft.com/office/word/2010/wordprocessingGroup" xmlns:wpi="http://schemas.microsoft.com/office/word/2010/wordprocessingInk" xmlns:wne="http://schemas.microsoft.com/office/word/2006/wordml" xmlns:wps="http://schemas.microsoft.com/office/word/2010/wordprocessingShape" mc:Ignorable="w14 w15 w16se w16cid w16 w16cex w16sdtdh w16sdtfl w16du wp14">
   <w:p>
     <w:pPr>
       <w:pStyle w:val="Footer"/>
@@ -16085,7 +15033,7 @@
 </file>
 
 <file path=word/footer3.xml><?xml version="1.0" encoding="utf-8"?>
-<w:ftr xmlns:wpc="http://schemas.microsoft.com/office/word/2010/wordprocessingCanvas" xmlns:cx="http://schemas.microsoft.com/office/drawing/2014/chartex" xmlns:cx1="http://schemas.microsoft.com/office/drawing/2015/9/8/chartex" xmlns:cx2="http://schemas.microsoft.com/office/drawing/2015/10/21/chartex" xmlns:cx3="http://schemas.microsoft.com/office/drawing/2016/5/9/chartex" xmlns:cx4="http://schemas.microsoft.com/office/drawing/2016/5/10/chartex" xmlns:cx5="http://schemas.microsoft.com/office/drawing/2016/5/11/chartex" xmlns:cx6="http://schemas.microsoft.com/office/drawing/2016/5/12/chartex" xmlns:cx7="http://schemas.microsoft.com/office/drawing/2016/5/13/chartex" xmlns:cx8="http://schemas.microsoft.com/office/drawing/2016/5/14/chartex" xmlns:mc="http://schemas.openxmlformats.org/markup-compatibility/2006" xmlns:aink="http://schemas.microsoft.com/office/drawing/2016/ink" xmlns:am3d="http://schemas.microsoft.com/office/drawing/2017/model3d" xmlns:o="urn:schemas-microsoft-com:office:office" xmlns:oel="http://schemas.microsoft.com/office/2019/extlst" xmlns:r="http://schemas.openxmlformats.org/officeDocument/2006/relationships" xmlns:m="http://schemas.openxmlformats.org/officeDocument/2006/math" xmlns:v="urn:schemas-microsoft-com:vml" xmlns:wp14="http://schemas.microsoft.com/office/word/2010/wordprocessingDrawing" xmlns:wp="http://schemas.openxmlformats.org/drawingml/2006/wordprocessingDrawing" xmlns:w10="urn:schemas-microsoft-com:office:word" xmlns:w="http://schemas.openxmlformats.org/wordprocessingml/2006/main" xmlns:w14="http://schemas.microsoft.com/office/word/2010/wordml" xmlns:w15="http://schemas.microsoft.com/office/word/2012/wordml" xmlns:w16cex="http://schemas.microsoft.com/office/word/2018/wordml/cex" xmlns:w16cid="http://schemas.microsoft.com/office/word/2016/wordml/cid" xmlns:w16="http://schemas.microsoft.com/office/word/2018/wordml" xmlns:w16sdtdh="http://schemas.microsoft.com/office/word/2020/wordml/sdtdatahash" xmlns:w16se="http://schemas.microsoft.com/office/word/2015/wordml/symex" xmlns:wpg="http://schemas.microsoft.com/office/word/2010/wordprocessingGroup" xmlns:wpi="http://schemas.microsoft.com/office/word/2010/wordprocessingInk" xmlns:wne="http://schemas.microsoft.com/office/word/2006/wordml" xmlns:wps="http://schemas.microsoft.com/office/word/2010/wordprocessingShape" mc:Ignorable="w14 w15 w16se w16cid w16 w16cex w16sdtdh wp14">
+<w:ftr xmlns:wpc="http://schemas.microsoft.com/office/word/2010/wordprocessingCanvas" xmlns:cx="http://schemas.microsoft.com/office/drawing/2014/chartex" xmlns:cx1="http://schemas.microsoft.com/office/drawing/2015/9/8/chartex" xmlns:cx2="http://schemas.microsoft.com/office/drawing/2015/10/21/chartex" xmlns:cx3="http://schemas.microsoft.com/office/drawing/2016/5/9/chartex" xmlns:cx4="http://schemas.microsoft.com/office/drawing/2016/5/10/chartex" xmlns:cx5="http://schemas.microsoft.com/office/drawing/2016/5/11/chartex" xmlns:cx6="http://schemas.microsoft.com/office/drawing/2016/5/12/chartex" xmlns:cx7="http://schemas.microsoft.com/office/drawing/2016/5/13/chartex" xmlns:cx8="http://schemas.microsoft.com/office/drawing/2016/5/14/chartex" xmlns:mc="http://schemas.openxmlformats.org/markup-compatibility/2006" xmlns:aink="http://schemas.microsoft.com/office/drawing/2016/ink" xmlns:am3d="http://schemas.microsoft.com/office/drawing/2017/model3d" xmlns:o="urn:schemas-microsoft-com:office:office" xmlns:oel="http://schemas.microsoft.com/office/2019/extlst" xmlns:r="http://schemas.openxmlformats.org/officeDocument/2006/relationships" xmlns:m="http://schemas.openxmlformats.org/officeDocument/2006/math" xmlns:v="urn:schemas-microsoft-com:vml" xmlns:wp14="http://schemas.microsoft.com/office/word/2010/wordprocessingDrawing" xmlns:wp="http://schemas.openxmlformats.org/drawingml/2006/wordprocessingDrawing" xmlns:w10="urn:schemas-microsoft-com:office:word" xmlns:w="http://schemas.openxmlformats.org/wordprocessingml/2006/main" xmlns:w14="http://schemas.microsoft.com/office/word/2010/wordml" xmlns:w15="http://schemas.microsoft.com/office/word/2012/wordml" xmlns:w16cex="http://schemas.microsoft.com/office/word/2018/wordml/cex" xmlns:w16cid="http://schemas.microsoft.com/office/word/2016/wordml/cid" xmlns:w16="http://schemas.microsoft.com/office/word/2018/wordml" xmlns:w16du="http://schemas.microsoft.com/office/word/2023/wordml/word16du" xmlns:w16sdtdh="http://schemas.microsoft.com/office/word/2020/wordml/sdtdatahash" xmlns:w16sdtfl="http://schemas.microsoft.com/office/word/2024/wordml/sdtformatlock" xmlns:w16se="http://schemas.microsoft.com/office/word/2015/wordml/symex" xmlns:wpg="http://schemas.microsoft.com/office/word/2010/wordprocessingGroup" xmlns:wpi="http://schemas.microsoft.com/office/word/2010/wordprocessingInk" xmlns:wne="http://schemas.microsoft.com/office/word/2006/wordml" xmlns:wps="http://schemas.microsoft.com/office/word/2010/wordprocessingShape" mc:Ignorable="w14 w15 w16se w16cid w16 w16cex w16sdtdh w16sdtfl w16du wp14">
   <w:p>
     <w:pPr>
       <w:pStyle w:val="Footer"/>
@@ -16128,7 +15076,7 @@
 </file>
 
 <file path=word/footer4.xml><?xml version="1.0" encoding="utf-8"?>
-<w:ftr xmlns:wpc="http://schemas.microsoft.com/office/word/2010/wordprocessingCanvas" xmlns:cx="http://schemas.microsoft.com/office/drawing/2014/chartex" xmlns:cx1="http://schemas.microsoft.com/office/drawing/2015/9/8/chartex" xmlns:cx2="http://schemas.microsoft.com/office/drawing/2015/10/21/chartex" xmlns:cx3="http://schemas.microsoft.com/office/drawing/2016/5/9/chartex" xmlns:cx4="http://schemas.microsoft.com/office/drawing/2016/5/10/chartex" xmlns:cx5="http://schemas.microsoft.com/office/drawing/2016/5/11/chartex" xmlns:cx6="http://schemas.microsoft.com/office/drawing/2016/5/12/chartex" xmlns:cx7="http://schemas.microsoft.com/office/drawing/2016/5/13/chartex" xmlns:cx8="http://schemas.microsoft.com/office/drawing/2016/5/14/chartex" xmlns:mc="http://schemas.openxmlformats.org/markup-compatibility/2006" xmlns:aink="http://schemas.microsoft.com/office/drawing/2016/ink" xmlns:am3d="http://schemas.microsoft.com/office/drawing/2017/model3d" xmlns:o="urn:schemas-microsoft-com:office:office" xmlns:oel="http://schemas.microsoft.com/office/2019/extlst" xmlns:r="http://schemas.openxmlformats.org/officeDocument/2006/relationships" xmlns:m="http://schemas.openxmlformats.org/officeDocument/2006/math" xmlns:v="urn:schemas-microsoft-com:vml" xmlns:wp14="http://schemas.microsoft.com/office/word/2010/wordprocessingDrawing" xmlns:wp="http://schemas.openxmlformats.org/drawingml/2006/wordprocessingDrawing" xmlns:w10="urn:schemas-microsoft-com:office:word" xmlns:w="http://schemas.openxmlformats.org/wordprocessingml/2006/main" xmlns:w14="http://schemas.microsoft.com/office/word/2010/wordml" xmlns:w15="http://schemas.microsoft.com/office/word/2012/wordml" xmlns:w16cex="http://schemas.microsoft.com/office/word/2018/wordml/cex" xmlns:w16cid="http://schemas.microsoft.com/office/word/2016/wordml/cid" xmlns:w16="http://schemas.microsoft.com/office/word/2018/wordml" xmlns:w16sdtdh="http://schemas.microsoft.com/office/word/2020/wordml/sdtdatahash" xmlns:w16se="http://schemas.microsoft.com/office/word/2015/wordml/symex" xmlns:wpg="http://schemas.microsoft.com/office/word/2010/wordprocessingGroup" xmlns:wpi="http://schemas.microsoft.com/office/word/2010/wordprocessingInk" xmlns:wne="http://schemas.microsoft.com/office/word/2006/wordml" xmlns:wps="http://schemas.microsoft.com/office/word/2010/wordprocessingShape" mc:Ignorable="w14 w15 w16se w16cid w16 w16cex w16sdtdh wp14">
+<w:ftr xmlns:wpc="http://schemas.microsoft.com/office/word/2010/wordprocessingCanvas" xmlns:cx="http://schemas.microsoft.com/office/drawing/2014/chartex" xmlns:cx1="http://schemas.microsoft.com/office/drawing/2015/9/8/chartex" xmlns:cx2="http://schemas.microsoft.com/office/drawing/2015/10/21/chartex" xmlns:cx3="http://schemas.microsoft.com/office/drawing/2016/5/9/chartex" xmlns:cx4="http://schemas.microsoft.com/office/drawing/2016/5/10/chartex" xmlns:cx5="http://schemas.microsoft.com/office/drawing/2016/5/11/chartex" xmlns:cx6="http://schemas.microsoft.com/office/drawing/2016/5/12/chartex" xmlns:cx7="http://schemas.microsoft.com/office/drawing/2016/5/13/chartex" xmlns:cx8="http://schemas.microsoft.com/office/drawing/2016/5/14/chartex" xmlns:mc="http://schemas.openxmlformats.org/markup-compatibility/2006" xmlns:aink="http://schemas.microsoft.com/office/drawing/2016/ink" xmlns:am3d="http://schemas.microsoft.com/office/drawing/2017/model3d" xmlns:o="urn:schemas-microsoft-com:office:office" xmlns:oel="http://schemas.microsoft.com/office/2019/extlst" xmlns:r="http://schemas.openxmlformats.org/officeDocument/2006/relationships" xmlns:m="http://schemas.openxmlformats.org/officeDocument/2006/math" xmlns:v="urn:schemas-microsoft-com:vml" xmlns:wp14="http://schemas.microsoft.com/office/word/2010/wordprocessingDrawing" xmlns:wp="http://schemas.openxmlformats.org/drawingml/2006/wordprocessingDrawing" xmlns:w10="urn:schemas-microsoft-com:office:word" xmlns:w="http://schemas.openxmlformats.org/wordprocessingml/2006/main" xmlns:w14="http://schemas.microsoft.com/office/word/2010/wordml" xmlns:w15="http://schemas.microsoft.com/office/word/2012/wordml" xmlns:w16cex="http://schemas.microsoft.com/office/word/2018/wordml/cex" xmlns:w16cid="http://schemas.microsoft.com/office/word/2016/wordml/cid" xmlns:w16="http://schemas.microsoft.com/office/word/2018/wordml" xmlns:w16du="http://schemas.microsoft.com/office/word/2023/wordml/word16du" xmlns:w16sdtdh="http://schemas.microsoft.com/office/word/2020/wordml/sdtdatahash" xmlns:w16sdtfl="http://schemas.microsoft.com/office/word/2024/wordml/sdtformatlock" xmlns:w16se="http://schemas.microsoft.com/office/word/2015/wordml/symex" xmlns:wpg="http://schemas.microsoft.com/office/word/2010/wordprocessingGroup" xmlns:wpi="http://schemas.microsoft.com/office/word/2010/wordprocessingInk" xmlns:wne="http://schemas.microsoft.com/office/word/2006/wordml" xmlns:wps="http://schemas.microsoft.com/office/word/2010/wordprocessingShape" mc:Ignorable="w14 w15 w16se w16cid w16 w16cex w16sdtdh w16sdtfl w16du wp14">
   <w:p>
     <w:pPr>
       <w:pStyle w:val="Footer"/>
@@ -16171,7 +15119,7 @@
 </file>
 
 <file path=word/footer5.xml><?xml version="1.0" encoding="utf-8"?>
-<w:ftr xmlns:wpc="http://schemas.microsoft.com/office/word/2010/wordprocessingCanvas" xmlns:cx="http://schemas.microsoft.com/office/drawing/2014/chartex" xmlns:cx1="http://schemas.microsoft.com/office/drawing/2015/9/8/chartex" xmlns:cx2="http://schemas.microsoft.com/office/drawing/2015/10/21/chartex" xmlns:cx3="http://schemas.microsoft.com/office/drawing/2016/5/9/chartex" xmlns:cx4="http://schemas.microsoft.com/office/drawing/2016/5/10/chartex" xmlns:cx5="http://schemas.microsoft.com/office/drawing/2016/5/11/chartex" xmlns:cx6="http://schemas.microsoft.com/office/drawing/2016/5/12/chartex" xmlns:cx7="http://schemas.microsoft.com/office/drawing/2016/5/13/chartex" xmlns:cx8="http://schemas.microsoft.com/office/drawing/2016/5/14/chartex" xmlns:mc="http://schemas.openxmlformats.org/markup-compatibility/2006" xmlns:aink="http://schemas.microsoft.com/office/drawing/2016/ink" xmlns:am3d="http://schemas.microsoft.com/office/drawing/2017/model3d" xmlns:o="urn:schemas-microsoft-com:office:office" xmlns:oel="http://schemas.microsoft.com/office/2019/extlst" xmlns:r="http://schemas.openxmlformats.org/officeDocument/2006/relationships" xmlns:m="http://schemas.openxmlformats.org/officeDocument/2006/math" xmlns:v="urn:schemas-microsoft-com:vml" xmlns:wp14="http://schemas.microsoft.com/office/word/2010/wordprocessingDrawing" xmlns:wp="http://schemas.openxmlformats.org/drawingml/2006/wordprocessingDrawing" xmlns:w10="urn:schemas-microsoft-com:office:word" xmlns:w="http://schemas.openxmlformats.org/wordprocessingml/2006/main" xmlns:w14="http://schemas.microsoft.com/office/word/2010/wordml" xmlns:w15="http://schemas.microsoft.com/office/word/2012/wordml" xmlns:w16cex="http://schemas.microsoft.com/office/word/2018/wordml/cex" xmlns:w16cid="http://schemas.microsoft.com/office/word/2016/wordml/cid" xmlns:w16="http://schemas.microsoft.com/office/word/2018/wordml" xmlns:w16sdtdh="http://schemas.microsoft.com/office/word/2020/wordml/sdtdatahash" xmlns:w16se="http://schemas.microsoft.com/office/word/2015/wordml/symex" xmlns:wpg="http://schemas.microsoft.com/office/word/2010/wordprocessingGroup" xmlns:wpi="http://schemas.microsoft.com/office/word/2010/wordprocessingInk" xmlns:wne="http://schemas.microsoft.com/office/word/2006/wordml" xmlns:wps="http://schemas.microsoft.com/office/word/2010/wordprocessingShape" mc:Ignorable="w14 w15 w16se w16cid w16 w16cex w16sdtdh wp14">
+<w:ftr xmlns:wpc="http://schemas.microsoft.com/office/word/2010/wordprocessingCanvas" xmlns:cx="http://schemas.microsoft.com/office/drawing/2014/chartex" xmlns:cx1="http://schemas.microsoft.com/office/drawing/2015/9/8/chartex" xmlns:cx2="http://schemas.microsoft.com/office/drawing/2015/10/21/chartex" xmlns:cx3="http://schemas.microsoft.com/office/drawing/2016/5/9/chartex" xmlns:cx4="http://schemas.microsoft.com/office/drawing/2016/5/10/chartex" xmlns:cx5="http://schemas.microsoft.com/office/drawing/2016/5/11/chartex" xmlns:cx6="http://schemas.microsoft.com/office/drawing/2016/5/12/chartex" xmlns:cx7="http://schemas.microsoft.com/office/drawing/2016/5/13/chartex" xmlns:cx8="http://schemas.microsoft.com/office/drawing/2016/5/14/chartex" xmlns:mc="http://schemas.openxmlformats.org/markup-compatibility/2006" xmlns:aink="http://schemas.microsoft.com/office/drawing/2016/ink" xmlns:am3d="http://schemas.microsoft.com/office/drawing/2017/model3d" xmlns:o="urn:schemas-microsoft-com:office:office" xmlns:oel="http://schemas.microsoft.com/office/2019/extlst" xmlns:r="http://schemas.openxmlformats.org/officeDocument/2006/relationships" xmlns:m="http://schemas.openxmlformats.org/officeDocument/2006/math" xmlns:v="urn:schemas-microsoft-com:vml" xmlns:wp14="http://schemas.microsoft.com/office/word/2010/wordprocessingDrawing" xmlns:wp="http://schemas.openxmlformats.org/drawingml/2006/wordprocessingDrawing" xmlns:w10="urn:schemas-microsoft-com:office:word" xmlns:w="http://schemas.openxmlformats.org/wordprocessingml/2006/main" xmlns:w14="http://schemas.microsoft.com/office/word/2010/wordml" xmlns:w15="http://schemas.microsoft.com/office/word/2012/wordml" xmlns:w16cex="http://schemas.microsoft.com/office/word/2018/wordml/cex" xmlns:w16cid="http://schemas.microsoft.com/office/word/2016/wordml/cid" xmlns:w16="http://schemas.microsoft.com/office/word/2018/wordml" xmlns:w16du="http://schemas.microsoft.com/office/word/2023/wordml/word16du" xmlns:w16sdtdh="http://schemas.microsoft.com/office/word/2020/wordml/sdtdatahash" xmlns:w16sdtfl="http://schemas.microsoft.com/office/word/2024/wordml/sdtformatlock" xmlns:w16se="http://schemas.microsoft.com/office/word/2015/wordml/symex" xmlns:wpg="http://schemas.microsoft.com/office/word/2010/wordprocessingGroup" xmlns:wpi="http://schemas.microsoft.com/office/word/2010/wordprocessingInk" xmlns:wne="http://schemas.microsoft.com/office/word/2006/wordml" xmlns:wps="http://schemas.microsoft.com/office/word/2010/wordprocessingShape" mc:Ignorable="w14 w15 w16se w16cid w16 w16cex w16sdtdh w16sdtfl w16du wp14">
   <w:p>
     <w:pPr>
       <w:pStyle w:val="Footer"/>
@@ -16214,7 +15162,7 @@
 </file>
 
 <file path=word/footer6.xml><?xml version="1.0" encoding="utf-8"?>
-<w:ftr xmlns:wpc="http://schemas.microsoft.com/office/word/2010/wordprocessingCanvas" xmlns:cx="http://schemas.microsoft.com/office/drawing/2014/chartex" xmlns:cx1="http://schemas.microsoft.com/office/drawing/2015/9/8/chartex" xmlns:cx2="http://schemas.microsoft.com/office/drawing/2015/10/21/chartex" xmlns:cx3="http://schemas.microsoft.com/office/drawing/2016/5/9/chartex" xmlns:cx4="http://schemas.microsoft.com/office/drawing/2016/5/10/chartex" xmlns:cx5="http://schemas.microsoft.com/office/drawing/2016/5/11/chartex" xmlns:cx6="http://schemas.microsoft.com/office/drawing/2016/5/12/chartex" xmlns:cx7="http://schemas.microsoft.com/office/drawing/2016/5/13/chartex" xmlns:cx8="http://schemas.microsoft.com/office/drawing/2016/5/14/chartex" xmlns:mc="http://schemas.openxmlformats.org/markup-compatibility/2006" xmlns:aink="http://schemas.microsoft.com/office/drawing/2016/ink" xmlns:am3d="http://schemas.microsoft.com/office/drawing/2017/model3d" xmlns:o="urn:schemas-microsoft-com:office:office" xmlns:oel="http://schemas.microsoft.com/office/2019/extlst" xmlns:r="http://schemas.openxmlformats.org/officeDocument/2006/relationships" xmlns:m="http://schemas.openxmlformats.org/officeDocument/2006/math" xmlns:v="urn:schemas-microsoft-com:vml" xmlns:wp14="http://schemas.microsoft.com/office/word/2010/wordprocessingDrawing" xmlns:wp="http://schemas.openxmlformats.org/drawingml/2006/wordprocessingDrawing" xmlns:w10="urn:schemas-microsoft-com:office:word" xmlns:w="http://schemas.openxmlformats.org/wordprocessingml/2006/main" xmlns:w14="http://schemas.microsoft.com/office/word/2010/wordml" xmlns:w15="http://schemas.microsoft.com/office/word/2012/wordml" xmlns:w16cex="http://schemas.microsoft.com/office/word/2018/wordml/cex" xmlns:w16cid="http://schemas.microsoft.com/office/word/2016/wordml/cid" xmlns:w16="http://schemas.microsoft.com/office/word/2018/wordml" xmlns:w16sdtdh="http://schemas.microsoft.com/office/word/2020/wordml/sdtdatahash" xmlns:w16se="http://schemas.microsoft.com/office/word/2015/wordml/symex" xmlns:wpg="http://schemas.microsoft.com/office/word/2010/wordprocessingGroup" xmlns:wpi="http://schemas.microsoft.com/office/word/2010/wordprocessingInk" xmlns:wne="http://schemas.microsoft.com/office/word/2006/wordml" xmlns:wps="http://schemas.microsoft.com/office/word/2010/wordprocessingShape" mc:Ignorable="w14 w15 w16se w16cid w16 w16cex w16sdtdh wp14">
+<w:ftr xmlns:wpc="http://schemas.microsoft.com/office/word/2010/wordprocessingCanvas" xmlns:cx="http://schemas.microsoft.com/office/drawing/2014/chartex" xmlns:cx1="http://schemas.microsoft.com/office/drawing/2015/9/8/chartex" xmlns:cx2="http://schemas.microsoft.com/office/drawing/2015/10/21/chartex" xmlns:cx3="http://schemas.microsoft.com/office/drawing/2016/5/9/chartex" xmlns:cx4="http://schemas.microsoft.com/office/drawing/2016/5/10/chartex" xmlns:cx5="http://schemas.microsoft.com/office/drawing/2016/5/11/chartex" xmlns:cx6="http://schemas.microsoft.com/office/drawing/2016/5/12/chartex" xmlns:cx7="http://schemas.microsoft.com/office/drawing/2016/5/13/chartex" xmlns:cx8="http://schemas.microsoft.com/office/drawing/2016/5/14/chartex" xmlns:mc="http://schemas.openxmlformats.org/markup-compatibility/2006" xmlns:aink="http://schemas.microsoft.com/office/drawing/2016/ink" xmlns:am3d="http://schemas.microsoft.com/office/drawing/2017/model3d" xmlns:o="urn:schemas-microsoft-com:office:office" xmlns:oel="http://schemas.microsoft.com/office/2019/extlst" xmlns:r="http://schemas.openxmlformats.org/officeDocument/2006/relationships" xmlns:m="http://schemas.openxmlformats.org/officeDocument/2006/math" xmlns:v="urn:schemas-microsoft-com:vml" xmlns:wp14="http://schemas.microsoft.com/office/word/2010/wordprocessingDrawing" xmlns:wp="http://schemas.openxmlformats.org/drawingml/2006/wordprocessingDrawing" xmlns:w10="urn:schemas-microsoft-com:office:word" xmlns:w="http://schemas.openxmlformats.org/wordprocessingml/2006/main" xmlns:w14="http://schemas.microsoft.com/office/word/2010/wordml" xmlns:w15="http://schemas.microsoft.com/office/word/2012/wordml" xmlns:w16cex="http://schemas.microsoft.com/office/word/2018/wordml/cex" xmlns:w16cid="http://schemas.microsoft.com/office/word/2016/wordml/cid" xmlns:w16="http://schemas.microsoft.com/office/word/2018/wordml" xmlns:w16du="http://schemas.microsoft.com/office/word/2023/wordml/word16du" xmlns:w16sdtdh="http://schemas.microsoft.com/office/word/2020/wordml/sdtdatahash" xmlns:w16sdtfl="http://schemas.microsoft.com/office/word/2024/wordml/sdtformatlock" xmlns:w16se="http://schemas.microsoft.com/office/word/2015/wordml/symex" xmlns:wpg="http://schemas.microsoft.com/office/word/2010/wordprocessingGroup" xmlns:wpi="http://schemas.microsoft.com/office/word/2010/wordprocessingInk" xmlns:wne="http://schemas.microsoft.com/office/word/2006/wordml" xmlns:wps="http://schemas.microsoft.com/office/word/2010/wordprocessingShape" mc:Ignorable="w14 w15 w16se w16cid w16 w16cex w16sdtdh w16sdtfl w16du wp14">
   <w:p>
     <w:pPr>
       <w:pStyle w:val="Footer"/>
@@ -16257,7 +15205,7 @@
 </file>
 
 <file path=word/footer7.xml><?xml version="1.0" encoding="utf-8"?>
-<w:ftr xmlns:wpc="http://schemas.microsoft.com/office/word/2010/wordprocessingCanvas" xmlns:cx="http://schemas.microsoft.com/office/drawing/2014/chartex" xmlns:cx1="http://schemas.microsoft.com/office/drawing/2015/9/8/chartex" xmlns:cx2="http://schemas.microsoft.com/office/drawing/2015/10/21/chartex" xmlns:cx3="http://schemas.microsoft.com/office/drawing/2016/5/9/chartex" xmlns:cx4="http://schemas.microsoft.com/office/drawing/2016/5/10/chartex" xmlns:cx5="http://schemas.microsoft.com/office/drawing/2016/5/11/chartex" xmlns:cx6="http://schemas.microsoft.com/office/drawing/2016/5/12/chartex" xmlns:cx7="http://schemas.microsoft.com/office/drawing/2016/5/13/chartex" xmlns:cx8="http://schemas.microsoft.com/office/drawing/2016/5/14/chartex" xmlns:mc="http://schemas.openxmlformats.org/markup-compatibility/2006" xmlns:aink="http://schemas.microsoft.com/office/drawing/2016/ink" xmlns:am3d="http://schemas.microsoft.com/office/drawing/2017/model3d" xmlns:o="urn:schemas-microsoft-com:office:office" xmlns:oel="http://schemas.microsoft.com/office/2019/extlst" xmlns:r="http://schemas.openxmlformats.org/officeDocument/2006/relationships" xmlns:m="http://schemas.openxmlformats.org/officeDocument/2006/math" xmlns:v="urn:schemas-microsoft-com:vml" xmlns:wp14="http://schemas.microsoft.com/office/word/2010/wordprocessingDrawing" xmlns:wp="http://schemas.openxmlformats.org/drawingml/2006/wordprocessingDrawing" xmlns:w10="urn:schemas-microsoft-com:office:word" xmlns:w="http://schemas.openxmlformats.org/wordprocessingml/2006/main" xmlns:w14="http://schemas.microsoft.com/office/word/2010/wordml" xmlns:w15="http://schemas.microsoft.com/office/word/2012/wordml" xmlns:w16cex="http://schemas.microsoft.com/office/word/2018/wordml/cex" xmlns:w16cid="http://schemas.microsoft.com/office/word/2016/wordml/cid" xmlns:w16="http://schemas.microsoft.com/office/word/2018/wordml" xmlns:w16sdtdh="http://schemas.microsoft.com/office/word/2020/wordml/sdtdatahash" xmlns:w16se="http://schemas.microsoft.com/office/word/2015/wordml/symex" xmlns:wpg="http://schemas.microsoft.com/office/word/2010/wordprocessingGroup" xmlns:wpi="http://schemas.microsoft.com/office/word/2010/wordprocessingInk" xmlns:wne="http://schemas.microsoft.com/office/word/2006/wordml" xmlns:wps="http://schemas.microsoft.com/office/word/2010/wordprocessingShape" mc:Ignorable="w14 w15 w16se w16cid w16 w16cex w16sdtdh wp14">
+<w:ftr xmlns:wpc="http://schemas.microsoft.com/office/word/2010/wordprocessingCanvas" xmlns:cx="http://schemas.microsoft.com/office/drawing/2014/chartex" xmlns:cx1="http://schemas.microsoft.com/office/drawing/2015/9/8/chartex" xmlns:cx2="http://schemas.microsoft.com/office/drawing/2015/10/21/chartex" xmlns:cx3="http://schemas.microsoft.com/office/drawing/2016/5/9/chartex" xmlns:cx4="http://schemas.microsoft.com/office/drawing/2016/5/10/chartex" xmlns:cx5="http://schemas.microsoft.com/office/drawing/2016/5/11/chartex" xmlns:cx6="http://schemas.microsoft.com/office/drawing/2016/5/12/chartex" xmlns:cx7="http://schemas.microsoft.com/office/drawing/2016/5/13/chartex" xmlns:cx8="http://schemas.microsoft.com/office/drawing/2016/5/14/chartex" xmlns:mc="http://schemas.openxmlformats.org/markup-compatibility/2006" xmlns:aink="http://schemas.microsoft.com/office/drawing/2016/ink" xmlns:am3d="http://schemas.microsoft.com/office/drawing/2017/model3d" xmlns:o="urn:schemas-microsoft-com:office:office" xmlns:oel="http://schemas.microsoft.com/office/2019/extlst" xmlns:r="http://schemas.openxmlformats.org/officeDocument/2006/relationships" xmlns:m="http://schemas.openxmlformats.org/officeDocument/2006/math" xmlns:v="urn:schemas-microsoft-com:vml" xmlns:wp14="http://schemas.microsoft.com/office/word/2010/wordprocessingDrawing" xmlns:wp="http://schemas.openxmlformats.org/drawingml/2006/wordprocessingDrawing" xmlns:w10="urn:schemas-microsoft-com:office:word" xmlns:w="http://schemas.openxmlformats.org/wordprocessingml/2006/main" xmlns:w14="http://schemas.microsoft.com/office/word/2010/wordml" xmlns:w15="http://schemas.microsoft.com/office/word/2012/wordml" xmlns:w16cex="http://schemas.microsoft.com/office/word/2018/wordml/cex" xmlns:w16cid="http://schemas.microsoft.com/office/word/2016/wordml/cid" xmlns:w16="http://schemas.microsoft.com/office/word/2018/wordml" xmlns:w16du="http://schemas.microsoft.com/office/word/2023/wordml/word16du" xmlns:w16sdtdh="http://schemas.microsoft.com/office/word/2020/wordml/sdtdatahash" xmlns:w16sdtfl="http://schemas.microsoft.com/office/word/2024/wordml/sdtformatlock" xmlns:w16se="http://schemas.microsoft.com/office/word/2015/wordml/symex" xmlns:wpg="http://schemas.microsoft.com/office/word/2010/wordprocessingGroup" xmlns:wpi="http://schemas.microsoft.com/office/word/2010/wordprocessingInk" xmlns:wne="http://schemas.microsoft.com/office/word/2006/wordml" xmlns:wps="http://schemas.microsoft.com/office/word/2010/wordprocessingShape" mc:Ignorable="w14 w15 w16se w16cid w16 w16cex w16sdtdh w16sdtfl w16du wp14">
   <w:p>
     <w:pPr>
       <w:pStyle w:val="Footer"/>
@@ -16300,7 +15248,7 @@
 </file>
 
 <file path=word/footer8.xml><?xml version="1.0" encoding="utf-8"?>
-<w:ftr xmlns:wpc="http://schemas.microsoft.com/office/word/2010/wordprocessingCanvas" xmlns:cx="http://schemas.microsoft.com/office/drawing/2014/chartex" xmlns:cx1="http://schemas.microsoft.com/office/drawing/2015/9/8/chartex" xmlns:cx2="http://schemas.microsoft.com/office/drawing/2015/10/21/chartex" xmlns:cx3="http://schemas.microsoft.com/office/drawing/2016/5/9/chartex" xmlns:cx4="http://schemas.microsoft.com/office/drawing/2016/5/10/chartex" xmlns:cx5="http://schemas.microsoft.com/office/drawing/2016/5/11/chartex" xmlns:cx6="http://schemas.microsoft.com/office/drawing/2016/5/12/chartex" xmlns:cx7="http://schemas.microsoft.com/office/drawing/2016/5/13/chartex" xmlns:cx8="http://schemas.microsoft.com/office/drawing/2016/5/14/chartex" xmlns:mc="http://schemas.openxmlformats.org/markup-compatibility/2006" xmlns:aink="http://schemas.microsoft.com/office/drawing/2016/ink" xmlns:am3d="http://schemas.microsoft.com/office/drawing/2017/model3d" xmlns:o="urn:schemas-microsoft-com:office:office" xmlns:oel="http://schemas.microsoft.com/office/2019/extlst" xmlns:r="http://schemas.openxmlformats.org/officeDocument/2006/relationships" xmlns:m="http://schemas.openxmlformats.org/officeDocument/2006/math" xmlns:v="urn:schemas-microsoft-com:vml" xmlns:wp14="http://schemas.microsoft.com/office/word/2010/wordprocessingDrawing" xmlns:wp="http://schemas.openxmlformats.org/drawingml/2006/wordprocessingDrawing" xmlns:w10="urn:schemas-microsoft-com:office:word" xmlns:w="http://schemas.openxmlformats.org/wordprocessingml/2006/main" xmlns:w14="http://schemas.microsoft.com/office/word/2010/wordml" xmlns:w15="http://schemas.microsoft.com/office/word/2012/wordml" xmlns:w16cex="http://schemas.microsoft.com/office/word/2018/wordml/cex" xmlns:w16cid="http://schemas.microsoft.com/office/word/2016/wordml/cid" xmlns:w16="http://schemas.microsoft.com/office/word/2018/wordml" xmlns:w16sdtdh="http://schemas.microsoft.com/office/word/2020/wordml/sdtdatahash" xmlns:w16se="http://schemas.microsoft.com/office/word/2015/wordml/symex" xmlns:wpg="http://schemas.microsoft.com/office/word/2010/wordprocessingGroup" xmlns:wpi="http://schemas.microsoft.com/office/word/2010/wordprocessingInk" xmlns:wne="http://schemas.microsoft.com/office/word/2006/wordml" xmlns:wps="http://schemas.microsoft.com/office/word/2010/wordprocessingShape" mc:Ignorable="w14 w15 w16se w16cid w16 w16cex w16sdtdh wp14">
+<w:ftr xmlns:wpc="http://schemas.microsoft.com/office/word/2010/wordprocessingCanvas" xmlns:cx="http://schemas.microsoft.com/office/drawing/2014/chartex" xmlns:cx1="http://schemas.microsoft.com/office/drawing/2015/9/8/chartex" xmlns:cx2="http://schemas.microsoft.com/office/drawing/2015/10/21/chartex" xmlns:cx3="http://schemas.microsoft.com/office/drawing/2016/5/9/chartex" xmlns:cx4="http://schemas.microsoft.com/office/drawing/2016/5/10/chartex" xmlns:cx5="http://schemas.microsoft.com/office/drawing/2016/5/11/chartex" xmlns:cx6="http://schemas.microsoft.com/office/drawing/2016/5/12/chartex" xmlns:cx7="http://schemas.microsoft.com/office/drawing/2016/5/13/chartex" xmlns:cx8="http://schemas.microsoft.com/office/drawing/2016/5/14/chartex" xmlns:mc="http://schemas.openxmlformats.org/markup-compatibility/2006" xmlns:aink="http://schemas.microsoft.com/office/drawing/2016/ink" xmlns:am3d="http://schemas.microsoft.com/office/drawing/2017/model3d" xmlns:o="urn:schemas-microsoft-com:office:office" xmlns:oel="http://schemas.microsoft.com/office/2019/extlst" xmlns:r="http://schemas.openxmlformats.org/officeDocument/2006/relationships" xmlns:m="http://schemas.openxmlformats.org/officeDocument/2006/math" xmlns:v="urn:schemas-microsoft-com:vml" xmlns:wp14="http://schemas.microsoft.com/office/word/2010/wordprocessingDrawing" xmlns:wp="http://schemas.openxmlformats.org/drawingml/2006/wordprocessingDrawing" xmlns:w10="urn:schemas-microsoft-com:office:word" xmlns:w="http://schemas.openxmlformats.org/wordprocessingml/2006/main" xmlns:w14="http://schemas.microsoft.com/office/word/2010/wordml" xmlns:w15="http://schemas.microsoft.com/office/word/2012/wordml" xmlns:w16cex="http://schemas.microsoft.com/office/word/2018/wordml/cex" xmlns:w16cid="http://schemas.microsoft.com/office/word/2016/wordml/cid" xmlns:w16="http://schemas.microsoft.com/office/word/2018/wordml" xmlns:w16du="http://schemas.microsoft.com/office/word/2023/wordml/word16du" xmlns:w16sdtdh="http://schemas.microsoft.com/office/word/2020/wordml/sdtdatahash" xmlns:w16sdtfl="http://schemas.microsoft.com/office/word/2024/wordml/sdtformatlock" xmlns:w16se="http://schemas.microsoft.com/office/word/2015/wordml/symex" xmlns:wpg="http://schemas.microsoft.com/office/word/2010/wordprocessingGroup" xmlns:wpi="http://schemas.microsoft.com/office/word/2010/wordprocessingInk" xmlns:wne="http://schemas.microsoft.com/office/word/2006/wordml" xmlns:wps="http://schemas.microsoft.com/office/word/2010/wordprocessingShape" mc:Ignorable="w14 w15 w16se w16cid w16 w16cex w16sdtdh w16sdtfl w16du wp14">
   <w:p>
     <w:pPr>
       <w:pStyle w:val="Footer"/>
@@ -16343,7 +15291,7 @@
 </file>
 
 <file path=word/footnotes.xml><?xml version="1.0" encoding="utf-8"?>
-<w:footnotes xmlns:wpc="http://schemas.microsoft.com/office/word/2010/wordprocessingCanvas" xmlns:cx="http://schemas.microsoft.com/office/drawing/2014/chartex" xmlns:cx1="http://schemas.microsoft.com/office/drawing/2015/9/8/chartex" xmlns:cx2="http://schemas.microsoft.com/office/drawing/2015/10/21/chartex" xmlns:cx3="http://schemas.microsoft.com/office/drawing/2016/5/9/chartex" xmlns:cx4="http://schemas.microsoft.com/office/drawing/2016/5/10/chartex" xmlns:cx5="http://schemas.microsoft.com/office/drawing/2016/5/11/chartex" xmlns:cx6="http://schemas.microsoft.com/office/drawing/2016/5/12/chartex" xmlns:cx7="http://schemas.microsoft.com/office/drawing/2016/5/13/chartex" xmlns:cx8="http://schemas.microsoft.com/office/drawing/2016/5/14/chartex" xmlns:mc="http://schemas.openxmlformats.org/markup-compatibility/2006" xmlns:aink="http://schemas.microsoft.com/office/drawing/2016/ink" xmlns:am3d="http://schemas.microsoft.com/office/drawing/2017/model3d" xmlns:o="urn:schemas-microsoft-com:office:office" xmlns:oel="http://schemas.microsoft.com/office/2019/extlst" xmlns:r="http://schemas.openxmlformats.org/officeDocument/2006/relationships" xmlns:m="http://schemas.openxmlformats.org/officeDocument/2006/math" xmlns:v="urn:schemas-microsoft-com:vml" xmlns:wp14="http://schemas.microsoft.com/office/word/2010/wordprocessingDrawing" xmlns:wp="http://schemas.openxmlformats.org/drawingml/2006/wordprocessingDrawing" xmlns:w10="urn:schemas-microsoft-com:office:word" xmlns:w="http://schemas.openxmlformats.org/wordprocessingml/2006/main" xmlns:w14="http://schemas.microsoft.com/office/word/2010/wordml" xmlns:w15="http://schemas.microsoft.com/office/word/2012/wordml" xmlns:w16cex="http://schemas.microsoft.com/office/word/2018/wordml/cex" xmlns:w16cid="http://schemas.microsoft.com/office/word/2016/wordml/cid" xmlns:w16="http://schemas.microsoft.com/office/word/2018/wordml" xmlns:w16sdtdh="http://schemas.microsoft.com/office/word/2020/wordml/sdtdatahash" xmlns:w16se="http://schemas.microsoft.com/office/word/2015/wordml/symex" xmlns:wpg="http://schemas.microsoft.com/office/word/2010/wordprocessingGroup" xmlns:wpi="http://schemas.microsoft.com/office/word/2010/wordprocessingInk" xmlns:wne="http://schemas.microsoft.com/office/word/2006/wordml" xmlns:wps="http://schemas.microsoft.com/office/word/2010/wordprocessingShape" mc:Ignorable="w14 w15 w16se w16cid w16 w16cex w16sdtdh wp14">
+<w:footnotes xmlns:wpc="http://schemas.microsoft.com/office/word/2010/wordprocessingCanvas" xmlns:cx="http://schemas.microsoft.com/office/drawing/2014/chartex" xmlns:cx1="http://schemas.microsoft.com/office/drawing/2015/9/8/chartex" xmlns:cx2="http://schemas.microsoft.com/office/drawing/2015/10/21/chartex" xmlns:cx3="http://schemas.microsoft.com/office/drawing/2016/5/9/chartex" xmlns:cx4="http://schemas.microsoft.com/office/drawing/2016/5/10/chartex" xmlns:cx5="http://schemas.microsoft.com/office/drawing/2016/5/11/chartex" xmlns:cx6="http://schemas.microsoft.com/office/drawing/2016/5/12/chartex" xmlns:cx7="http://schemas.microsoft.com/office/drawing/2016/5/13/chartex" xmlns:cx8="http://schemas.microsoft.com/office/drawing/2016/5/14/chartex" xmlns:mc="http://schemas.openxmlformats.org/markup-compatibility/2006" xmlns:aink="http://schemas.microsoft.com/office/drawing/2016/ink" xmlns:am3d="http://schemas.microsoft.com/office/drawing/2017/model3d" xmlns:o="urn:schemas-microsoft-com:office:office" xmlns:oel="http://schemas.microsoft.com/office/2019/extlst" xmlns:r="http://schemas.openxmlformats.org/officeDocument/2006/relationships" xmlns:m="http://schemas.openxmlformats.org/officeDocument/2006/math" xmlns:v="urn:schemas-microsoft-com:vml" xmlns:wp14="http://schemas.microsoft.com/office/word/2010/wordprocessingDrawing" xmlns:wp="http://schemas.openxmlformats.org/drawingml/2006/wordprocessingDrawing" xmlns:w10="urn:schemas-microsoft-com:office:word" xmlns:w="http://schemas.openxmlformats.org/wordprocessingml/2006/main" xmlns:w14="http://schemas.microsoft.com/office/word/2010/wordml" xmlns:w15="http://schemas.microsoft.com/office/word/2012/wordml" xmlns:w16cex="http://schemas.microsoft.com/office/word/2018/wordml/cex" xmlns:w16cid="http://schemas.microsoft.com/office/word/2016/wordml/cid" xmlns:w16="http://schemas.microsoft.com/office/word/2018/wordml" xmlns:w16du="http://schemas.microsoft.com/office/word/2023/wordml/word16du" xmlns:w16sdtdh="http://schemas.microsoft.com/office/word/2020/wordml/sdtdatahash" xmlns:w16sdtfl="http://schemas.microsoft.com/office/word/2024/wordml/sdtformatlock" xmlns:w16se="http://schemas.microsoft.com/office/word/2015/wordml/symex" xmlns:wpg="http://schemas.microsoft.com/office/word/2010/wordprocessingGroup" xmlns:wpi="http://schemas.microsoft.com/office/word/2010/wordprocessingInk" xmlns:wne="http://schemas.microsoft.com/office/word/2006/wordml" xmlns:wps="http://schemas.microsoft.com/office/word/2010/wordprocessingShape" mc:Ignorable="w14 w15 w16se w16cid w16 w16cex w16sdtdh w16sdtfl w16du wp14">
   <w:footnote w:type="separator" w:id="-1">
     <w:p>
       <w:r>
@@ -16378,7 +15326,7 @@
 </file>
 
 <file path=word/header1.xml><?xml version="1.0" encoding="utf-8"?>
-<w:hdr xmlns:wpc="http://schemas.microsoft.com/office/word/2010/wordprocessingCanvas" xmlns:cx="http://schemas.microsoft.com/office/drawing/2014/chartex" xmlns:cx1="http://schemas.microsoft.com/office/drawing/2015/9/8/chartex" xmlns:cx2="http://schemas.microsoft.com/office/drawing/2015/10/21/chartex" xmlns:cx3="http://schemas.microsoft.com/office/drawing/2016/5/9/chartex" xmlns:cx4="http://schemas.microsoft.com/office/drawing/2016/5/10/chartex" xmlns:cx5="http://schemas.microsoft.com/office/drawing/2016/5/11/chartex" xmlns:cx6="http://schemas.microsoft.com/office/drawing/2016/5/12/chartex" xmlns:cx7="http://schemas.microsoft.com/office/drawing/2016/5/13/chartex" xmlns:cx8="http://schemas.microsoft.com/office/drawing/2016/5/14/chartex" xmlns:mc="http://schemas.openxmlformats.org/markup-compatibility/2006" xmlns:aink="http://schemas.microsoft.com/office/drawing/2016/ink" xmlns:am3d="http://schemas.microsoft.com/office/drawing/2017/model3d" xmlns:o="urn:schemas-microsoft-com:office:office" xmlns:oel="http://schemas.microsoft.com/office/2019/extlst" xmlns:r="http://schemas.openxmlformats.org/officeDocument/2006/relationships" xmlns:m="http://schemas.openxmlformats.org/officeDocument/2006/math" xmlns:v="urn:schemas-microsoft-com:vml" xmlns:wp14="http://schemas.microsoft.com/office/word/2010/wordprocessingDrawing" xmlns:wp="http://schemas.openxmlformats.org/drawingml/2006/wordprocessingDrawing" xmlns:w10="urn:schemas-microsoft-com:office:word" xmlns:w="http://schemas.openxmlformats.org/wordprocessingml/2006/main" xmlns:w14="http://schemas.microsoft.com/office/word/2010/wordml" xmlns:w15="http://schemas.microsoft.com/office/word/2012/wordml" xmlns:w16cex="http://schemas.microsoft.com/office/word/2018/wordml/cex" xmlns:w16cid="http://schemas.microsoft.com/office/word/2016/wordml/cid" xmlns:w16="http://schemas.microsoft.com/office/word/2018/wordml" xmlns:w16sdtdh="http://schemas.microsoft.com/office/word/2020/wordml/sdtdatahash" xmlns:w16se="http://schemas.microsoft.com/office/word/2015/wordml/symex" xmlns:wpg="http://schemas.microsoft.com/office/word/2010/wordprocessingGroup" xmlns:wpi="http://schemas.microsoft.com/office/word/2010/wordprocessingInk" xmlns:wne="http://schemas.microsoft.com/office/word/2006/wordml" xmlns:wps="http://schemas.microsoft.com/office/word/2010/wordprocessingShape" mc:Ignorable="w14 w15 w16se w16cid w16 w16cex w16sdtdh wp14">
+<w:hdr xmlns:wpc="http://schemas.microsoft.com/office/word/2010/wordprocessingCanvas" xmlns:cx="http://schemas.microsoft.com/office/drawing/2014/chartex" xmlns:cx1="http://schemas.microsoft.com/office/drawing/2015/9/8/chartex" xmlns:cx2="http://schemas.microsoft.com/office/drawing/2015/10/21/chartex" xmlns:cx3="http://schemas.microsoft.com/office/drawing/2016/5/9/chartex" xmlns:cx4="http://schemas.microsoft.com/office/drawing/2016/5/10/chartex" xmlns:cx5="http://schemas.microsoft.com/office/drawing/2016/5/11/chartex" xmlns:cx6="http://schemas.microsoft.com/office/drawing/2016/5/12/chartex" xmlns:cx7="http://schemas.microsoft.com/office/drawing/2016/5/13/chartex" xmlns:cx8="http://schemas.microsoft.com/office/drawing/2016/5/14/chartex" xmlns:mc="http://schemas.openxmlformats.org/markup-compatibility/2006" xmlns:aink="http://schemas.microsoft.com/office/drawing/2016/ink" xmlns:am3d="http://schemas.microsoft.com/office/drawing/2017/model3d" xmlns:o="urn:schemas-microsoft-com:office:office" xmlns:oel="http://schemas.microsoft.com/office/2019/extlst" xmlns:r="http://schemas.openxmlformats.org/officeDocument/2006/relationships" xmlns:m="http://schemas.openxmlformats.org/officeDocument/2006/math" xmlns:v="urn:schemas-microsoft-com:vml" xmlns:wp14="http://schemas.microsoft.com/office/word/2010/wordprocessingDrawing" xmlns:wp="http://schemas.openxmlformats.org/drawingml/2006/wordprocessingDrawing" xmlns:w10="urn:schemas-microsoft-com:office:word" xmlns:w="http://schemas.openxmlformats.org/wordprocessingml/2006/main" xmlns:w14="http://schemas.microsoft.com/office/word/2010/wordml" xmlns:w15="http://schemas.microsoft.com/office/word/2012/wordml" xmlns:w16cex="http://schemas.microsoft.com/office/word/2018/wordml/cex" xmlns:w16cid="http://schemas.microsoft.com/office/word/2016/wordml/cid" xmlns:w16="http://schemas.microsoft.com/office/word/2018/wordml" xmlns:w16du="http://schemas.microsoft.com/office/word/2023/wordml/word16du" xmlns:w16sdtdh="http://schemas.microsoft.com/office/word/2020/wordml/sdtdatahash" xmlns:w16sdtfl="http://schemas.microsoft.com/office/word/2024/wordml/sdtformatlock" xmlns:w16se="http://schemas.microsoft.com/office/word/2015/wordml/symex" xmlns:wpg="http://schemas.microsoft.com/office/word/2010/wordprocessingGroup" xmlns:wpi="http://schemas.microsoft.com/office/word/2010/wordprocessingInk" xmlns:wne="http://schemas.microsoft.com/office/word/2006/wordml" xmlns:wps="http://schemas.microsoft.com/office/word/2010/wordprocessingShape" mc:Ignorable="w14 w15 w16se w16cid w16 w16cex w16sdtdh w16sdtfl w16du wp14">
   <w:p>
     <w:pPr>
       <w:pStyle w:val="Header"/>
@@ -16457,7 +15405,7 @@
 </file>
 
 <file path=word/header2.xml><?xml version="1.0" encoding="utf-8"?>
-<w:hdr xmlns:wpc="http://schemas.microsoft.com/office/word/2010/wordprocessingCanvas" xmlns:cx="http://schemas.microsoft.com/office/drawing/2014/chartex" xmlns:cx1="http://schemas.microsoft.com/office/drawing/2015/9/8/chartex" xmlns:cx2="http://schemas.microsoft.com/office/drawing/2015/10/21/chartex" xmlns:cx3="http://schemas.microsoft.com/office/drawing/2016/5/9/chartex" xmlns:cx4="http://schemas.microsoft.com/office/drawing/2016/5/10/chartex" xmlns:cx5="http://schemas.microsoft.com/office/drawing/2016/5/11/chartex" xmlns:cx6="http://schemas.microsoft.com/office/drawing/2016/5/12/chartex" xmlns:cx7="http://schemas.microsoft.com/office/drawing/2016/5/13/chartex" xmlns:cx8="http://schemas.microsoft.com/office/drawing/2016/5/14/chartex" xmlns:mc="http://schemas.openxmlformats.org/markup-compatibility/2006" xmlns:aink="http://schemas.microsoft.com/office/drawing/2016/ink" xmlns:am3d="http://schemas.microsoft.com/office/drawing/2017/model3d" xmlns:o="urn:schemas-microsoft-com:office:office" xmlns:oel="http://schemas.microsoft.com/office/2019/extlst" xmlns:r="http://schemas.openxmlformats.org/officeDocument/2006/relationships" xmlns:m="http://schemas.openxmlformats.org/officeDocument/2006/math" xmlns:v="urn:schemas-microsoft-com:vml" xmlns:wp14="http://schemas.microsoft.com/office/word/2010/wordprocessingDrawing" xmlns:wp="http://schemas.openxmlformats.org/drawingml/2006/wordprocessingDrawing" xmlns:w10="urn:schemas-microsoft-com:office:word" xmlns:w="http://schemas.openxmlformats.org/wordprocessingml/2006/main" xmlns:w14="http://schemas.microsoft.com/office/word/2010/wordml" xmlns:w15="http://schemas.microsoft.com/office/word/2012/wordml" xmlns:w16cex="http://schemas.microsoft.com/office/word/2018/wordml/cex" xmlns:w16cid="http://schemas.microsoft.com/office/word/2016/wordml/cid" xmlns:w16="http://schemas.microsoft.com/office/word/2018/wordml" xmlns:w16sdtdh="http://schemas.microsoft.com/office/word/2020/wordml/sdtdatahash" xmlns:w16se="http://schemas.microsoft.com/office/word/2015/wordml/symex" xmlns:wpg="http://schemas.microsoft.com/office/word/2010/wordprocessingGroup" xmlns:wpi="http://schemas.microsoft.com/office/word/2010/wordprocessingInk" xmlns:wne="http://schemas.microsoft.com/office/word/2006/wordml" xmlns:wps="http://schemas.microsoft.com/office/word/2010/wordprocessingShape" mc:Ignorable="w14 w15 w16se w16cid w16 w16cex w16sdtdh wp14">
+<w:hdr xmlns:wpc="http://schemas.microsoft.com/office/word/2010/wordprocessingCanvas" xmlns:cx="http://schemas.microsoft.com/office/drawing/2014/chartex" xmlns:cx1="http://schemas.microsoft.com/office/drawing/2015/9/8/chartex" xmlns:cx2="http://schemas.microsoft.com/office/drawing/2015/10/21/chartex" xmlns:cx3="http://schemas.microsoft.com/office/drawing/2016/5/9/chartex" xmlns:cx4="http://schemas.microsoft.com/office/drawing/2016/5/10/chartex" xmlns:cx5="http://schemas.microsoft.com/office/drawing/2016/5/11/chartex" xmlns:cx6="http://schemas.microsoft.com/office/drawing/2016/5/12/chartex" xmlns:cx7="http://schemas.microsoft.com/office/drawing/2016/5/13/chartex" xmlns:cx8="http://schemas.microsoft.com/office/drawing/2016/5/14/chartex" xmlns:mc="http://schemas.openxmlformats.org/markup-compatibility/2006" xmlns:aink="http://schemas.microsoft.com/office/drawing/2016/ink" xmlns:am3d="http://schemas.microsoft.com/office/drawing/2017/model3d" xmlns:o="urn:schemas-microsoft-com:office:office" xmlns:oel="http://schemas.microsoft.com/office/2019/extlst" xmlns:r="http://schemas.openxmlformats.org/officeDocument/2006/relationships" xmlns:m="http://schemas.openxmlformats.org/officeDocument/2006/math" xmlns:v="urn:schemas-microsoft-com:vml" xmlns:wp14="http://schemas.microsoft.com/office/word/2010/wordprocessingDrawing" xmlns:wp="http://schemas.openxmlformats.org/drawingml/2006/wordprocessingDrawing" xmlns:w10="urn:schemas-microsoft-com:office:word" xmlns:w="http://schemas.openxmlformats.org/wordprocessingml/2006/main" xmlns:w14="http://schemas.microsoft.com/office/word/2010/wordml" xmlns:w15="http://schemas.microsoft.com/office/word/2012/wordml" xmlns:w16cex="http://schemas.microsoft.com/office/word/2018/wordml/cex" xmlns:w16cid="http://schemas.microsoft.com/office/word/2016/wordml/cid" xmlns:w16="http://schemas.microsoft.com/office/word/2018/wordml" xmlns:w16du="http://schemas.microsoft.com/office/word/2023/wordml/word16du" xmlns:w16sdtdh="http://schemas.microsoft.com/office/word/2020/wordml/sdtdatahash" xmlns:w16sdtfl="http://schemas.microsoft.com/office/word/2024/wordml/sdtformatlock" xmlns:w16se="http://schemas.microsoft.com/office/word/2015/wordml/symex" xmlns:wpg="http://schemas.microsoft.com/office/word/2010/wordprocessingGroup" xmlns:wpi="http://schemas.microsoft.com/office/word/2010/wordprocessingInk" xmlns:wne="http://schemas.microsoft.com/office/word/2006/wordml" xmlns:wps="http://schemas.microsoft.com/office/word/2010/wordprocessingShape" mc:Ignorable="w14 w15 w16se w16cid w16 w16cex w16sdtdh w16sdtfl w16du wp14">
   <w:p>
     <w:pPr>
       <w:pStyle w:val="Header"/>
@@ -16575,7 +15523,7 @@
 </file>
 
 <file path=word/numbering.xml><?xml version="1.0" encoding="utf-8"?>
-<w:numbering xmlns:wpc="http://schemas.microsoft.com/office/word/2010/wordprocessingCanvas" xmlns:cx="http://schemas.microsoft.com/office/drawing/2014/chartex" xmlns:cx1="http://schemas.microsoft.com/office/drawing/2015/9/8/chartex" xmlns:cx2="http://schemas.microsoft.com/office/drawing/2015/10/21/chartex" xmlns:cx3="http://schemas.microsoft.com/office/drawing/2016/5/9/chartex" xmlns:cx4="http://schemas.microsoft.com/office/drawing/2016/5/10/chartex" xmlns:cx5="http://schemas.microsoft.com/office/drawing/2016/5/11/chartex" xmlns:cx6="http://schemas.microsoft.com/office/drawing/2016/5/12/chartex" xmlns:cx7="http://schemas.microsoft.com/office/drawing/2016/5/13/chartex" xmlns:cx8="http://schemas.microsoft.com/office/drawing/2016/5/14/chartex" xmlns:mc="http://schemas.openxmlformats.org/markup-compatibility/2006" xmlns:aink="http://schemas.microsoft.com/office/drawing/2016/ink" xmlns:am3d="http://schemas.microsoft.com/office/drawing/2017/model3d" xmlns:o="urn:schemas-microsoft-com:office:office" xmlns:oel="http://schemas.microsoft.com/office/2019/extlst" xmlns:r="http://schemas.openxmlformats.org/officeDocument/2006/relationships" xmlns:m="http://schemas.openxmlformats.org/officeDocument/2006/math" xmlns:v="urn:schemas-microsoft-com:vml" xmlns:wp14="http://schemas.microsoft.com/office/word/2010/wordprocessingDrawing" xmlns:wp="http://schemas.openxmlformats.org/drawingml/2006/wordprocessingDrawing" xmlns:w10="urn:schemas-microsoft-com:office:word" xmlns:w="http://schemas.openxmlformats.org/wordprocessingml/2006/main" xmlns:w14="http://schemas.microsoft.com/office/word/2010/wordml" xmlns:w15="http://schemas.microsoft.com/office/word/2012/wordml" xmlns:w16cex="http://schemas.microsoft.com/office/word/2018/wordml/cex" xmlns:w16cid="http://schemas.microsoft.com/office/word/2016/wordml/cid" xmlns:w16="http://schemas.microsoft.com/office/word/2018/wordml" xmlns:w16sdtdh="http://schemas.microsoft.com/office/word/2020/wordml/sdtdatahash" xmlns:w16se="http://schemas.microsoft.com/office/word/2015/wordml/symex" xmlns:wpg="http://schemas.microsoft.com/office/word/2010/wordprocessingGroup" xmlns:wpi="http://schemas.microsoft.com/office/word/2010/wordprocessingInk" xmlns:wne="http://schemas.microsoft.com/office/word/2006/wordml" xmlns:wps="http://schemas.microsoft.com/office/word/2010/wordprocessingShape" mc:Ignorable="w14 w15 w16se w16cid w16 w16cex w16sdtdh wp14">
+<w:numbering xmlns:wpc="http://schemas.microsoft.com/office/word/2010/wordprocessingCanvas" xmlns:cx="http://schemas.microsoft.com/office/drawing/2014/chartex" xmlns:cx1="http://schemas.microsoft.com/office/drawing/2015/9/8/chartex" xmlns:cx2="http://schemas.microsoft.com/office/drawing/2015/10/21/chartex" xmlns:cx3="http://schemas.microsoft.com/office/drawing/2016/5/9/chartex" xmlns:cx4="http://schemas.microsoft.com/office/drawing/2016/5/10/chartex" xmlns:cx5="http://schemas.microsoft.com/office/drawing/2016/5/11/chartex" xmlns:cx6="http://schemas.microsoft.com/office/drawing/2016/5/12/chartex" xmlns:cx7="http://schemas.microsoft.com/office/drawing/2016/5/13/chartex" xmlns:cx8="http://schemas.microsoft.com/office/drawing/2016/5/14/chartex" xmlns:mc="http://schemas.openxmlformats.org/markup-compatibility/2006" xmlns:aink="http://schemas.microsoft.com/office/drawing/2016/ink" xmlns:am3d="http://schemas.microsoft.com/office/drawing/2017/model3d" xmlns:o="urn:schemas-microsoft-com:office:office" xmlns:oel="http://schemas.microsoft.com/office/2019/extlst" xmlns:r="http://schemas.openxmlformats.org/officeDocument/2006/relationships" xmlns:m="http://schemas.openxmlformats.org/officeDocument/2006/math" xmlns:v="urn:schemas-microsoft-com:vml" xmlns:wp14="http://schemas.microsoft.com/office/word/2010/wordprocessingDrawing" xmlns:wp="http://schemas.openxmlformats.org/drawingml/2006/wordprocessingDrawing" xmlns:w10="urn:schemas-microsoft-com:office:word" xmlns:w="http://schemas.openxmlformats.org/wordprocessingml/2006/main" xmlns:w14="http://schemas.microsoft.com/office/word/2010/wordml" xmlns:w15="http://schemas.microsoft.com/office/word/2012/wordml" xmlns:w16cex="http://schemas.microsoft.com/office/word/2018/wordml/cex" xmlns:w16cid="http://schemas.microsoft.com/office/word/2016/wordml/cid" xmlns:w16="http://schemas.microsoft.com/office/word/2018/wordml" xmlns:w16du="http://schemas.microsoft.com/office/word/2023/wordml/word16du" xmlns:w16sdtdh="http://schemas.microsoft.com/office/word/2020/wordml/sdtdatahash" xmlns:w16sdtfl="http://schemas.microsoft.com/office/word/2024/wordml/sdtformatlock" xmlns:w16se="http://schemas.microsoft.com/office/word/2015/wordml/symex" xmlns:wpg="http://schemas.microsoft.com/office/word/2010/wordprocessingGroup" xmlns:wpi="http://schemas.microsoft.com/office/word/2010/wordprocessingInk" xmlns:wne="http://schemas.microsoft.com/office/word/2006/wordml" xmlns:wps="http://schemas.microsoft.com/office/word/2010/wordprocessingShape" mc:Ignorable="w14 w15 w16se w16cid w16 w16cex w16sdtdh w16sdtfl w16du wp14">
   <w:abstractNum w:abstractNumId="0" w15:restartNumberingAfterBreak="0">
     <w:nsid w:val="FFFFFFFB"/>
     <w:multiLevelType w:val="multilevel"/>
@@ -20903,7 +19851,7 @@
 </file>
 
 <file path=word/styles.xml><?xml version="1.0" encoding="utf-8"?>
-<w:styles xmlns:mc="http://schemas.openxmlformats.org/markup-compatibility/2006" xmlns:r="http://schemas.openxmlformats.org/officeDocument/2006/relationships" xmlns:w="http://schemas.openxmlformats.org/wordprocessingml/2006/main" xmlns:w14="http://schemas.microsoft.com/office/word/2010/wordml" xmlns:w15="http://schemas.microsoft.com/office/word/2012/wordml" xmlns:w16cex="http://schemas.microsoft.com/office/word/2018/wordml/cex" xmlns:w16cid="http://schemas.microsoft.com/office/word/2016/wordml/cid" xmlns:w16="http://schemas.microsoft.com/office/word/2018/wordml" xmlns:w16sdtdh="http://schemas.microsoft.com/office/word/2020/wordml/sdtdatahash" xmlns:w16se="http://schemas.microsoft.com/office/word/2015/wordml/symex" mc:Ignorable="w14 w15 w16se w16cid w16 w16cex w16sdtdh">
+<w:styles xmlns:mc="http://schemas.openxmlformats.org/markup-compatibility/2006" xmlns:r="http://schemas.openxmlformats.org/officeDocument/2006/relationships" xmlns:w="http://schemas.openxmlformats.org/wordprocessingml/2006/main" xmlns:w14="http://schemas.microsoft.com/office/word/2010/wordml" xmlns:w15="http://schemas.microsoft.com/office/word/2012/wordml" xmlns:w16cex="http://schemas.microsoft.com/office/word/2018/wordml/cex" xmlns:w16cid="http://schemas.microsoft.com/office/word/2016/wordml/cid" xmlns:w16="http://schemas.microsoft.com/office/word/2018/wordml" xmlns:w16du="http://schemas.microsoft.com/office/word/2023/wordml/word16du" xmlns:w16sdtdh="http://schemas.microsoft.com/office/word/2020/wordml/sdtdatahash" xmlns:w16sdtfl="http://schemas.microsoft.com/office/word/2024/wordml/sdtformatlock" xmlns:w16se="http://schemas.microsoft.com/office/word/2015/wordml/symex" mc:Ignorable="w14 w15 w16se w16cid w16 w16cex w16sdtdh w16sdtfl w16du">
   <w:docDefaults>
     <w:rPrDefault>
       <w:rPr>
@@ -21484,6 +20432,7 @@
   <w:style w:type="character" w:default="1" w:styleId="DefaultParagraphFont">
     <w:name w:val="Default Paragraph Font"/>
     <w:uiPriority w:val="1"/>
+    <w:semiHidden/>
     <w:unhideWhenUsed/>
   </w:style>
   <w:style w:type="table" w:default="1" w:styleId="TableNormal">

</xml_diff>